<commit_message>
Assignment 0 - added hashing, Notes for taks A -  Applications in E-Commerce
</commit_message>
<xml_diff>
--- a/Assignment 0 - Report.docx
+++ b/Assignment 0 - Report.docx
@@ -157,15 +157,31 @@
           <w:sz w:val="28"/>
           <w:szCs w:val="28"/>
         </w:rPr>
-        <w:t xml:space="preserve"> </w:t>
-      </w:r>
-      <w:r>
+        <w:t xml:space="preserve"> Apply a Variety of Programming and Scripting Languages Appropriately and Effectively to Produce a Simple Web-Based Application.</w:t>
+      </w:r>
+    </w:p>
+    <w:p>
+      <w:pPr>
+        <w:pStyle w:val="Akapitzlist"/>
+        <w:numPr>
+          <w:ilvl w:val="0"/>
+          <w:numId w:val="1"/>
+        </w:numPr>
         <w:rPr>
           <w:rFonts w:asciiTheme="majorHAnsi" w:hAnsiTheme="majorHAnsi" w:cs="Arial"/>
           <w:sz w:val="28"/>
           <w:szCs w:val="28"/>
         </w:rPr>
-        <w:t>Apply a Variety of Programming and Scripting Languages Appropriately and Effectively to Produce a Simple Web-Based Application</w:t>
+      </w:pPr>
+      <w:r>
+        <w:rPr>
+          <w:rFonts w:asciiTheme="majorHAnsi" w:hAnsiTheme="majorHAnsi" w:cs="Arial"/>
+          <w:b/>
+          <w:bCs/>
+          <w:sz w:val="28"/>
+          <w:szCs w:val="28"/>
+        </w:rPr>
+        <w:t xml:space="preserve">Task C - </w:t>
       </w:r>
       <w:r>
         <w:rPr>
@@ -173,38 +189,6 @@
           <w:sz w:val="28"/>
           <w:szCs w:val="28"/>
         </w:rPr>
-        <w:t>.</w:t>
-      </w:r>
-    </w:p>
-    <w:p>
-      <w:pPr>
-        <w:pStyle w:val="Akapitzlist"/>
-        <w:numPr>
-          <w:ilvl w:val="0"/>
-          <w:numId w:val="1"/>
-        </w:numPr>
-        <w:rPr>
-          <w:rFonts w:asciiTheme="majorHAnsi" w:hAnsiTheme="majorHAnsi" w:cs="Arial"/>
-          <w:sz w:val="28"/>
-          <w:szCs w:val="28"/>
-        </w:rPr>
-      </w:pPr>
-      <w:r>
-        <w:rPr>
-          <w:rFonts w:asciiTheme="majorHAnsi" w:hAnsiTheme="majorHAnsi" w:cs="Arial"/>
-          <w:b/>
-          <w:bCs/>
-          <w:sz w:val="28"/>
-          <w:szCs w:val="28"/>
-        </w:rPr>
-        <w:t xml:space="preserve">Task C - </w:t>
-      </w:r>
-      <w:r>
-        <w:rPr>
-          <w:rFonts w:asciiTheme="majorHAnsi" w:hAnsiTheme="majorHAnsi" w:cs="Arial"/>
-          <w:sz w:val="28"/>
-          <w:szCs w:val="28"/>
-        </w:rPr>
         <w:t>Demonstrate an Understanding of the Principles of Object-Oriented Programming</w:t>
       </w:r>
     </w:p>
@@ -217,7 +201,7 @@
     </w:p>
     <w:p>
       <w:pPr>
-        <w:pStyle w:val="Heading1"/>
+        <w:pStyle w:val="Nagwek11"/>
         <w:numPr>
           <w:ilvl w:val="0"/>
           <w:numId w:val="0"/>
@@ -242,7 +226,7 @@
     </w:p>
     <w:p>
       <w:pPr>
-        <w:pStyle w:val="Heading1"/>
+        <w:pStyle w:val="Nagwek11"/>
         <w:numPr>
           <w:ilvl w:val="0"/>
           <w:numId w:val="0"/>
@@ -359,7 +343,35 @@
           <w:sz w:val="24"/>
           <w:szCs w:val="24"/>
         </w:rPr>
-        <w:t xml:space="preserve"> are fundamental to the modern digital world, however explaining what cryptographic systems are, it is necessary to briefly explain what cryptography itself is. </w:t>
+        <w:t xml:space="preserve"> are fundamental to the modern digital world, </w:t>
+      </w:r>
+      <w:r>
+        <w:rPr>
+          <w:sz w:val="24"/>
+          <w:szCs w:val="24"/>
+        </w:rPr>
+        <w:t xml:space="preserve">however </w:t>
+      </w:r>
+      <w:r>
+        <w:rPr>
+          <w:sz w:val="24"/>
+          <w:szCs w:val="24"/>
+        </w:rPr>
+        <w:t>when</w:t>
+      </w:r>
+      <w:r>
+        <w:rPr>
+          <w:sz w:val="24"/>
+          <w:szCs w:val="24"/>
+        </w:rPr>
+        <w:t xml:space="preserve"> </w:t>
+      </w:r>
+      <w:r>
+        <w:rPr>
+          <w:sz w:val="24"/>
+          <w:szCs w:val="24"/>
+        </w:rPr>
+        <w:t xml:space="preserve">explaining what cryptographic systems are, it is necessary to briefly explain what cryptography itself is. </w:t>
       </w:r>
       <w:r>
         <w:rPr>
@@ -383,22 +395,50 @@
           <w:sz w:val="24"/>
           <w:szCs w:val="24"/>
         </w:rPr>
-        <w:t xml:space="preserve"> is a technique of encrypting information (messages, passwords, transactions etc.) through cryptographic algorithms.  It converts plain text into ciphertext.</w:t>
-      </w:r>
-    </w:p>
-    <w:p>
-      <w:pPr>
-        <w:rPr>
-          <w:sz w:val="24"/>
-          <w:szCs w:val="24"/>
-        </w:rPr>
-      </w:pPr>
-      <w:r>
-        <w:rPr>
-          <w:sz w:val="24"/>
-          <w:szCs w:val="24"/>
-        </w:rPr>
-        <w:t xml:space="preserve">The modern world uses cryptographic systems to protect users around the world. Cryptographic systems are methods where information is disguised. It means that the only person with the specific key can read it. </w:t>
+        <w:t xml:space="preserve"> is a technique of encrypting information (messages, passwords, transactions etc</w:t>
+      </w:r>
+      <w:r>
+        <w:rPr>
+          <w:sz w:val="24"/>
+          <w:szCs w:val="24"/>
+        </w:rPr>
+        <w:t>.</w:t>
+      </w:r>
+      <w:r>
+        <w:rPr>
+          <w:sz w:val="24"/>
+          <w:szCs w:val="24"/>
+        </w:rPr>
+        <w:t>) through cryptographic algorithms.  It converts plain text into ciphertext.</w:t>
+      </w:r>
+    </w:p>
+    <w:p>
+      <w:pPr>
+        <w:rPr>
+          <w:sz w:val="24"/>
+          <w:szCs w:val="24"/>
+        </w:rPr>
+      </w:pPr>
+      <w:r>
+        <w:rPr>
+          <w:sz w:val="24"/>
+          <w:szCs w:val="24"/>
+        </w:rPr>
+        <w:t xml:space="preserve">The modern world uses cryptographic systems to protect users around the world. Cryptographic systems are methods where information is disguised. It means that only </w:t>
+      </w:r>
+      <w:r>
+        <w:rPr>
+          <w:sz w:val="24"/>
+          <w:szCs w:val="24"/>
+        </w:rPr>
+        <w:t xml:space="preserve">the </w:t>
+      </w:r>
+      <w:r>
+        <w:rPr>
+          <w:sz w:val="24"/>
+          <w:szCs w:val="24"/>
+        </w:rPr>
+        <w:t xml:space="preserve">person with the specific key can read it. </w:t>
       </w:r>
     </w:p>
     <w:p>
@@ -442,7 +482,64 @@
           <w:sz w:val="24"/>
           <w:szCs w:val="24"/>
         </w:rPr>
-        <w:t xml:space="preserve">There are two primary types of cryptography which are used in the modern digital world. The first one is Symmetric Encryption and second is Asymmetric Encryption. </w:t>
+        <w:t xml:space="preserve">There are </w:t>
+      </w:r>
+      <w:r>
+        <w:rPr>
+          <w:sz w:val="24"/>
+          <w:szCs w:val="24"/>
+        </w:rPr>
+        <w:t>two</w:t>
+      </w:r>
+      <w:r>
+        <w:rPr>
+          <w:sz w:val="24"/>
+          <w:szCs w:val="24"/>
+        </w:rPr>
+        <w:t xml:space="preserve"> primary types of cryptography which are used in the modern digital world. The first one is Symmetric Encryption and second is Asymmetric Encryption</w:t>
+      </w:r>
+      <w:r>
+        <w:rPr>
+          <w:sz w:val="24"/>
+          <w:szCs w:val="24"/>
+        </w:rPr>
+        <w:t>.</w:t>
+      </w:r>
+    </w:p>
+    <w:p>
+      <w:pPr>
+        <w:rPr>
+          <w:sz w:val="24"/>
+          <w:szCs w:val="24"/>
+        </w:rPr>
+      </w:pPr>
+      <w:r>
+        <w:rPr>
+          <w:sz w:val="24"/>
+          <w:szCs w:val="24"/>
+        </w:rPr>
+        <w:t>Also,</w:t>
+      </w:r>
+      <w:r>
+        <w:rPr>
+          <w:sz w:val="24"/>
+          <w:szCs w:val="24"/>
+        </w:rPr>
+        <w:t xml:space="preserve"> </w:t>
+      </w:r>
+      <w:r>
+        <w:rPr>
+          <w:sz w:val="24"/>
+          <w:szCs w:val="24"/>
+        </w:rPr>
+        <w:t xml:space="preserve">there is hashing which is </w:t>
+      </w:r>
+      <w:r>
+        <w:rPr>
+          <w:sz w:val="24"/>
+          <w:szCs w:val="24"/>
+        </w:rPr>
+        <w:t>digital fingerprint.</w:t>
       </w:r>
     </w:p>
     <w:p>
@@ -506,6 +603,7 @@
           <w:sz w:val="24"/>
           <w:szCs w:val="24"/>
         </w:rPr>
+        <w:lastRenderedPageBreak/>
         <w:t>Wi-Fi (WPA2/WPA3)</w:t>
       </w:r>
     </w:p>
@@ -521,8 +619,35 @@
           <w:sz w:val="24"/>
           <w:szCs w:val="24"/>
         </w:rPr>
-        <w:lastRenderedPageBreak/>
-        <w:t>It is fast and efficient because it uses the same key to both encrypt and decrypt but require a secure way to share a key</w:t>
+        <w:t xml:space="preserve">It is fast and </w:t>
+      </w:r>
+      <w:r>
+        <w:rPr>
+          <w:sz w:val="24"/>
+          <w:szCs w:val="24"/>
+        </w:rPr>
+        <w:t xml:space="preserve">most </w:t>
+      </w:r>
+      <w:r>
+        <w:rPr>
+          <w:sz w:val="24"/>
+          <w:szCs w:val="24"/>
+        </w:rPr>
+        <w:t>efficient because it uses the same key to both encrypt and decrypt but require</w:t>
+      </w:r>
+      <w:r>
+        <w:rPr>
+          <w:sz w:val="24"/>
+          <w:szCs w:val="24"/>
+        </w:rPr>
+        <w:t>s</w:t>
+      </w:r>
+      <w:r>
+        <w:rPr>
+          <w:sz w:val="24"/>
+          <w:szCs w:val="24"/>
+        </w:rPr>
+        <w:t xml:space="preserve"> a secure way to share a key</w:t>
       </w:r>
     </w:p>
     <w:p>
@@ -554,7 +679,21 @@
           <w:szCs w:val="24"/>
         </w:rPr>
         <w:br/>
-        <w:t xml:space="preserve">Public key can anyone use to encrypt, and only you have a </w:t>
+        <w:t xml:space="preserve">Public key anyone </w:t>
+      </w:r>
+      <w:r>
+        <w:rPr>
+          <w:sz w:val="24"/>
+          <w:szCs w:val="24"/>
+        </w:rPr>
+        <w:t xml:space="preserve">can </w:t>
+      </w:r>
+      <w:r>
+        <w:rPr>
+          <w:sz w:val="24"/>
+          <w:szCs w:val="24"/>
+        </w:rPr>
+        <w:t xml:space="preserve">use to encrypt, and only you have a </w:t>
       </w:r>
       <w:proofErr w:type="gramStart"/>
       <w:r>
@@ -635,27 +774,305 @@
           <w:szCs w:val="24"/>
         </w:rPr>
       </w:pPr>
-      <w:r>
-        <w:rPr>
-          <w:sz w:val="24"/>
-          <w:szCs w:val="24"/>
-        </w:rPr>
-        <w:t xml:space="preserve">The whole modern digital world where all people use the internet to communication, sending sensitive information, logging into banks, social media, connecting to volume of websites cryptographic systems are incredibly important. </w:t>
-      </w:r>
-    </w:p>
-    <w:p>
-      <w:pPr>
-        <w:rPr>
-          <w:sz w:val="24"/>
-          <w:szCs w:val="24"/>
-        </w:rPr>
-      </w:pPr>
-      <w:r>
-        <w:rPr>
-          <w:sz w:val="24"/>
-          <w:szCs w:val="24"/>
-        </w:rPr>
-        <w:t xml:space="preserve">People by using applications like WhatsApp, Messenger, Telegram etc. send millions of private and business information. Those messages are encrypted every time they are sent and decrypt when receiver gets the message. </w:t>
+    </w:p>
+    <w:p>
+      <w:pPr>
+        <w:rPr>
+          <w:sz w:val="24"/>
+          <w:szCs w:val="24"/>
+        </w:rPr>
+      </w:pPr>
+      <w:r>
+        <w:rPr>
+          <w:i/>
+          <w:iCs/>
+          <w:sz w:val="24"/>
+          <w:szCs w:val="24"/>
+        </w:rPr>
+        <w:t>Hashing</w:t>
+      </w:r>
+      <w:r>
+        <w:rPr>
+          <w:sz w:val="24"/>
+          <w:szCs w:val="24"/>
+        </w:rPr>
+        <w:t xml:space="preserve"> </w:t>
+      </w:r>
+      <w:r>
+        <w:rPr>
+          <w:sz w:val="24"/>
+          <w:szCs w:val="24"/>
+        </w:rPr>
+        <w:t xml:space="preserve">is a method </w:t>
+      </w:r>
+      <w:r>
+        <w:rPr>
+          <w:sz w:val="24"/>
+          <w:szCs w:val="24"/>
+        </w:rPr>
+        <w:t>for converting data values into uni</w:t>
+      </w:r>
+      <w:r>
+        <w:rPr>
+          <w:sz w:val="24"/>
+          <w:szCs w:val="24"/>
+        </w:rPr>
+        <w:t xml:space="preserve">que </w:t>
+      </w:r>
+      <w:r>
+        <w:rPr>
+          <w:sz w:val="24"/>
+          <w:szCs w:val="24"/>
+        </w:rPr>
+        <w:t>characters called hashes</w:t>
+      </w:r>
+      <w:r>
+        <w:rPr>
+          <w:sz w:val="24"/>
+          <w:szCs w:val="24"/>
+        </w:rPr>
+        <w:t xml:space="preserve">. </w:t>
+      </w:r>
+      <w:r>
+        <w:rPr>
+          <w:sz w:val="24"/>
+          <w:szCs w:val="24"/>
+        </w:rPr>
+        <w:t xml:space="preserve">Hashing is used to secure </w:t>
+      </w:r>
+      <w:r>
+        <w:rPr>
+          <w:sz w:val="24"/>
+          <w:szCs w:val="24"/>
+        </w:rPr>
+        <w:t>and quick access</w:t>
+      </w:r>
+      <w:r>
+        <w:rPr>
+          <w:sz w:val="24"/>
+          <w:szCs w:val="24"/>
+        </w:rPr>
+        <w:t xml:space="preserve">. </w:t>
+      </w:r>
+      <w:r>
+        <w:rPr>
+          <w:sz w:val="24"/>
+          <w:szCs w:val="24"/>
+        </w:rPr>
+        <w:t>Hashing can be use</w:t>
+      </w:r>
+      <w:r>
+        <w:rPr>
+          <w:sz w:val="24"/>
+          <w:szCs w:val="24"/>
+        </w:rPr>
+        <w:t xml:space="preserve"> for data security. </w:t>
+      </w:r>
+    </w:p>
+    <w:p>
+      <w:pPr>
+        <w:rPr>
+          <w:sz w:val="24"/>
+          <w:szCs w:val="24"/>
+        </w:rPr>
+      </w:pPr>
+      <w:r>
+        <w:rPr>
+          <w:sz w:val="24"/>
+          <w:szCs w:val="24"/>
+        </w:rPr>
+        <w:t>This way of encryption is applied e.g.:</w:t>
+      </w:r>
+    </w:p>
+    <w:p>
+      <w:pPr>
+        <w:pStyle w:val="Akapitzlist"/>
+        <w:numPr>
+          <w:ilvl w:val="0"/>
+          <w:numId w:val="11"/>
+        </w:numPr>
+        <w:rPr>
+          <w:sz w:val="24"/>
+          <w:szCs w:val="24"/>
+        </w:rPr>
+      </w:pPr>
+      <w:r>
+        <w:rPr>
+          <w:sz w:val="24"/>
+          <w:szCs w:val="24"/>
+        </w:rPr>
+        <w:t>Passwords</w:t>
+      </w:r>
+      <w:r>
+        <w:rPr>
+          <w:sz w:val="24"/>
+          <w:szCs w:val="24"/>
+        </w:rPr>
+        <w:t xml:space="preserve"> storage </w:t>
+      </w:r>
+    </w:p>
+    <w:p>
+      <w:pPr>
+        <w:pStyle w:val="Akapitzlist"/>
+        <w:numPr>
+          <w:ilvl w:val="0"/>
+          <w:numId w:val="11"/>
+        </w:numPr>
+        <w:rPr>
+          <w:sz w:val="24"/>
+          <w:szCs w:val="24"/>
+        </w:rPr>
+      </w:pPr>
+      <w:r>
+        <w:rPr>
+          <w:sz w:val="24"/>
+          <w:szCs w:val="24"/>
+        </w:rPr>
+        <w:t>Data Structure (Has</w:t>
+      </w:r>
+      <w:r>
+        <w:rPr>
+          <w:sz w:val="24"/>
+          <w:szCs w:val="24"/>
+        </w:rPr>
+        <w:t>h Tables)</w:t>
+      </w:r>
+    </w:p>
+    <w:p>
+      <w:pPr>
+        <w:rPr>
+          <w:sz w:val="24"/>
+          <w:szCs w:val="24"/>
+        </w:rPr>
+      </w:pPr>
+      <w:r>
+        <w:rPr>
+          <w:sz w:val="24"/>
+          <w:szCs w:val="24"/>
+        </w:rPr>
+        <w:t>A one</w:t>
+      </w:r>
+      <w:r>
+        <w:rPr>
+          <w:sz w:val="24"/>
+          <w:szCs w:val="24"/>
+        </w:rPr>
+        <w:t xml:space="preserve">-way digital fingerprint that turns data int unique </w:t>
+      </w:r>
+      <w:r>
+        <w:rPr>
+          <w:sz w:val="24"/>
+          <w:szCs w:val="24"/>
+        </w:rPr>
+        <w:t xml:space="preserve">string to variety integrity </w:t>
+      </w:r>
+      <w:r>
+        <w:rPr>
+          <w:sz w:val="24"/>
+          <w:szCs w:val="24"/>
+        </w:rPr>
+        <w:t>without revealing the original content.</w:t>
+      </w:r>
+    </w:p>
+    <w:p>
+      <w:pPr>
+        <w:rPr>
+          <w:sz w:val="24"/>
+          <w:szCs w:val="24"/>
+        </w:rPr>
+      </w:pPr>
+    </w:p>
+    <w:p>
+      <w:pPr>
+        <w:rPr>
+          <w:sz w:val="24"/>
+          <w:szCs w:val="24"/>
+        </w:rPr>
+      </w:pPr>
+      <w:r>
+        <w:rPr>
+          <w:sz w:val="24"/>
+          <w:szCs w:val="24"/>
+        </w:rPr>
+        <w:t xml:space="preserve">The whole modern digital world where all people use the internet </w:t>
+      </w:r>
+      <w:r>
+        <w:rPr>
+          <w:sz w:val="24"/>
+          <w:szCs w:val="24"/>
+        </w:rPr>
+        <w:t>for</w:t>
+      </w:r>
+      <w:r>
+        <w:rPr>
+          <w:sz w:val="24"/>
+          <w:szCs w:val="24"/>
+        </w:rPr>
+        <w:t xml:space="preserve"> communication, sending sensitive information, logging into banks, social media, connecting to volume of websites cryptographic systems are incredibly important. </w:t>
+      </w:r>
+    </w:p>
+    <w:p>
+      <w:pPr>
+        <w:rPr>
+          <w:sz w:val="24"/>
+          <w:szCs w:val="24"/>
+        </w:rPr>
+      </w:pPr>
+      <w:r>
+        <w:rPr>
+          <w:sz w:val="24"/>
+          <w:szCs w:val="24"/>
+        </w:rPr>
+        <w:t>U</w:t>
+      </w:r>
+      <w:r>
+        <w:rPr>
+          <w:sz w:val="24"/>
+          <w:szCs w:val="24"/>
+        </w:rPr>
+        <w:t>sing applications like WhatsApp, Messenger, Telegram etc. send</w:t>
+      </w:r>
+      <w:r>
+        <w:rPr>
+          <w:sz w:val="24"/>
+          <w:szCs w:val="24"/>
+        </w:rPr>
+        <w:t>s</w:t>
+      </w:r>
+      <w:r>
+        <w:rPr>
+          <w:sz w:val="24"/>
+          <w:szCs w:val="24"/>
+        </w:rPr>
+        <w:t xml:space="preserve"> millions of private and business information. Those messages are encrypted every time they are sent and decrypt</w:t>
+      </w:r>
+      <w:r>
+        <w:rPr>
+          <w:sz w:val="24"/>
+          <w:szCs w:val="24"/>
+        </w:rPr>
+        <w:t>ed</w:t>
+      </w:r>
+      <w:r>
+        <w:rPr>
+          <w:sz w:val="24"/>
+          <w:szCs w:val="24"/>
+        </w:rPr>
+        <w:t xml:space="preserve"> when</w:t>
+      </w:r>
+      <w:r>
+        <w:rPr>
+          <w:sz w:val="24"/>
+          <w:szCs w:val="24"/>
+        </w:rPr>
+        <w:t xml:space="preserve"> the</w:t>
+      </w:r>
+      <w:r>
+        <w:rPr>
+          <w:sz w:val="24"/>
+          <w:szCs w:val="24"/>
+        </w:rPr>
+        <w:t xml:space="preserve"> receiver gets the message. </w:t>
       </w:r>
       <w:r>
         <w:rPr>
@@ -663,7 +1080,21 @@
           <w:szCs w:val="24"/>
         </w:rPr>
         <w:br/>
-        <w:t>Every time when people log into their banks accounts encryption must be involved.</w:t>
+        <w:t>Every time people log into their bank accounts</w:t>
+      </w:r>
+      <w:r>
+        <w:rPr>
+          <w:sz w:val="24"/>
+          <w:szCs w:val="24"/>
+        </w:rPr>
+        <w:t>,</w:t>
+      </w:r>
+      <w:r>
+        <w:rPr>
+          <w:sz w:val="24"/>
+          <w:szCs w:val="24"/>
+        </w:rPr>
+        <w:t xml:space="preserve"> encryption must be involved.</w:t>
       </w:r>
       <w:r>
         <w:rPr>
@@ -671,7 +1102,35 @@
           <w:szCs w:val="24"/>
         </w:rPr>
         <w:br/>
-        <w:t xml:space="preserve">Without cryptographic systems all that sensitive information could be stolen and used in the way where no one would want to. </w:t>
+        <w:t>Without cryptographic systems</w:t>
+      </w:r>
+      <w:r>
+        <w:rPr>
+          <w:sz w:val="24"/>
+          <w:szCs w:val="24"/>
+        </w:rPr>
+        <w:t>,</w:t>
+      </w:r>
+      <w:r>
+        <w:rPr>
+          <w:sz w:val="24"/>
+          <w:szCs w:val="24"/>
+        </w:rPr>
+        <w:t xml:space="preserve"> all that sensitive information could be stolen and used in </w:t>
+      </w:r>
+      <w:r>
+        <w:rPr>
+          <w:sz w:val="24"/>
+          <w:szCs w:val="24"/>
+        </w:rPr>
+        <w:t>a</w:t>
+      </w:r>
+      <w:r>
+        <w:rPr>
+          <w:sz w:val="24"/>
+          <w:szCs w:val="24"/>
+        </w:rPr>
+        <w:t xml:space="preserve"> way where no one would want to. </w:t>
       </w:r>
     </w:p>
     <w:p>
@@ -691,7 +1150,7 @@
     </w:p>
     <w:p>
       <w:pPr>
-        <w:pStyle w:val="Heading1"/>
+        <w:pStyle w:val="Nagwek11"/>
         <w:numPr>
           <w:ilvl w:val="0"/>
           <w:numId w:val="0"/>
@@ -707,7 +1166,7 @@
     </w:p>
     <w:p>
       <w:pPr>
-        <w:pStyle w:val="Heading1"/>
+        <w:pStyle w:val="Nagwek11"/>
         <w:numPr>
           <w:ilvl w:val="0"/>
           <w:numId w:val="0"/>
@@ -732,7 +1191,7 @@
     </w:p>
     <w:p>
       <w:pPr>
-        <w:pStyle w:val="Heading1"/>
+        <w:pStyle w:val="Nagwek11"/>
         <w:numPr>
           <w:ilvl w:val="2"/>
           <w:numId w:val="6"/>
@@ -747,7 +1206,7 @@
     </w:p>
     <w:p>
       <w:pPr>
-        <w:pStyle w:val="Heading1"/>
+        <w:pStyle w:val="Nagwek11"/>
         <w:numPr>
           <w:ilvl w:val="0"/>
           <w:numId w:val="0"/>
@@ -772,7 +1231,7 @@
     </w:p>
     <w:p>
       <w:pPr>
-        <w:pStyle w:val="Heading1"/>
+        <w:pStyle w:val="Nagwek11"/>
         <w:numPr>
           <w:ilvl w:val="2"/>
           <w:numId w:val="6"/>
@@ -805,7 +1264,7 @@
     </w:p>
     <w:p>
       <w:pPr>
-        <w:pStyle w:val="Heading1"/>
+        <w:pStyle w:val="Nagwek11"/>
         <w:numPr>
           <w:ilvl w:val="0"/>
           <w:numId w:val="0"/>
@@ -831,7 +1290,7 @@
     </w:p>
     <w:p>
       <w:pPr>
-        <w:pStyle w:val="Heading1"/>
+        <w:pStyle w:val="Nagwek11"/>
         <w:numPr>
           <w:ilvl w:val="0"/>
           <w:numId w:val="7"/>
@@ -855,7 +1314,7 @@
     </w:p>
     <w:p>
       <w:pPr>
-        <w:pStyle w:val="Heading1"/>
+        <w:pStyle w:val="Nagwek11"/>
         <w:numPr>
           <w:ilvl w:val="1"/>
           <w:numId w:val="7"/>
@@ -875,7 +1334,7 @@
     </w:p>
     <w:p>
       <w:pPr>
-        <w:pStyle w:val="Heading1"/>
+        <w:pStyle w:val="Nagwek11"/>
         <w:numPr>
           <w:ilvl w:val="1"/>
           <w:numId w:val="7"/>
@@ -895,7 +1354,7 @@
     </w:p>
     <w:p>
       <w:pPr>
-        <w:pStyle w:val="Heading1"/>
+        <w:pStyle w:val="Nagwek11"/>
         <w:numPr>
           <w:ilvl w:val="1"/>
           <w:numId w:val="7"/>
@@ -910,13 +1369,12 @@
           <w:sz w:val="24"/>
           <w:szCs w:val="24"/>
         </w:rPr>
-        <w:lastRenderedPageBreak/>
         <w:t>Role of JavaScript:</w:t>
       </w:r>
     </w:p>
     <w:p>
       <w:pPr>
-        <w:pStyle w:val="Heading1"/>
+        <w:pStyle w:val="Nagwek11"/>
         <w:numPr>
           <w:ilvl w:val="1"/>
           <w:numId w:val="7"/>
@@ -936,7 +1394,7 @@
     </w:p>
     <w:p>
       <w:pPr>
-        <w:pStyle w:val="Heading1"/>
+        <w:pStyle w:val="Nagwek11"/>
         <w:numPr>
           <w:ilvl w:val="0"/>
           <w:numId w:val="7"/>
@@ -960,7 +1418,7 @@
     </w:p>
     <w:p>
       <w:pPr>
-        <w:pStyle w:val="Heading1"/>
+        <w:pStyle w:val="Nagwek11"/>
         <w:numPr>
           <w:ilvl w:val="1"/>
           <w:numId w:val="7"/>
@@ -980,7 +1438,7 @@
     </w:p>
     <w:p>
       <w:pPr>
-        <w:pStyle w:val="Heading1"/>
+        <w:pStyle w:val="Nagwek11"/>
         <w:numPr>
           <w:ilvl w:val="2"/>
           <w:numId w:val="7"/>
@@ -1000,7 +1458,7 @@
     </w:p>
     <w:p>
       <w:pPr>
-        <w:pStyle w:val="Heading1"/>
+        <w:pStyle w:val="Nagwek11"/>
         <w:numPr>
           <w:ilvl w:val="2"/>
           <w:numId w:val="7"/>
@@ -1020,7 +1478,7 @@
     </w:p>
     <w:p>
       <w:pPr>
-        <w:pStyle w:val="Heading1"/>
+        <w:pStyle w:val="Nagwek11"/>
         <w:numPr>
           <w:ilvl w:val="2"/>
           <w:numId w:val="7"/>
@@ -1040,7 +1498,7 @@
     </w:p>
     <w:p>
       <w:pPr>
-        <w:pStyle w:val="Heading1"/>
+        <w:pStyle w:val="Nagwek11"/>
         <w:numPr>
           <w:ilvl w:val="2"/>
           <w:numId w:val="7"/>
@@ -1060,7 +1518,7 @@
     </w:p>
     <w:p>
       <w:pPr>
-        <w:pStyle w:val="Heading1"/>
+        <w:pStyle w:val="Nagwek11"/>
         <w:numPr>
           <w:ilvl w:val="0"/>
           <w:numId w:val="7"/>
@@ -1084,7 +1542,7 @@
     </w:p>
     <w:p>
       <w:pPr>
-        <w:pStyle w:val="Heading1"/>
+        <w:pStyle w:val="Nagwek11"/>
         <w:numPr>
           <w:ilvl w:val="1"/>
           <w:numId w:val="7"/>
@@ -1104,7 +1562,7 @@
     </w:p>
     <w:p>
       <w:pPr>
-        <w:pStyle w:val="Heading1"/>
+        <w:pStyle w:val="Nagwek11"/>
         <w:numPr>
           <w:ilvl w:val="2"/>
           <w:numId w:val="7"/>
@@ -1124,7 +1582,7 @@
     </w:p>
     <w:p>
       <w:pPr>
-        <w:pStyle w:val="Heading1"/>
+        <w:pStyle w:val="Nagwek11"/>
         <w:numPr>
           <w:ilvl w:val="2"/>
           <w:numId w:val="7"/>
@@ -1144,7 +1602,7 @@
     </w:p>
     <w:p>
       <w:pPr>
-        <w:pStyle w:val="Heading1"/>
+        <w:pStyle w:val="Nagwek11"/>
         <w:numPr>
           <w:ilvl w:val="2"/>
           <w:numId w:val="7"/>
@@ -1164,7 +1622,7 @@
     </w:p>
     <w:p>
       <w:pPr>
-        <w:pStyle w:val="Heading1"/>
+        <w:pStyle w:val="Nagwek11"/>
         <w:numPr>
           <w:ilvl w:val="1"/>
           <w:numId w:val="7"/>
@@ -1184,7 +1642,7 @@
     </w:p>
     <w:p>
       <w:pPr>
-        <w:pStyle w:val="Heading1"/>
+        <w:pStyle w:val="Nagwek11"/>
         <w:numPr>
           <w:ilvl w:val="0"/>
           <w:numId w:val="7"/>
@@ -1226,7 +1684,7 @@
     </w:p>
     <w:p>
       <w:pPr>
-        <w:pStyle w:val="Heading1"/>
+        <w:pStyle w:val="Nagwek11"/>
         <w:numPr>
           <w:ilvl w:val="0"/>
           <w:numId w:val="0"/>
@@ -1242,7 +1700,7 @@
     </w:p>
     <w:p>
       <w:pPr>
-        <w:pStyle w:val="Heading1"/>
+        <w:pStyle w:val="Nagwek11"/>
         <w:numPr>
           <w:ilvl w:val="0"/>
           <w:numId w:val="0"/>
@@ -1258,7 +1716,7 @@
     </w:p>
     <w:p>
       <w:pPr>
-        <w:pStyle w:val="Heading1"/>
+        <w:pStyle w:val="Nagwek11"/>
         <w:numPr>
           <w:ilvl w:val="0"/>
           <w:numId w:val="0"/>
@@ -1274,7 +1732,7 @@
     </w:p>
     <w:p>
       <w:pPr>
-        <w:pStyle w:val="Heading1"/>
+        <w:pStyle w:val="Nagwek11"/>
         <w:numPr>
           <w:ilvl w:val="0"/>
           <w:numId w:val="0"/>
@@ -1300,7 +1758,7 @@
     </w:p>
     <w:p>
       <w:pPr>
-        <w:pStyle w:val="Heading1"/>
+        <w:pStyle w:val="Nagwek11"/>
         <w:numPr>
           <w:ilvl w:val="0"/>
           <w:numId w:val="0"/>
@@ -1316,7 +1774,7 @@
     </w:p>
     <w:p>
       <w:pPr>
-        <w:pStyle w:val="Heading1"/>
+        <w:pStyle w:val="Nagwek11"/>
         <w:numPr>
           <w:ilvl w:val="0"/>
           <w:numId w:val="8"/>
@@ -1349,7 +1807,7 @@
     </w:p>
     <w:p>
       <w:pPr>
-        <w:pStyle w:val="Heading1"/>
+        <w:pStyle w:val="Nagwek11"/>
         <w:numPr>
           <w:ilvl w:val="1"/>
           <w:numId w:val="8"/>
@@ -1369,7 +1827,7 @@
     </w:p>
     <w:p>
       <w:pPr>
-        <w:pStyle w:val="Heading1"/>
+        <w:pStyle w:val="Nagwek11"/>
         <w:numPr>
           <w:ilvl w:val="1"/>
           <w:numId w:val="8"/>
@@ -1389,7 +1847,7 @@
     </w:p>
     <w:p>
       <w:pPr>
-        <w:pStyle w:val="Heading1"/>
+        <w:pStyle w:val="Nagwek11"/>
         <w:numPr>
           <w:ilvl w:val="1"/>
           <w:numId w:val="8"/>
@@ -1409,7 +1867,7 @@
     </w:p>
     <w:p>
       <w:pPr>
-        <w:pStyle w:val="Heading1"/>
+        <w:pStyle w:val="Nagwek11"/>
         <w:numPr>
           <w:ilvl w:val="1"/>
           <w:numId w:val="8"/>
@@ -1429,7 +1887,7 @@
     </w:p>
     <w:p>
       <w:pPr>
-        <w:pStyle w:val="Heading1"/>
+        <w:pStyle w:val="Nagwek11"/>
         <w:numPr>
           <w:ilvl w:val="1"/>
           <w:numId w:val="8"/>
@@ -1449,7 +1907,7 @@
     </w:p>
     <w:p>
       <w:pPr>
-        <w:pStyle w:val="Heading1"/>
+        <w:pStyle w:val="Nagwek11"/>
         <w:numPr>
           <w:ilvl w:val="1"/>
           <w:numId w:val="8"/>
@@ -1469,7 +1927,7 @@
     </w:p>
     <w:p>
       <w:pPr>
-        <w:pStyle w:val="Heading1"/>
+        <w:pStyle w:val="Nagwek11"/>
         <w:numPr>
           <w:ilvl w:val="0"/>
           <w:numId w:val="8"/>
@@ -1493,7 +1951,7 @@
     </w:p>
     <w:p>
       <w:pPr>
-        <w:pStyle w:val="Heading1"/>
+        <w:pStyle w:val="Nagwek11"/>
         <w:numPr>
           <w:ilvl w:val="1"/>
           <w:numId w:val="8"/>
@@ -1508,13 +1966,12 @@
           <w:sz w:val="24"/>
           <w:szCs w:val="24"/>
         </w:rPr>
-        <w:lastRenderedPageBreak/>
         <w:t>Explanation how each OOP principle in Developing the Library Management System</w:t>
       </w:r>
     </w:p>
     <w:p>
       <w:pPr>
-        <w:pStyle w:val="Heading1"/>
+        <w:pStyle w:val="Nagwek11"/>
         <w:numPr>
           <w:ilvl w:val="1"/>
           <w:numId w:val="8"/>
@@ -1534,7 +1991,7 @@
     </w:p>
     <w:p>
       <w:pPr>
-        <w:pStyle w:val="Heading1"/>
+        <w:pStyle w:val="Nagwek11"/>
         <w:numPr>
           <w:ilvl w:val="2"/>
           <w:numId w:val="8"/>
@@ -1554,7 +2011,7 @@
     </w:p>
     <w:p>
       <w:pPr>
-        <w:pStyle w:val="Heading1"/>
+        <w:pStyle w:val="Nagwek11"/>
         <w:numPr>
           <w:ilvl w:val="2"/>
           <w:numId w:val="8"/>
@@ -1574,7 +2031,7 @@
     </w:p>
     <w:p>
       <w:pPr>
-        <w:pStyle w:val="Heading1"/>
+        <w:pStyle w:val="Nagwek11"/>
         <w:numPr>
           <w:ilvl w:val="2"/>
           <w:numId w:val="8"/>
@@ -1594,7 +2051,7 @@
     </w:p>
     <w:p>
       <w:pPr>
-        <w:pStyle w:val="Heading1"/>
+        <w:pStyle w:val="Nagwek11"/>
         <w:numPr>
           <w:ilvl w:val="1"/>
           <w:numId w:val="8"/>
@@ -1635,7 +2092,7 @@
     </w:p>
     <w:p>
       <w:pPr>
-        <w:pStyle w:val="Heading1"/>
+        <w:pStyle w:val="Nagwek11"/>
         <w:numPr>
           <w:ilvl w:val="1"/>
           <w:numId w:val="8"/>
@@ -1655,7 +2112,7 @@
     </w:p>
     <w:p>
       <w:pPr>
-        <w:pStyle w:val="Heading1"/>
+        <w:pStyle w:val="Nagwek11"/>
         <w:numPr>
           <w:ilvl w:val="1"/>
           <w:numId w:val="8"/>
@@ -1719,6 +2176,7 @@
         <w:docPartUnique/>
       </w:docPartObj>
     </w:sdtPr>
+    <w:sdtEndPr/>
     <w:sdtContent>
       <w:p>
         <w:pPr>
@@ -2241,6 +2699,119 @@
     </w:lvl>
   </w:abstractNum>
   <w:abstractNum w:abstractNumId="5" w15:restartNumberingAfterBreak="0">
+    <w:nsid w:val="26B24010"/>
+    <w:multiLevelType w:val="hybridMultilevel"/>
+    <w:tmpl w:val="EB465D32"/>
+    <w:lvl w:ilvl="0" w:tplc="08090001">
+      <w:start w:val="1"/>
+      <w:numFmt w:val="bullet"/>
+      <w:lvlText w:val=""/>
+      <w:lvlJc w:val="left"/>
+      <w:pPr>
+        <w:ind w:left="720" w:hanging="360"/>
+      </w:pPr>
+      <w:rPr>
+        <w:rFonts w:ascii="Symbol" w:hAnsi="Symbol" w:hint="default"/>
+      </w:rPr>
+    </w:lvl>
+    <w:lvl w:ilvl="1" w:tplc="08090003" w:tentative="1">
+      <w:start w:val="1"/>
+      <w:numFmt w:val="bullet"/>
+      <w:lvlText w:val="o"/>
+      <w:lvlJc w:val="left"/>
+      <w:pPr>
+        <w:ind w:left="1440" w:hanging="360"/>
+      </w:pPr>
+      <w:rPr>
+        <w:rFonts w:ascii="Courier New" w:hAnsi="Courier New" w:cs="Courier New" w:hint="default"/>
+      </w:rPr>
+    </w:lvl>
+    <w:lvl w:ilvl="2" w:tplc="08090005" w:tentative="1">
+      <w:start w:val="1"/>
+      <w:numFmt w:val="bullet"/>
+      <w:lvlText w:val=""/>
+      <w:lvlJc w:val="left"/>
+      <w:pPr>
+        <w:ind w:left="2160" w:hanging="360"/>
+      </w:pPr>
+      <w:rPr>
+        <w:rFonts w:ascii="Wingdings" w:hAnsi="Wingdings" w:hint="default"/>
+      </w:rPr>
+    </w:lvl>
+    <w:lvl w:ilvl="3" w:tplc="08090001" w:tentative="1">
+      <w:start w:val="1"/>
+      <w:numFmt w:val="bullet"/>
+      <w:lvlText w:val=""/>
+      <w:lvlJc w:val="left"/>
+      <w:pPr>
+        <w:ind w:left="2880" w:hanging="360"/>
+      </w:pPr>
+      <w:rPr>
+        <w:rFonts w:ascii="Symbol" w:hAnsi="Symbol" w:hint="default"/>
+      </w:rPr>
+    </w:lvl>
+    <w:lvl w:ilvl="4" w:tplc="08090003" w:tentative="1">
+      <w:start w:val="1"/>
+      <w:numFmt w:val="bullet"/>
+      <w:lvlText w:val="o"/>
+      <w:lvlJc w:val="left"/>
+      <w:pPr>
+        <w:ind w:left="3600" w:hanging="360"/>
+      </w:pPr>
+      <w:rPr>
+        <w:rFonts w:ascii="Courier New" w:hAnsi="Courier New" w:cs="Courier New" w:hint="default"/>
+      </w:rPr>
+    </w:lvl>
+    <w:lvl w:ilvl="5" w:tplc="08090005" w:tentative="1">
+      <w:start w:val="1"/>
+      <w:numFmt w:val="bullet"/>
+      <w:lvlText w:val=""/>
+      <w:lvlJc w:val="left"/>
+      <w:pPr>
+        <w:ind w:left="4320" w:hanging="360"/>
+      </w:pPr>
+      <w:rPr>
+        <w:rFonts w:ascii="Wingdings" w:hAnsi="Wingdings" w:hint="default"/>
+      </w:rPr>
+    </w:lvl>
+    <w:lvl w:ilvl="6" w:tplc="08090001" w:tentative="1">
+      <w:start w:val="1"/>
+      <w:numFmt w:val="bullet"/>
+      <w:lvlText w:val=""/>
+      <w:lvlJc w:val="left"/>
+      <w:pPr>
+        <w:ind w:left="5040" w:hanging="360"/>
+      </w:pPr>
+      <w:rPr>
+        <w:rFonts w:ascii="Symbol" w:hAnsi="Symbol" w:hint="default"/>
+      </w:rPr>
+    </w:lvl>
+    <w:lvl w:ilvl="7" w:tplc="08090003" w:tentative="1">
+      <w:start w:val="1"/>
+      <w:numFmt w:val="bullet"/>
+      <w:lvlText w:val="o"/>
+      <w:lvlJc w:val="left"/>
+      <w:pPr>
+        <w:ind w:left="5760" w:hanging="360"/>
+      </w:pPr>
+      <w:rPr>
+        <w:rFonts w:ascii="Courier New" w:hAnsi="Courier New" w:cs="Courier New" w:hint="default"/>
+      </w:rPr>
+    </w:lvl>
+    <w:lvl w:ilvl="8" w:tplc="08090005" w:tentative="1">
+      <w:start w:val="1"/>
+      <w:numFmt w:val="bullet"/>
+      <w:lvlText w:val=""/>
+      <w:lvlJc w:val="left"/>
+      <w:pPr>
+        <w:ind w:left="6480" w:hanging="360"/>
+      </w:pPr>
+      <w:rPr>
+        <w:rFonts w:ascii="Wingdings" w:hAnsi="Wingdings" w:hint="default"/>
+      </w:rPr>
+    </w:lvl>
+  </w:abstractNum>
+  <w:abstractNum w:abstractNumId="6" w15:restartNumberingAfterBreak="0">
     <w:nsid w:val="2A251878"/>
     <w:multiLevelType w:val="hybridMultilevel"/>
     <w:tmpl w:val="CB0C4A52"/>
@@ -2353,7 +2924,7 @@
       </w:rPr>
     </w:lvl>
   </w:abstractNum>
-  <w:abstractNum w:abstractNumId="6" w15:restartNumberingAfterBreak="0">
+  <w:abstractNum w:abstractNumId="7" w15:restartNumberingAfterBreak="0">
     <w:nsid w:val="3B6E3719"/>
     <w:multiLevelType w:val="hybridMultilevel"/>
     <w:tmpl w:val="0226CC64"/>
@@ -2442,14 +3013,14 @@
       </w:pPr>
     </w:lvl>
   </w:abstractNum>
-  <w:abstractNum w:abstractNumId="7" w15:restartNumberingAfterBreak="0">
+  <w:abstractNum w:abstractNumId="8" w15:restartNumberingAfterBreak="0">
     <w:nsid w:val="40292AB6"/>
     <w:multiLevelType w:val="multilevel"/>
     <w:tmpl w:val="08090025"/>
     <w:lvl w:ilvl="0">
       <w:start w:val="1"/>
       <w:numFmt w:val="decimal"/>
-      <w:pStyle w:val="Heading1"/>
+      <w:pStyle w:val="Nagwek11"/>
       <w:lvlText w:val="%1"/>
       <w:lvlJc w:val="left"/>
       <w:pPr>
@@ -2459,7 +3030,7 @@
     <w:lvl w:ilvl="1">
       <w:start w:val="1"/>
       <w:numFmt w:val="decimal"/>
-      <w:pStyle w:val="Heading2"/>
+      <w:pStyle w:val="Nagwek21"/>
       <w:lvlText w:val="%1.%2"/>
       <w:lvlJc w:val="left"/>
       <w:pPr>
@@ -2469,7 +3040,7 @@
     <w:lvl w:ilvl="2">
       <w:start w:val="1"/>
       <w:numFmt w:val="decimal"/>
-      <w:pStyle w:val="Heading3"/>
+      <w:pStyle w:val="Nagwek31"/>
       <w:lvlText w:val="%1.%2.%3"/>
       <w:lvlJc w:val="left"/>
       <w:pPr>
@@ -2479,7 +3050,7 @@
     <w:lvl w:ilvl="3">
       <w:start w:val="1"/>
       <w:numFmt w:val="decimal"/>
-      <w:pStyle w:val="Heading4"/>
+      <w:pStyle w:val="Nagwek41"/>
       <w:lvlText w:val="%1.%2.%3.%4"/>
       <w:lvlJc w:val="left"/>
       <w:pPr>
@@ -2489,7 +3060,7 @@
     <w:lvl w:ilvl="4">
       <w:start w:val="1"/>
       <w:numFmt w:val="decimal"/>
-      <w:pStyle w:val="Heading5"/>
+      <w:pStyle w:val="Nagwek51"/>
       <w:lvlText w:val="%1.%2.%3.%4.%5"/>
       <w:lvlJc w:val="left"/>
       <w:pPr>
@@ -2499,7 +3070,7 @@
     <w:lvl w:ilvl="5">
       <w:start w:val="1"/>
       <w:numFmt w:val="decimal"/>
-      <w:pStyle w:val="Heading6"/>
+      <w:pStyle w:val="Nagwek61"/>
       <w:lvlText w:val="%1.%2.%3.%4.%5.%6"/>
       <w:lvlJc w:val="left"/>
       <w:pPr>
@@ -2509,7 +3080,7 @@
     <w:lvl w:ilvl="6">
       <w:start w:val="1"/>
       <w:numFmt w:val="decimal"/>
-      <w:pStyle w:val="Heading7"/>
+      <w:pStyle w:val="Nagwek71"/>
       <w:lvlText w:val="%1.%2.%3.%4.%5.%6.%7"/>
       <w:lvlJc w:val="left"/>
       <w:pPr>
@@ -2519,7 +3090,7 @@
     <w:lvl w:ilvl="7">
       <w:start w:val="1"/>
       <w:numFmt w:val="decimal"/>
-      <w:pStyle w:val="Heading8"/>
+      <w:pStyle w:val="Nagwek81"/>
       <w:lvlText w:val="%1.%2.%3.%4.%5.%6.%7.%8"/>
       <w:lvlJc w:val="left"/>
       <w:pPr>
@@ -2529,7 +3100,7 @@
     <w:lvl w:ilvl="8">
       <w:start w:val="1"/>
       <w:numFmt w:val="decimal"/>
-      <w:pStyle w:val="Heading9"/>
+      <w:pStyle w:val="Nagwek91"/>
       <w:lvlText w:val="%1.%2.%3.%4.%5.%6.%7.%8.%9"/>
       <w:lvlJc w:val="left"/>
       <w:pPr>
@@ -2537,7 +3108,7 @@
       </w:pPr>
     </w:lvl>
   </w:abstractNum>
-  <w:abstractNum w:abstractNumId="8" w15:restartNumberingAfterBreak="0">
+  <w:abstractNum w:abstractNumId="9" w15:restartNumberingAfterBreak="0">
     <w:nsid w:val="57FE639B"/>
     <w:multiLevelType w:val="multilevel"/>
     <w:tmpl w:val="0809001F"/>
@@ -2623,7 +3194,7 @@
       </w:pPr>
     </w:lvl>
   </w:abstractNum>
-  <w:abstractNum w:abstractNumId="9" w15:restartNumberingAfterBreak="0">
+  <w:abstractNum w:abstractNumId="10" w15:restartNumberingAfterBreak="0">
     <w:nsid w:val="72C24117"/>
     <w:multiLevelType w:val="multilevel"/>
     <w:tmpl w:val="0809001F"/>
@@ -2710,19 +3281,19 @@
     </w:lvl>
   </w:abstractNum>
   <w:num w:numId="1" w16cid:durableId="292903334">
-    <w:abstractNumId w:val="6"/>
+    <w:abstractNumId w:val="7"/>
   </w:num>
   <w:num w:numId="2" w16cid:durableId="690765110">
     <w:abstractNumId w:val="1"/>
   </w:num>
   <w:num w:numId="3" w16cid:durableId="16464190">
-    <w:abstractNumId w:val="7"/>
+    <w:abstractNumId w:val="8"/>
   </w:num>
   <w:num w:numId="4" w16cid:durableId="2037002178">
-    <w:abstractNumId w:val="8"/>
+    <w:abstractNumId w:val="9"/>
   </w:num>
   <w:num w:numId="5" w16cid:durableId="1788159604">
-    <w:abstractNumId w:val="9"/>
+    <w:abstractNumId w:val="10"/>
   </w:num>
   <w:num w:numId="6" w16cid:durableId="906767019">
     <w:abstractNumId w:val="2"/>
@@ -2737,6 +3308,9 @@
     <w:abstractNumId w:val="3"/>
   </w:num>
   <w:num w:numId="10" w16cid:durableId="1335842131">
+    <w:abstractNumId w:val="6"/>
+  </w:num>
+  <w:num w:numId="11" w16cid:durableId="633295844">
     <w:abstractNumId w:val="5"/>
   </w:num>
 </w:numbering>
@@ -3140,6 +3714,7 @@
   <w:style w:type="paragraph" w:default="1" w:styleId="Normalny">
     <w:name w:val="Normal"/>
     <w:qFormat/>
+    <w:rsid w:val="0080558D"/>
   </w:style>
   <w:style w:type="paragraph" w:styleId="Nagwek1">
     <w:name w:val="heading 1"/>
@@ -3343,6 +3918,7 @@
   <w:style w:type="character" w:default="1" w:styleId="Domylnaczcionkaakapitu">
     <w:name w:val="Default Paragraph Font"/>
     <w:uiPriority w:val="1"/>
+    <w:semiHidden/>
     <w:unhideWhenUsed/>
   </w:style>
   <w:style w:type="table" w:default="1" w:styleId="Standardowy">
@@ -3656,8 +4232,8 @@
       <w:spacing w:val="5"/>
     </w:rPr>
   </w:style>
-  <w:style w:type="paragraph" w:customStyle="1" w:styleId="Heading1">
-    <w:name w:val="Heading 1"/>
+  <w:style w:type="paragraph" w:customStyle="1" w:styleId="Nagwek11">
+    <w:name w:val="Nagłówek 11"/>
     <w:basedOn w:val="Normalny"/>
     <w:rsid w:val="000C21C9"/>
     <w:pPr>
@@ -3666,8 +4242,8 @@
       </w:numPr>
     </w:pPr>
   </w:style>
-  <w:style w:type="paragraph" w:customStyle="1" w:styleId="Heading2">
-    <w:name w:val="Heading 2"/>
+  <w:style w:type="paragraph" w:customStyle="1" w:styleId="Nagwek21">
+    <w:name w:val="Nagłówek 21"/>
     <w:basedOn w:val="Normalny"/>
     <w:rsid w:val="000C21C9"/>
     <w:pPr>
@@ -3677,8 +4253,8 @@
       </w:numPr>
     </w:pPr>
   </w:style>
-  <w:style w:type="paragraph" w:customStyle="1" w:styleId="Heading3">
-    <w:name w:val="Heading 3"/>
+  <w:style w:type="paragraph" w:customStyle="1" w:styleId="Nagwek31">
+    <w:name w:val="Nagłówek 31"/>
     <w:basedOn w:val="Normalny"/>
     <w:rsid w:val="000C21C9"/>
     <w:pPr>
@@ -3688,8 +4264,8 @@
       </w:numPr>
     </w:pPr>
   </w:style>
-  <w:style w:type="paragraph" w:customStyle="1" w:styleId="Heading4">
-    <w:name w:val="Heading 4"/>
+  <w:style w:type="paragraph" w:customStyle="1" w:styleId="Nagwek41">
+    <w:name w:val="Nagłówek 41"/>
     <w:basedOn w:val="Normalny"/>
     <w:rsid w:val="000C21C9"/>
     <w:pPr>
@@ -3699,8 +4275,8 @@
       </w:numPr>
     </w:pPr>
   </w:style>
-  <w:style w:type="paragraph" w:customStyle="1" w:styleId="Heading5">
-    <w:name w:val="Heading 5"/>
+  <w:style w:type="paragraph" w:customStyle="1" w:styleId="Nagwek51">
+    <w:name w:val="Nagłówek 51"/>
     <w:basedOn w:val="Normalny"/>
     <w:rsid w:val="000C21C9"/>
     <w:pPr>
@@ -3710,8 +4286,8 @@
       </w:numPr>
     </w:pPr>
   </w:style>
-  <w:style w:type="paragraph" w:customStyle="1" w:styleId="Heading6">
-    <w:name w:val="Heading 6"/>
+  <w:style w:type="paragraph" w:customStyle="1" w:styleId="Nagwek61">
+    <w:name w:val="Nagłówek 61"/>
     <w:basedOn w:val="Normalny"/>
     <w:rsid w:val="000C21C9"/>
     <w:pPr>
@@ -3721,8 +4297,8 @@
       </w:numPr>
     </w:pPr>
   </w:style>
-  <w:style w:type="paragraph" w:customStyle="1" w:styleId="Heading7">
-    <w:name w:val="Heading 7"/>
+  <w:style w:type="paragraph" w:customStyle="1" w:styleId="Nagwek71">
+    <w:name w:val="Nagłówek 71"/>
     <w:basedOn w:val="Normalny"/>
     <w:rsid w:val="000C21C9"/>
     <w:pPr>
@@ -3732,8 +4308,8 @@
       </w:numPr>
     </w:pPr>
   </w:style>
-  <w:style w:type="paragraph" w:customStyle="1" w:styleId="Heading8">
-    <w:name w:val="Heading 8"/>
+  <w:style w:type="paragraph" w:customStyle="1" w:styleId="Nagwek81">
+    <w:name w:val="Nagłówek 81"/>
     <w:basedOn w:val="Normalny"/>
     <w:rsid w:val="000C21C9"/>
     <w:pPr>
@@ -3743,8 +4319,8 @@
       </w:numPr>
     </w:pPr>
   </w:style>
-  <w:style w:type="paragraph" w:customStyle="1" w:styleId="Heading9">
-    <w:name w:val="Heading 9"/>
+  <w:style w:type="paragraph" w:customStyle="1" w:styleId="Nagwek91">
+    <w:name w:val="Nagłówek 91"/>
     <w:basedOn w:val="Normalny"/>
     <w:rsid w:val="000C21C9"/>
     <w:pPr>

</xml_diff>

<commit_message>
Describe how cryptographic methods can be applied to secure e-commerce -done
</commit_message>
<xml_diff>
--- a/Assignment 0 - Report.docx
+++ b/Assignment 0 - Report.docx
@@ -235,16 +235,16 @@
         <w:rPr>
           <w:b/>
           <w:bCs/>
-          <w:sz w:val="24"/>
-          <w:szCs w:val="24"/>
-        </w:rPr>
-      </w:pPr>
-      <w:r>
-        <w:rPr>
-          <w:b/>
-          <w:bCs/>
-          <w:sz w:val="24"/>
-          <w:szCs w:val="24"/>
+          <w:sz w:val="28"/>
+          <w:szCs w:val="28"/>
+        </w:rPr>
+      </w:pPr>
+      <w:r>
+        <w:rPr>
+          <w:b/>
+          <w:bCs/>
+          <w:sz w:val="28"/>
+          <w:szCs w:val="28"/>
         </w:rPr>
         <w:t xml:space="preserve">Cryptographic System and their </w:t>
       </w:r>
@@ -252,8 +252,8 @@
         <w:rPr>
           <w:b/>
           <w:bCs/>
-          <w:sz w:val="24"/>
-          <w:szCs w:val="24"/>
+          <w:sz w:val="28"/>
+          <w:szCs w:val="28"/>
         </w:rPr>
         <w:t>I</w:t>
       </w:r>
@@ -261,8 +261,8 @@
         <w:rPr>
           <w:b/>
           <w:bCs/>
-          <w:sz w:val="24"/>
-          <w:szCs w:val="24"/>
+          <w:sz w:val="28"/>
+          <w:szCs w:val="28"/>
         </w:rPr>
         <w:t xml:space="preserve">mportance in </w:t>
       </w:r>
@@ -270,8 +270,8 @@
         <w:rPr>
           <w:b/>
           <w:bCs/>
-          <w:sz w:val="24"/>
-          <w:szCs w:val="24"/>
+          <w:sz w:val="28"/>
+          <w:szCs w:val="28"/>
         </w:rPr>
         <w:t>S</w:t>
       </w:r>
@@ -279,8 +279,8 @@
         <w:rPr>
           <w:b/>
           <w:bCs/>
-          <w:sz w:val="24"/>
-          <w:szCs w:val="24"/>
+          <w:sz w:val="28"/>
+          <w:szCs w:val="28"/>
         </w:rPr>
         <w:t xml:space="preserve">ecuring </w:t>
       </w:r>
@@ -288,8 +288,8 @@
         <w:rPr>
           <w:b/>
           <w:bCs/>
-          <w:sz w:val="24"/>
-          <w:szCs w:val="24"/>
+          <w:sz w:val="28"/>
+          <w:szCs w:val="28"/>
         </w:rPr>
         <w:t>D</w:t>
       </w:r>
@@ -297,17 +297,26 @@
         <w:rPr>
           <w:b/>
           <w:bCs/>
-          <w:sz w:val="24"/>
-          <w:szCs w:val="24"/>
-        </w:rPr>
-        <w:t xml:space="preserve">igital </w:t>
-      </w:r>
-      <w:r>
-        <w:rPr>
-          <w:b/>
-          <w:bCs/>
-          <w:sz w:val="24"/>
-          <w:szCs w:val="24"/>
+          <w:sz w:val="28"/>
+          <w:szCs w:val="28"/>
+        </w:rPr>
+        <w:t>igital</w:t>
+      </w:r>
+      <w:r>
+        <w:rPr>
+          <w:b/>
+          <w:bCs/>
+          <w:sz w:val="28"/>
+          <w:szCs w:val="28"/>
+        </w:rPr>
+        <w:t xml:space="preserve"> </w:t>
+      </w:r>
+      <w:r>
+        <w:rPr>
+          <w:b/>
+          <w:bCs/>
+          <w:sz w:val="28"/>
+          <w:szCs w:val="28"/>
         </w:rPr>
         <w:t>I</w:t>
       </w:r>
@@ -315,15 +324,14 @@
         <w:rPr>
           <w:b/>
           <w:bCs/>
-          <w:sz w:val="24"/>
-          <w:szCs w:val="24"/>
+          <w:sz w:val="28"/>
+          <w:szCs w:val="28"/>
         </w:rPr>
         <w:t>nformation.</w:t>
       </w:r>
     </w:p>
     <w:p>
       <w:pPr>
-        <w:ind w:firstLine="360"/>
         <w:rPr>
           <w:sz w:val="24"/>
           <w:szCs w:val="24"/>
@@ -583,6 +591,7 @@
           <w:sz w:val="24"/>
           <w:szCs w:val="24"/>
         </w:rPr>
+        <w:lastRenderedPageBreak/>
         <w:t>in database security</w:t>
       </w:r>
     </w:p>
@@ -603,7 +612,6 @@
           <w:sz w:val="24"/>
           <w:szCs w:val="24"/>
         </w:rPr>
-        <w:lastRenderedPageBreak/>
         <w:t>Wi-Fi (WPA2/WPA3)</w:t>
       </w:r>
     </w:p>
@@ -693,23 +701,7 @@
           <w:sz w:val="24"/>
           <w:szCs w:val="24"/>
         </w:rPr>
-        <w:t xml:space="preserve">use to encrypt, and only you have a </w:t>
-      </w:r>
-      <w:proofErr w:type="gramStart"/>
-      <w:r>
-        <w:rPr>
-          <w:sz w:val="24"/>
-          <w:szCs w:val="24"/>
-        </w:rPr>
-        <w:t>Private</w:t>
-      </w:r>
-      <w:proofErr w:type="gramEnd"/>
-      <w:r>
-        <w:rPr>
-          <w:sz w:val="24"/>
-          <w:szCs w:val="24"/>
-        </w:rPr>
-        <w:t xml:space="preserve"> key to decrypt. This way of encryption is applied e.g.:</w:t>
+        <w:t>use to encrypt, and only you have a Private key to decrypt. This way of encryption is applied e.g.:</w:t>
       </w:r>
     </w:p>
     <w:p>
@@ -803,85 +795,64 @@
           <w:sz w:val="24"/>
           <w:szCs w:val="24"/>
         </w:rPr>
-        <w:t xml:space="preserve">is a method </w:t>
-      </w:r>
-      <w:r>
-        <w:rPr>
-          <w:sz w:val="24"/>
-          <w:szCs w:val="24"/>
-        </w:rPr>
-        <w:t>for converting data values into uni</w:t>
-      </w:r>
-      <w:r>
-        <w:rPr>
-          <w:sz w:val="24"/>
-          <w:szCs w:val="24"/>
-        </w:rPr>
-        <w:t xml:space="preserve">que </w:t>
-      </w:r>
-      <w:r>
-        <w:rPr>
-          <w:sz w:val="24"/>
-          <w:szCs w:val="24"/>
-        </w:rPr>
-        <w:t>characters called hashes</w:t>
-      </w:r>
-      <w:r>
-        <w:rPr>
-          <w:sz w:val="24"/>
-          <w:szCs w:val="24"/>
-        </w:rPr>
-        <w:t xml:space="preserve">. </w:t>
-      </w:r>
-      <w:r>
-        <w:rPr>
-          <w:sz w:val="24"/>
-          <w:szCs w:val="24"/>
-        </w:rPr>
-        <w:t xml:space="preserve">Hashing is used to secure </w:t>
-      </w:r>
-      <w:r>
-        <w:rPr>
-          <w:sz w:val="24"/>
-          <w:szCs w:val="24"/>
-        </w:rPr>
-        <w:t>and quick access</w:t>
-      </w:r>
-      <w:r>
-        <w:rPr>
-          <w:sz w:val="24"/>
-          <w:szCs w:val="24"/>
-        </w:rPr>
-        <w:t xml:space="preserve">. </w:t>
-      </w:r>
-      <w:r>
-        <w:rPr>
-          <w:sz w:val="24"/>
-          <w:szCs w:val="24"/>
-        </w:rPr>
-        <w:t>Hashing can be use</w:t>
-      </w:r>
-      <w:r>
-        <w:rPr>
-          <w:sz w:val="24"/>
-          <w:szCs w:val="24"/>
-        </w:rPr>
-        <w:t xml:space="preserve"> for data security. </w:t>
-      </w:r>
-    </w:p>
-    <w:p>
-      <w:pPr>
-        <w:rPr>
-          <w:sz w:val="24"/>
-          <w:szCs w:val="24"/>
-        </w:rPr>
-      </w:pPr>
-      <w:r>
-        <w:rPr>
-          <w:sz w:val="24"/>
-          <w:szCs w:val="24"/>
-        </w:rPr>
-        <w:t>This way of encryption is applied e.g.:</w:t>
+        <w:t>is a method for converting data values into unique characters called hashes</w:t>
+      </w:r>
+      <w:r>
+        <w:rPr>
+          <w:sz w:val="24"/>
+          <w:szCs w:val="24"/>
+        </w:rPr>
+        <w:t>. Unlike encryption, it is a one-way process. Hashi</w:t>
+      </w:r>
+      <w:r>
+        <w:rPr>
+          <w:sz w:val="24"/>
+          <w:szCs w:val="24"/>
+        </w:rPr>
+        <w:t>ng is used for secure and quick access and is essential</w:t>
+      </w:r>
+      <w:r>
+        <w:rPr>
+          <w:sz w:val="24"/>
+          <w:szCs w:val="24"/>
+        </w:rPr>
+        <w:t xml:space="preserve"> for data integrity. </w:t>
+      </w:r>
+    </w:p>
+    <w:p>
+      <w:pPr>
+        <w:rPr>
+          <w:sz w:val="24"/>
+          <w:szCs w:val="24"/>
+        </w:rPr>
+      </w:pPr>
+      <w:r>
+        <w:rPr>
+          <w:sz w:val="24"/>
+          <w:szCs w:val="24"/>
+        </w:rPr>
+        <w:t>This cryptographic technique</w:t>
+      </w:r>
+      <w:r>
+        <w:rPr>
+          <w:sz w:val="24"/>
+          <w:szCs w:val="24"/>
+        </w:rPr>
+        <w:t xml:space="preserve"> </w:t>
+      </w:r>
+      <w:r>
+        <w:rPr>
+          <w:sz w:val="24"/>
+          <w:szCs w:val="24"/>
+        </w:rPr>
+        <w:t>is applied in</w:t>
+      </w:r>
+      <w:r>
+        <w:rPr>
+          <w:sz w:val="24"/>
+          <w:szCs w:val="24"/>
+        </w:rPr>
+        <w:t>:</w:t>
       </w:r>
     </w:p>
     <w:p>
@@ -940,17 +911,51 @@
     </w:p>
     <w:p>
       <w:pPr>
-        <w:rPr>
-          <w:sz w:val="24"/>
-          <w:szCs w:val="24"/>
-        </w:rPr>
-      </w:pPr>
-      <w:r>
-        <w:rPr>
-          <w:sz w:val="24"/>
-          <w:szCs w:val="24"/>
-        </w:rPr>
-        <w:t>A one</w:t>
+        <w:pStyle w:val="Akapitzlist"/>
+        <w:numPr>
+          <w:ilvl w:val="0"/>
+          <w:numId w:val="11"/>
+        </w:numPr>
+        <w:rPr>
+          <w:sz w:val="24"/>
+          <w:szCs w:val="24"/>
+        </w:rPr>
+      </w:pPr>
+      <w:r>
+        <w:rPr>
+          <w:sz w:val="24"/>
+          <w:szCs w:val="24"/>
+        </w:rPr>
+        <w:t>Integrity Verification</w:t>
+      </w:r>
+    </w:p>
+    <w:p>
+      <w:pPr>
+        <w:rPr>
+          <w:sz w:val="24"/>
+          <w:szCs w:val="24"/>
+        </w:rPr>
+      </w:pPr>
+      <w:r>
+        <w:rPr>
+          <w:sz w:val="24"/>
+          <w:szCs w:val="24"/>
+        </w:rPr>
+        <w:t>It acts</w:t>
+      </w:r>
+      <w:r>
+        <w:rPr>
+          <w:sz w:val="24"/>
+          <w:szCs w:val="24"/>
+        </w:rPr>
+        <w:t xml:space="preserve"> as </w:t>
+      </w:r>
+      <w:r>
+        <w:rPr>
+          <w:sz w:val="24"/>
+          <w:szCs w:val="24"/>
+        </w:rPr>
+        <w:t>a one</w:t>
       </w:r>
       <w:r>
         <w:rPr>
@@ -964,7 +969,21 @@
           <w:sz w:val="24"/>
           <w:szCs w:val="24"/>
         </w:rPr>
-        <w:t xml:space="preserve">string to variety integrity </w:t>
+        <w:t xml:space="preserve">string to </w:t>
+      </w:r>
+      <w:r>
+        <w:rPr>
+          <w:sz w:val="24"/>
+          <w:szCs w:val="24"/>
+        </w:rPr>
+        <w:t>verify</w:t>
+      </w:r>
+      <w:r>
+        <w:rPr>
+          <w:sz w:val="24"/>
+          <w:szCs w:val="24"/>
+        </w:rPr>
+        <w:t xml:space="preserve"> integrity </w:t>
       </w:r>
       <w:r>
         <w:rPr>
@@ -981,14 +1000,6 @@
           <w:szCs w:val="24"/>
         </w:rPr>
       </w:pPr>
-    </w:p>
-    <w:p>
-      <w:pPr>
-        <w:rPr>
-          <w:sz w:val="24"/>
-          <w:szCs w:val="24"/>
-        </w:rPr>
-      </w:pPr>
       <w:r>
         <w:rPr>
           <w:sz w:val="24"/>
@@ -1008,7 +1019,21 @@
           <w:sz w:val="24"/>
           <w:szCs w:val="24"/>
         </w:rPr>
-        <w:t xml:space="preserve"> communication, sending sensitive information, logging into banks, social media, connecting to volume of websites cryptographic systems are incredibly important. </w:t>
+        <w:t xml:space="preserve"> communication, sending sensitive information, log into banks, </w:t>
+      </w:r>
+      <w:r>
+        <w:rPr>
+          <w:sz w:val="24"/>
+          <w:szCs w:val="24"/>
+        </w:rPr>
+        <w:t xml:space="preserve">and </w:t>
+      </w:r>
+      <w:r>
+        <w:rPr>
+          <w:sz w:val="24"/>
+          <w:szCs w:val="24"/>
+        </w:rPr>
+        <w:t xml:space="preserve">social media, connecting to volume of websites cryptographic system are incredibly important. </w:t>
       </w:r>
     </w:p>
     <w:p>
@@ -1102,7 +1127,7 @@
           <w:szCs w:val="24"/>
         </w:rPr>
         <w:br/>
-        <w:t>Without cryptographic systems</w:t>
+        <w:t>Without cryptographic system</w:t>
       </w:r>
       <w:r>
         <w:rPr>
@@ -1171,31 +1196,7 @@
           <w:ilvl w:val="0"/>
           <w:numId w:val="0"/>
         </w:numPr>
-        <w:ind w:left="432" w:hanging="432"/>
-        <w:rPr>
-          <w:b/>
-          <w:bCs/>
-          <w:sz w:val="24"/>
-          <w:szCs w:val="24"/>
-        </w:rPr>
-      </w:pPr>
-      <w:r>
-        <w:rPr>
-          <w:b/>
-          <w:bCs/>
-          <w:sz w:val="24"/>
-          <w:szCs w:val="24"/>
-        </w:rPr>
-        <w:t>Application of Cryptographic Methods in Securing E-commerce Transactions, Customer Data, and Company Communications.</w:t>
-      </w:r>
-    </w:p>
-    <w:p>
-      <w:pPr>
-        <w:pStyle w:val="Nagwek11"/>
-        <w:numPr>
-          <w:ilvl w:val="2"/>
-          <w:numId w:val="6"/>
-        </w:numPr>
+        <w:ind w:left="1224"/>
         <w:rPr>
           <w:b/>
           <w:bCs/>
@@ -1215,51 +1216,404 @@
         <w:rPr>
           <w:b/>
           <w:bCs/>
-          <w:sz w:val="24"/>
-          <w:szCs w:val="24"/>
-        </w:rPr>
-      </w:pPr>
-      <w:r>
-        <w:rPr>
-          <w:b/>
-          <w:bCs/>
-          <w:sz w:val="24"/>
-          <w:szCs w:val="24"/>
-        </w:rPr>
-        <w:t>Three recommendations for Implementing Cryptographic System to Improve Security and Prevent Future Data Breaches.</w:t>
-      </w:r>
-    </w:p>
-    <w:p>
-      <w:pPr>
-        <w:pStyle w:val="Nagwek11"/>
-        <w:numPr>
-          <w:ilvl w:val="2"/>
-          <w:numId w:val="6"/>
-        </w:numPr>
-        <w:rPr>
-          <w:b/>
-          <w:bCs/>
-          <w:sz w:val="24"/>
-          <w:szCs w:val="24"/>
-        </w:rPr>
-      </w:pPr>
-      <w:r>
-        <w:rPr>
-          <w:b/>
-          <w:bCs/>
+          <w:sz w:val="28"/>
+          <w:szCs w:val="28"/>
+        </w:rPr>
+      </w:pPr>
+      <w:r>
+        <w:rPr>
+          <w:b/>
+          <w:bCs/>
+          <w:sz w:val="28"/>
+          <w:szCs w:val="28"/>
+        </w:rPr>
+        <w:lastRenderedPageBreak/>
+        <w:t>Application of Cryptographic Methods in Securing E-commerce Transactions, Customer Data, and Company Communications.</w:t>
+      </w:r>
+    </w:p>
+    <w:p>
+      <w:pPr>
+        <w:rPr>
+          <w:sz w:val="24"/>
+          <w:szCs w:val="24"/>
+        </w:rPr>
+      </w:pPr>
+      <w:r>
+        <w:rPr>
+          <w:sz w:val="24"/>
+          <w:szCs w:val="24"/>
+        </w:rPr>
+        <w:t>According to data collected by Capital One Shopping, in 2024 there were an estimated 791 billion global credit card transactions which results 2.17 billion transaction per day. [1]</w:t>
+      </w:r>
+    </w:p>
+    <w:p>
+      <w:pPr>
+        <w:rPr>
+          <w:sz w:val="24"/>
+          <w:szCs w:val="24"/>
+        </w:rPr>
+      </w:pPr>
+      <w:r>
+        <w:rPr>
+          <w:sz w:val="24"/>
+          <w:szCs w:val="24"/>
+        </w:rPr>
+        <w:t xml:space="preserve">It means companies, banks must store and manage millions of customer’s data. Additionally, companies must communicate </w:t>
+      </w:r>
+      <w:r>
+        <w:rPr>
+          <w:sz w:val="24"/>
+          <w:szCs w:val="24"/>
+        </w:rPr>
+        <w:t xml:space="preserve">with </w:t>
+      </w:r>
+      <w:r>
+        <w:rPr>
+          <w:sz w:val="24"/>
+          <w:szCs w:val="24"/>
+        </w:rPr>
+        <w:t xml:space="preserve">each other, and they must exchange sensitive information. </w:t>
+      </w:r>
+      <w:r>
+        <w:rPr>
           <w:sz w:val="24"/>
           <w:szCs w:val="24"/>
         </w:rPr>
         <w:br/>
-      </w:r>
-      <w:r>
-        <w:rPr>
-          <w:b/>
-          <w:bCs/>
+        <w:t>The confidentially, integrity, and availability (CIA triad) of information are essential to operation of all businesses.</w:t>
+      </w:r>
+    </w:p>
+    <w:p>
+      <w:pPr>
+        <w:rPr>
+          <w:sz w:val="24"/>
+          <w:szCs w:val="24"/>
+        </w:rPr>
+      </w:pPr>
+      <w:r>
+        <w:rPr>
+          <w:sz w:val="24"/>
+          <w:szCs w:val="24"/>
+        </w:rPr>
+        <w:t xml:space="preserve">The most important question is how to apply a </w:t>
+      </w:r>
+      <w:r>
+        <w:rPr>
+          <w:sz w:val="24"/>
+          <w:szCs w:val="24"/>
+        </w:rPr>
+        <w:t>cryptographic method</w:t>
+      </w:r>
+      <w:r>
+        <w:rPr>
+          <w:sz w:val="24"/>
+          <w:szCs w:val="24"/>
+        </w:rPr>
+        <w:t xml:space="preserve"> to secure all operations, transactions, and communication to keep sensitive data secured.</w:t>
+      </w:r>
+      <w:r>
+        <w:rPr>
           <w:sz w:val="24"/>
           <w:szCs w:val="24"/>
         </w:rPr>
         <w:br/>
+        <w:t xml:space="preserve">The first thing we must focus on is a communication over the network. All websites and applications must have a Transport Layer Security (TLS) certificate - commonly known as Secure Socket Layer (SSL) </w:t>
+      </w:r>
+      <w:r>
+        <w:rPr>
+          <w:sz w:val="24"/>
+          <w:szCs w:val="24"/>
+        </w:rPr>
+        <w:t>which</w:t>
+      </w:r>
+      <w:r>
+        <w:rPr>
+          <w:sz w:val="24"/>
+          <w:szCs w:val="24"/>
+        </w:rPr>
+        <w:t xml:space="preserve"> is outdated - installed on its origin server.  </w:t>
+      </w:r>
+    </w:p>
+    <w:p>
+      <w:pPr>
+        <w:rPr>
+          <w:sz w:val="24"/>
+          <w:szCs w:val="24"/>
+        </w:rPr>
+      </w:pPr>
+      <w:r>
+        <w:rPr>
+          <w:sz w:val="24"/>
+          <w:szCs w:val="24"/>
+        </w:rPr>
+        <w:t xml:space="preserve">TLS is a secured protocol to ensure privacy and data communication over the network by providing authentication, data integrity, and encryption. It ensures that all data cannot be read, intercepted, or modified. [2]. To make sure that transactions and communications on the internet are secured, digital signature must be used. </w:t>
+      </w:r>
+    </w:p>
+    <w:p>
+      <w:pPr>
+        <w:rPr>
+          <w:sz w:val="24"/>
+          <w:szCs w:val="24"/>
+        </w:rPr>
+      </w:pPr>
+      <w:r>
+        <w:rPr>
+          <w:sz w:val="24"/>
+          <w:szCs w:val="24"/>
+        </w:rPr>
+        <w:t xml:space="preserve">The digital signature uses Public Key and Private Key to ensure the authenticity of a digital message or document. </w:t>
+      </w:r>
+    </w:p>
+    <w:p>
+      <w:pPr>
+        <w:rPr>
+          <w:sz w:val="24"/>
+          <w:szCs w:val="24"/>
+        </w:rPr>
+      </w:pPr>
+      <w:r>
+        <w:rPr>
+          <w:sz w:val="24"/>
+          <w:szCs w:val="24"/>
+        </w:rPr>
+        <w:t>E-commerce stores data about their clients. All of customer data must be stored safely in the database. E-</w:t>
+      </w:r>
+      <w:r>
+        <w:rPr>
+          <w:sz w:val="24"/>
+          <w:szCs w:val="24"/>
+        </w:rPr>
+        <w:t xml:space="preserve"> </w:t>
+      </w:r>
+      <w:r>
+        <w:rPr>
+          <w:sz w:val="24"/>
+          <w:szCs w:val="24"/>
+        </w:rPr>
+        <w:t xml:space="preserve">commerce </w:t>
+      </w:r>
+      <w:r>
+        <w:rPr>
+          <w:sz w:val="24"/>
+          <w:szCs w:val="24"/>
+        </w:rPr>
+        <w:t xml:space="preserve">databases must protect customer passwords. The best way to protect password is cryptographic hashing with a unique salt for each user. </w:t>
+      </w:r>
+      <w:r>
+        <w:rPr>
+          <w:sz w:val="24"/>
+          <w:szCs w:val="24"/>
+        </w:rPr>
+        <w:br/>
+        <w:t xml:space="preserve">Payment details are highly sensitive data; it means that should be encrypted using symmetric algorithms before being stored. </w:t>
+      </w:r>
+    </w:p>
+    <w:p>
+      <w:pPr>
+        <w:rPr>
+          <w:sz w:val="24"/>
+          <w:szCs w:val="24"/>
+        </w:rPr>
+      </w:pPr>
+      <w:r>
+        <w:rPr>
+          <w:sz w:val="24"/>
+          <w:szCs w:val="24"/>
+        </w:rPr>
+        <w:t xml:space="preserve">Companies around the world must communicate with each other, or with their customers. It means they must send thousands of emails, SMS, or use apps such WhatsApp. </w:t>
+      </w:r>
+    </w:p>
+    <w:p>
+      <w:pPr>
+        <w:rPr>
+          <w:sz w:val="24"/>
+          <w:szCs w:val="24"/>
+        </w:rPr>
+      </w:pPr>
+      <w:r>
+        <w:rPr>
+          <w:sz w:val="24"/>
+          <w:szCs w:val="24"/>
+        </w:rPr>
+        <w:t xml:space="preserve">This is where end-to-end encryption (E2EE) comes in. E2EE transforms plain text to unreadable ciphertext by using cryptography. E2EE can use both encryptions: symmetric and asymmetric encryption.[3] </w:t>
+      </w:r>
+      <w:r>
+        <w:rPr>
+          <w:sz w:val="24"/>
+          <w:szCs w:val="24"/>
+        </w:rPr>
+        <w:br/>
+      </w:r>
+      <w:r>
+        <w:rPr>
+          <w:sz w:val="24"/>
+          <w:szCs w:val="24"/>
+        </w:rPr>
+        <w:br/>
+        <w:t xml:space="preserve">By applying cryptographic </w:t>
+      </w:r>
+      <w:r>
+        <w:rPr>
+          <w:sz w:val="24"/>
+          <w:szCs w:val="24"/>
+        </w:rPr>
+        <w:t>methods</w:t>
+      </w:r>
+      <w:r>
+        <w:rPr>
+          <w:sz w:val="24"/>
+          <w:szCs w:val="24"/>
+        </w:rPr>
+        <w:t xml:space="preserve"> e-commerses, customers, and companies can be sure that everything and everyone is secured. </w:t>
+      </w:r>
+      <w:r>
+        <w:rPr>
+          <w:sz w:val="24"/>
+          <w:szCs w:val="24"/>
+        </w:rPr>
+        <w:br/>
+      </w:r>
+    </w:p>
+    <w:p>
+      <w:pPr>
+        <w:pStyle w:val="Akapitzlist"/>
+        <w:numPr>
+          <w:ilvl w:val="0"/>
+          <w:numId w:val="12"/>
+        </w:numPr>
+        <w:rPr>
+          <w:sz w:val="24"/>
+          <w:szCs w:val="24"/>
+        </w:rPr>
+      </w:pPr>
+      <w:r>
+        <w:rPr>
+          <w:sz w:val="24"/>
+          <w:szCs w:val="24"/>
+        </w:rPr>
+        <w:t>Erica Sandberg</w:t>
+      </w:r>
+      <w:r>
+        <w:rPr>
+          <w:sz w:val="24"/>
+          <w:szCs w:val="24"/>
+        </w:rPr>
+        <w:t>.</w:t>
+      </w:r>
+      <w:r>
+        <w:rPr>
+          <w:sz w:val="24"/>
+          <w:szCs w:val="24"/>
+        </w:rPr>
+        <w:t xml:space="preserve">  “The Average Number of Credit Card Transactions Per Day &amp; Year”. CardsRates. Updated: June 19, 2025. Available:</w:t>
+      </w:r>
+      <w:r>
+        <w:rPr>
+          <w:sz w:val="24"/>
+          <w:szCs w:val="24"/>
+          <w:u w:val="single"/>
+        </w:rPr>
+        <w:t xml:space="preserve"> </w:t>
+      </w:r>
+      <w:hyperlink r:id="rId7" w:history="1">
+        <w:r>
+          <w:rPr>
+            <w:rStyle w:val="Hipercze"/>
+            <w:sz w:val="24"/>
+            <w:szCs w:val="24"/>
+            <w:u w:val="none"/>
+          </w:rPr>
+          <w:t>https://www.cardrates.com/advice/number-of-credit-card-transactions-per-</w:t>
+        </w:r>
+        <w:r>
+          <w:rPr>
+            <w:rStyle w:val="Hipercze"/>
+            <w:sz w:val="24"/>
+            <w:szCs w:val="24"/>
+            <w:u w:val="none"/>
+          </w:rPr>
+          <w:lastRenderedPageBreak/>
+          <w:t>day-year/#:~:text=Credit%20Card%20Transactions%20Globally,reach%20604.1%20billion%20in%202025.&amp;text=According%20to%20data%20collected%20by%20Capital%20One%20Shopping%2C%20there%20were,25%2C091%20per%20second</w:t>
+        </w:r>
+      </w:hyperlink>
+    </w:p>
+    <w:p>
+      <w:pPr>
+        <w:pStyle w:val="Akapitzlist"/>
+        <w:numPr>
+          <w:ilvl w:val="0"/>
+          <w:numId w:val="12"/>
+        </w:numPr>
+        <w:rPr>
+          <w:sz w:val="24"/>
+          <w:szCs w:val="24"/>
+        </w:rPr>
+      </w:pPr>
+      <w:r>
+        <w:rPr>
+          <w:sz w:val="24"/>
+          <w:szCs w:val="24"/>
+        </w:rPr>
+        <w:t>What is TLS (Transport Lyer Security)?. Cloudf</w:t>
+      </w:r>
+      <w:r>
+        <w:rPr>
+          <w:sz w:val="24"/>
+          <w:szCs w:val="24"/>
+        </w:rPr>
+        <w:t>l</w:t>
+      </w:r>
+      <w:r>
+        <w:rPr>
+          <w:sz w:val="24"/>
+          <w:szCs w:val="24"/>
+        </w:rPr>
+        <w:t>are.</w:t>
+      </w:r>
+      <w:r>
+        <w:rPr>
+          <w:sz w:val="24"/>
+          <w:szCs w:val="24"/>
+        </w:rPr>
+        <w:t xml:space="preserve"> </w:t>
+      </w:r>
+      <w:r>
+        <w:rPr>
+          <w:sz w:val="24"/>
+          <w:szCs w:val="24"/>
+        </w:rPr>
+        <w:t xml:space="preserve">Available: </w:t>
+      </w:r>
+      <w:hyperlink r:id="rId8" w:history="1">
+        <w:r>
+          <w:rPr>
+            <w:rStyle w:val="Hipercze"/>
+            <w:sz w:val="24"/>
+            <w:szCs w:val="24"/>
+            <w:u w:val="none"/>
+          </w:rPr>
+          <w:t>https://www.cloudflare.com/en-gb/learning/ssl/transport-layer-security-tls/</w:t>
+        </w:r>
+      </w:hyperlink>
+    </w:p>
+    <w:p>
+      <w:pPr>
+        <w:pStyle w:val="Akapitzlist"/>
+        <w:numPr>
+          <w:ilvl w:val="0"/>
+          <w:numId w:val="12"/>
+        </w:numPr>
+        <w:rPr>
+          <w:sz w:val="24"/>
+          <w:szCs w:val="24"/>
+        </w:rPr>
+      </w:pPr>
+      <w:r>
+        <w:rPr>
+          <w:sz w:val="24"/>
+          <w:szCs w:val="24"/>
+        </w:rPr>
+        <w:t>What is end-to-end encryption (E2EE). IBM. Available:</w:t>
       </w:r>
     </w:p>
     <w:p>
@@ -1270,6 +1624,119 @@
           <w:numId w:val="0"/>
         </w:numPr>
         <w:ind w:left="432" w:hanging="432"/>
+        <w:rPr>
+          <w:b/>
+          <w:bCs/>
+          <w:sz w:val="24"/>
+          <w:szCs w:val="24"/>
+        </w:rPr>
+      </w:pPr>
+      <w:r>
+        <w:rPr>
+          <w:sz w:val="24"/>
+          <w:szCs w:val="24"/>
+        </w:rPr>
+        <w:t>https://www.ibm.com/think/topics/end-to-end-encryption</w:t>
+      </w:r>
+      <w:r>
+        <w:rPr>
+          <w:sz w:val="24"/>
+          <w:szCs w:val="24"/>
+          <w:u w:val="single"/>
+        </w:rPr>
+        <w:br/>
+      </w:r>
+    </w:p>
+    <w:p>
+      <w:pPr>
+        <w:pStyle w:val="Nagwek11"/>
+        <w:numPr>
+          <w:ilvl w:val="0"/>
+          <w:numId w:val="0"/>
+        </w:numPr>
+        <w:ind w:left="432" w:hanging="432"/>
+        <w:rPr>
+          <w:b/>
+          <w:bCs/>
+          <w:sz w:val="24"/>
+          <w:szCs w:val="24"/>
+        </w:rPr>
+      </w:pPr>
+    </w:p>
+    <w:p>
+      <w:pPr>
+        <w:pStyle w:val="Nagwek11"/>
+        <w:numPr>
+          <w:ilvl w:val="0"/>
+          <w:numId w:val="0"/>
+        </w:numPr>
+        <w:ind w:left="432" w:hanging="432"/>
+        <w:rPr>
+          <w:b/>
+          <w:bCs/>
+          <w:sz w:val="24"/>
+          <w:szCs w:val="24"/>
+        </w:rPr>
+      </w:pPr>
+    </w:p>
+    <w:p>
+      <w:pPr>
+        <w:pStyle w:val="Nagwek11"/>
+        <w:numPr>
+          <w:ilvl w:val="0"/>
+          <w:numId w:val="0"/>
+        </w:numPr>
+        <w:ind w:left="432" w:hanging="432"/>
+        <w:rPr>
+          <w:b/>
+          <w:bCs/>
+          <w:sz w:val="24"/>
+          <w:szCs w:val="24"/>
+        </w:rPr>
+      </w:pPr>
+      <w:r>
+        <w:rPr>
+          <w:b/>
+          <w:bCs/>
+          <w:sz w:val="24"/>
+          <w:szCs w:val="24"/>
+        </w:rPr>
+        <w:t>Three recommendations for Implementing Cryptographic System to Improve Security and Prevent Future Data Breaches.</w:t>
+      </w:r>
+    </w:p>
+    <w:p>
+      <w:pPr>
+        <w:pStyle w:val="Nagwek11"/>
+        <w:numPr>
+          <w:ilvl w:val="0"/>
+          <w:numId w:val="0"/>
+        </w:numPr>
+        <w:ind w:left="1224"/>
+        <w:rPr>
+          <w:b/>
+          <w:bCs/>
+          <w:sz w:val="24"/>
+          <w:szCs w:val="24"/>
+        </w:rPr>
+      </w:pPr>
+      <w:r>
+        <w:rPr>
+          <w:b/>
+          <w:bCs/>
+          <w:sz w:val="24"/>
+          <w:szCs w:val="24"/>
+        </w:rPr>
+        <w:br/>
+      </w:r>
+    </w:p>
+    <w:p>
+      <w:pPr>
+        <w:pStyle w:val="Nagwek11"/>
+        <w:numPr>
+          <w:ilvl w:val="0"/>
+          <w:numId w:val="0"/>
+        </w:numPr>
+        <w:ind w:left="432" w:hanging="432"/>
         <w:jc w:val="center"/>
         <w:rPr>
           <w:b/>
@@ -1617,6 +2084,7 @@
           <w:sz w:val="24"/>
           <w:szCs w:val="24"/>
         </w:rPr>
+        <w:lastRenderedPageBreak/>
         <w:t>Deleting</w:t>
       </w:r>
     </w:p>
@@ -2131,7 +2599,7 @@
       </w:r>
     </w:p>
     <w:sectPr>
-      <w:footerReference w:type="default" r:id="rId7"/>
+      <w:footerReference w:type="default" r:id="rId9"/>
       <w:pgSz w:w="11906" w:h="16838"/>
       <w:pgMar w:top="1440" w:right="1440" w:bottom="1440" w:left="1440" w:header="708" w:footer="708" w:gutter="0"/>
       <w:cols w:space="708"/>
@@ -3195,6 +3663,95 @@
     </w:lvl>
   </w:abstractNum>
   <w:abstractNum w:abstractNumId="10" w15:restartNumberingAfterBreak="0">
+    <w:nsid w:val="5AF40BAC"/>
+    <w:multiLevelType w:val="hybridMultilevel"/>
+    <w:tmpl w:val="E7C6440A"/>
+    <w:lvl w:ilvl="0" w:tplc="C368FE38">
+      <w:start w:val="1"/>
+      <w:numFmt w:val="decimal"/>
+      <w:lvlText w:val="[%1]"/>
+      <w:lvlJc w:val="left"/>
+      <w:pPr>
+        <w:ind w:left="720" w:hanging="360"/>
+      </w:pPr>
+      <w:rPr>
+        <w:rFonts w:hint="default"/>
+      </w:rPr>
+    </w:lvl>
+    <w:lvl w:ilvl="1" w:tplc="08090019" w:tentative="1">
+      <w:start w:val="1"/>
+      <w:numFmt w:val="lowerLetter"/>
+      <w:lvlText w:val="%2."/>
+      <w:lvlJc w:val="left"/>
+      <w:pPr>
+        <w:ind w:left="1440" w:hanging="360"/>
+      </w:pPr>
+    </w:lvl>
+    <w:lvl w:ilvl="2" w:tplc="0809001B" w:tentative="1">
+      <w:start w:val="1"/>
+      <w:numFmt w:val="lowerRoman"/>
+      <w:lvlText w:val="%3."/>
+      <w:lvlJc w:val="right"/>
+      <w:pPr>
+        <w:ind w:left="2160" w:hanging="180"/>
+      </w:pPr>
+    </w:lvl>
+    <w:lvl w:ilvl="3" w:tplc="0809000F" w:tentative="1">
+      <w:start w:val="1"/>
+      <w:numFmt w:val="decimal"/>
+      <w:lvlText w:val="%4."/>
+      <w:lvlJc w:val="left"/>
+      <w:pPr>
+        <w:ind w:left="2880" w:hanging="360"/>
+      </w:pPr>
+    </w:lvl>
+    <w:lvl w:ilvl="4" w:tplc="08090019" w:tentative="1">
+      <w:start w:val="1"/>
+      <w:numFmt w:val="lowerLetter"/>
+      <w:lvlText w:val="%5."/>
+      <w:lvlJc w:val="left"/>
+      <w:pPr>
+        <w:ind w:left="3600" w:hanging="360"/>
+      </w:pPr>
+    </w:lvl>
+    <w:lvl w:ilvl="5" w:tplc="0809001B" w:tentative="1">
+      <w:start w:val="1"/>
+      <w:numFmt w:val="lowerRoman"/>
+      <w:lvlText w:val="%6."/>
+      <w:lvlJc w:val="right"/>
+      <w:pPr>
+        <w:ind w:left="4320" w:hanging="180"/>
+      </w:pPr>
+    </w:lvl>
+    <w:lvl w:ilvl="6" w:tplc="0809000F" w:tentative="1">
+      <w:start w:val="1"/>
+      <w:numFmt w:val="decimal"/>
+      <w:lvlText w:val="%7."/>
+      <w:lvlJc w:val="left"/>
+      <w:pPr>
+        <w:ind w:left="5040" w:hanging="360"/>
+      </w:pPr>
+    </w:lvl>
+    <w:lvl w:ilvl="7" w:tplc="08090019" w:tentative="1">
+      <w:start w:val="1"/>
+      <w:numFmt w:val="lowerLetter"/>
+      <w:lvlText w:val="%8."/>
+      <w:lvlJc w:val="left"/>
+      <w:pPr>
+        <w:ind w:left="5760" w:hanging="360"/>
+      </w:pPr>
+    </w:lvl>
+    <w:lvl w:ilvl="8" w:tplc="0809001B" w:tentative="1">
+      <w:start w:val="1"/>
+      <w:numFmt w:val="lowerRoman"/>
+      <w:lvlText w:val="%9."/>
+      <w:lvlJc w:val="right"/>
+      <w:pPr>
+        <w:ind w:left="6480" w:hanging="180"/>
+      </w:pPr>
+    </w:lvl>
+  </w:abstractNum>
+  <w:abstractNum w:abstractNumId="11" w15:restartNumberingAfterBreak="0">
     <w:nsid w:val="72C24117"/>
     <w:multiLevelType w:val="multilevel"/>
     <w:tmpl w:val="0809001F"/>
@@ -3293,7 +3850,7 @@
     <w:abstractNumId w:val="9"/>
   </w:num>
   <w:num w:numId="5" w16cid:durableId="1788159604">
-    <w:abstractNumId w:val="10"/>
+    <w:abstractNumId w:val="11"/>
   </w:num>
   <w:num w:numId="6" w16cid:durableId="906767019">
     <w:abstractNumId w:val="2"/>
@@ -3312,6 +3869,9 @@
   </w:num>
   <w:num w:numId="11" w16cid:durableId="633295844">
     <w:abstractNumId w:val="5"/>
+  </w:num>
+  <w:num w:numId="12" w16cid:durableId="756898670">
+    <w:abstractNumId w:val="10"/>
   </w:num>
 </w:numbering>
 </file>
@@ -3918,7 +4478,6 @@
   <w:style w:type="character" w:default="1" w:styleId="Domylnaczcionkaakapitu">
     <w:name w:val="Default Paragraph Font"/>
     <w:uiPriority w:val="1"/>
-    <w:semiHidden/>
     <w:unhideWhenUsed/>
   </w:style>
   <w:style w:type="table" w:default="1" w:styleId="Standardowy">
@@ -4412,6 +4971,17 @@
       <w:szCs w:val="20"/>
     </w:rPr>
   </w:style>
+  <w:style w:type="character" w:styleId="Hipercze">
+    <w:name w:val="Hyperlink"/>
+    <w:basedOn w:val="Domylnaczcionkaakapitu"/>
+    <w:uiPriority w:val="99"/>
+    <w:unhideWhenUsed/>
+    <w:rsid w:val="00B6311C"/>
+    <w:rPr>
+      <w:color w:val="467886" w:themeColor="hyperlink"/>
+      <w:u w:val="single"/>
+    </w:rPr>
+  </w:style>
 </w:styles>
 </file>
 

</xml_diff>

<commit_message>
Provide three specific recommendations on how the company can implement
</commit_message>
<xml_diff>
--- a/Assignment 0 - Report.docx
+++ b/Assignment 0 - Report.docx
@@ -226,12 +226,1053 @@
     </w:p>
     <w:p>
       <w:pPr>
+        <w:rPr>
+          <w:b/>
+          <w:bCs/>
+          <w:sz w:val="28"/>
+          <w:szCs w:val="28"/>
+        </w:rPr>
+      </w:pPr>
+      <w:r>
+        <w:rPr>
+          <w:b/>
+          <w:bCs/>
+          <w:sz w:val="28"/>
+          <w:szCs w:val="28"/>
+        </w:rPr>
+        <w:t xml:space="preserve">Cryptographic System and their </w:t>
+      </w:r>
+      <w:r>
+        <w:rPr>
+          <w:b/>
+          <w:bCs/>
+          <w:sz w:val="28"/>
+          <w:szCs w:val="28"/>
+        </w:rPr>
+        <w:t>I</w:t>
+      </w:r>
+      <w:r>
+        <w:rPr>
+          <w:b/>
+          <w:bCs/>
+          <w:sz w:val="28"/>
+          <w:szCs w:val="28"/>
+        </w:rPr>
+        <w:t xml:space="preserve">mportance in </w:t>
+      </w:r>
+      <w:r>
+        <w:rPr>
+          <w:b/>
+          <w:bCs/>
+          <w:sz w:val="28"/>
+          <w:szCs w:val="28"/>
+        </w:rPr>
+        <w:t>S</w:t>
+      </w:r>
+      <w:r>
+        <w:rPr>
+          <w:b/>
+          <w:bCs/>
+          <w:sz w:val="28"/>
+          <w:szCs w:val="28"/>
+        </w:rPr>
+        <w:t xml:space="preserve">ecuring </w:t>
+      </w:r>
+      <w:r>
+        <w:rPr>
+          <w:b/>
+          <w:bCs/>
+          <w:sz w:val="28"/>
+          <w:szCs w:val="28"/>
+        </w:rPr>
+        <w:t>D</w:t>
+      </w:r>
+      <w:r>
+        <w:rPr>
+          <w:b/>
+          <w:bCs/>
+          <w:sz w:val="28"/>
+          <w:szCs w:val="28"/>
+        </w:rPr>
+        <w:t>igital</w:t>
+      </w:r>
+      <w:r>
+        <w:rPr>
+          <w:b/>
+          <w:bCs/>
+          <w:sz w:val="28"/>
+          <w:szCs w:val="28"/>
+        </w:rPr>
+        <w:t xml:space="preserve"> </w:t>
+      </w:r>
+      <w:r>
+        <w:rPr>
+          <w:b/>
+          <w:bCs/>
+          <w:sz w:val="28"/>
+          <w:szCs w:val="28"/>
+        </w:rPr>
+        <w:t>I</w:t>
+      </w:r>
+      <w:r>
+        <w:rPr>
+          <w:b/>
+          <w:bCs/>
+          <w:sz w:val="28"/>
+          <w:szCs w:val="28"/>
+        </w:rPr>
+        <w:t>nformation.</w:t>
+      </w:r>
+    </w:p>
+    <w:p>
+      <w:pPr>
+        <w:rPr>
+          <w:sz w:val="24"/>
+          <w:szCs w:val="24"/>
+        </w:rPr>
+      </w:pPr>
+      <w:r>
+        <w:rPr>
+          <w:i/>
+          <w:iCs/>
+          <w:sz w:val="24"/>
+          <w:szCs w:val="24"/>
+        </w:rPr>
+        <w:t>Cryptographic systems</w:t>
+      </w:r>
+      <w:r>
+        <w:rPr>
+          <w:sz w:val="24"/>
+          <w:szCs w:val="24"/>
+        </w:rPr>
+        <w:t xml:space="preserve"> are fundamental to the modern digital world, </w:t>
+      </w:r>
+      <w:r>
+        <w:rPr>
+          <w:sz w:val="24"/>
+          <w:szCs w:val="24"/>
+        </w:rPr>
+        <w:t xml:space="preserve">however </w:t>
+      </w:r>
+      <w:r>
+        <w:rPr>
+          <w:sz w:val="24"/>
+          <w:szCs w:val="24"/>
+        </w:rPr>
+        <w:t>when</w:t>
+      </w:r>
+      <w:r>
+        <w:rPr>
+          <w:sz w:val="24"/>
+          <w:szCs w:val="24"/>
+        </w:rPr>
+        <w:t xml:space="preserve"> </w:t>
+      </w:r>
+      <w:r>
+        <w:rPr>
+          <w:sz w:val="24"/>
+          <w:szCs w:val="24"/>
+        </w:rPr>
+        <w:t xml:space="preserve">explaining what cryptographic systems are, it is necessary to briefly explain what cryptography itself is. </w:t>
+      </w:r>
+      <w:r>
+        <w:rPr>
+          <w:sz w:val="24"/>
+          <w:szCs w:val="24"/>
+        </w:rPr>
+        <w:br/>
+        <w:t xml:space="preserve">Briefly, </w:t>
+      </w:r>
+      <w:r>
+        <w:rPr>
+          <w:i/>
+          <w:iCs/>
+          <w:sz w:val="24"/>
+          <w:szCs w:val="24"/>
+        </w:rPr>
+        <w:t>cryptography</w:t>
+      </w:r>
+      <w:r>
+        <w:rPr>
+          <w:sz w:val="24"/>
+          <w:szCs w:val="24"/>
+        </w:rPr>
+        <w:t xml:space="preserve"> is a technique of encrypting information (messages, passwords, transactions etc</w:t>
+      </w:r>
+      <w:r>
+        <w:rPr>
+          <w:sz w:val="24"/>
+          <w:szCs w:val="24"/>
+        </w:rPr>
+        <w:t>.</w:t>
+      </w:r>
+      <w:r>
+        <w:rPr>
+          <w:sz w:val="24"/>
+          <w:szCs w:val="24"/>
+        </w:rPr>
+        <w:t>) through cryptographic algorithms.  It converts plain text into ciphertext.</w:t>
+      </w:r>
+    </w:p>
+    <w:p>
+      <w:pPr>
+        <w:rPr>
+          <w:sz w:val="24"/>
+          <w:szCs w:val="24"/>
+        </w:rPr>
+      </w:pPr>
+      <w:r>
+        <w:rPr>
+          <w:sz w:val="24"/>
+          <w:szCs w:val="24"/>
+        </w:rPr>
+        <w:t xml:space="preserve">The modern world uses cryptographic systems to protect users around the world. Cryptographic systems are methods where information is disguised. It means that only </w:t>
+      </w:r>
+      <w:r>
+        <w:rPr>
+          <w:sz w:val="24"/>
+          <w:szCs w:val="24"/>
+        </w:rPr>
+        <w:t xml:space="preserve">the </w:t>
+      </w:r>
+      <w:r>
+        <w:rPr>
+          <w:sz w:val="24"/>
+          <w:szCs w:val="24"/>
+        </w:rPr>
+        <w:t xml:space="preserve">person with the specific key can read it. </w:t>
+      </w:r>
+    </w:p>
+    <w:p>
+      <w:pPr>
+        <w:rPr>
+          <w:sz w:val="24"/>
+          <w:szCs w:val="24"/>
+        </w:rPr>
+      </w:pPr>
+      <w:r>
+        <w:rPr>
+          <w:sz w:val="24"/>
+          <w:szCs w:val="24"/>
+        </w:rPr>
+        <w:t xml:space="preserve">Cryptographic systems are used everywhere around the world. Without </w:t>
+      </w:r>
+      <w:r>
+        <w:rPr>
+          <w:sz w:val="24"/>
+          <w:szCs w:val="24"/>
+        </w:rPr>
+        <w:t>them</w:t>
+      </w:r>
+      <w:r>
+        <w:rPr>
+          <w:sz w:val="24"/>
+          <w:szCs w:val="24"/>
+        </w:rPr>
+        <w:t xml:space="preserve">, the security and functionality of the entire digital world would be compromised.  </w:t>
+      </w:r>
+    </w:p>
+    <w:p>
+      <w:pPr>
+        <w:rPr>
+          <w:sz w:val="24"/>
+          <w:szCs w:val="24"/>
+        </w:rPr>
+      </w:pPr>
+      <w:r>
+        <w:rPr>
+          <w:sz w:val="24"/>
+          <w:szCs w:val="24"/>
+        </w:rPr>
+        <w:t xml:space="preserve">There are </w:t>
+      </w:r>
+      <w:r>
+        <w:rPr>
+          <w:sz w:val="24"/>
+          <w:szCs w:val="24"/>
+        </w:rPr>
+        <w:t>two</w:t>
+      </w:r>
+      <w:r>
+        <w:rPr>
+          <w:sz w:val="24"/>
+          <w:szCs w:val="24"/>
+        </w:rPr>
+        <w:t xml:space="preserve"> primary types of cryptography which are used in the </w:t>
+      </w:r>
+      <w:r>
+        <w:rPr>
+          <w:sz w:val="24"/>
+          <w:szCs w:val="24"/>
+        </w:rPr>
+        <w:t>today</w:t>
+      </w:r>
+      <w:r>
+        <w:rPr>
+          <w:sz w:val="24"/>
+          <w:szCs w:val="24"/>
+        </w:rPr>
+        <w:t>’s</w:t>
+      </w:r>
+      <w:r>
+        <w:rPr>
+          <w:sz w:val="24"/>
+          <w:szCs w:val="24"/>
+        </w:rPr>
+        <w:t xml:space="preserve"> digital world. The first one is Symmetric Encryption and second is Asymmetric Encryption</w:t>
+      </w:r>
+      <w:r>
+        <w:rPr>
+          <w:sz w:val="24"/>
+          <w:szCs w:val="24"/>
+        </w:rPr>
+        <w:t>.</w:t>
+      </w:r>
+    </w:p>
+    <w:p>
+      <w:pPr>
+        <w:rPr>
+          <w:sz w:val="24"/>
+          <w:szCs w:val="24"/>
+        </w:rPr>
+      </w:pPr>
+      <w:r>
+        <w:rPr>
+          <w:sz w:val="24"/>
+          <w:szCs w:val="24"/>
+        </w:rPr>
+        <w:t>Also,</w:t>
+      </w:r>
+      <w:r>
+        <w:rPr>
+          <w:sz w:val="24"/>
+          <w:szCs w:val="24"/>
+        </w:rPr>
+        <w:t xml:space="preserve"> </w:t>
+      </w:r>
+      <w:r>
+        <w:rPr>
+          <w:sz w:val="24"/>
+          <w:szCs w:val="24"/>
+        </w:rPr>
+        <w:t xml:space="preserve">there is hashing which is </w:t>
+      </w:r>
+      <w:r>
+        <w:rPr>
+          <w:sz w:val="24"/>
+          <w:szCs w:val="24"/>
+        </w:rPr>
+        <w:t>digital fingerprint.</w:t>
+      </w:r>
+    </w:p>
+    <w:p>
+      <w:pPr>
+        <w:rPr>
+          <w:sz w:val="24"/>
+          <w:szCs w:val="24"/>
+        </w:rPr>
+      </w:pPr>
+      <w:r>
+        <w:rPr>
+          <w:i/>
+          <w:iCs/>
+          <w:sz w:val="24"/>
+          <w:szCs w:val="24"/>
+        </w:rPr>
+        <w:t>Symmetric Encryption</w:t>
+      </w:r>
+      <w:r>
+        <w:rPr>
+          <w:sz w:val="24"/>
+          <w:szCs w:val="24"/>
+        </w:rPr>
+        <w:t xml:space="preserve"> is the most common where a volume of data must be encrypted. It is the fastest and most efficient way and can effortlessly encrypt gigabytes of data. This way of encryption is applied e.g.:</w:t>
+      </w:r>
+    </w:p>
+    <w:p>
+      <w:pPr>
+        <w:pStyle w:val="Akapitzlist"/>
+        <w:numPr>
+          <w:ilvl w:val="0"/>
+          <w:numId w:val="9"/>
+        </w:numPr>
+        <w:rPr>
+          <w:sz w:val="24"/>
+          <w:szCs w:val="24"/>
+        </w:rPr>
+      </w:pPr>
+      <w:r>
+        <w:rPr>
+          <w:sz w:val="24"/>
+          <w:szCs w:val="24"/>
+        </w:rPr>
+        <w:lastRenderedPageBreak/>
+        <w:t>in database security</w:t>
+      </w:r>
+    </w:p>
+    <w:p>
+      <w:pPr>
+        <w:pStyle w:val="Akapitzlist"/>
+        <w:numPr>
+          <w:ilvl w:val="0"/>
+          <w:numId w:val="9"/>
+        </w:numPr>
+        <w:rPr>
+          <w:sz w:val="24"/>
+          <w:szCs w:val="24"/>
+        </w:rPr>
+      </w:pPr>
+      <w:r>
+        <w:rPr>
+          <w:sz w:val="24"/>
+          <w:szCs w:val="24"/>
+        </w:rPr>
+        <w:t>Wi-Fi (WPA2/WPA3)</w:t>
+      </w:r>
+    </w:p>
+    <w:p>
+      <w:pPr>
+        <w:rPr>
+          <w:sz w:val="24"/>
+          <w:szCs w:val="24"/>
+        </w:rPr>
+      </w:pPr>
+      <w:r>
+        <w:rPr>
+          <w:sz w:val="24"/>
+          <w:szCs w:val="24"/>
+        </w:rPr>
+        <w:t xml:space="preserve">It is fast and </w:t>
+      </w:r>
+      <w:r>
+        <w:rPr>
+          <w:sz w:val="24"/>
+          <w:szCs w:val="24"/>
+        </w:rPr>
+        <w:t xml:space="preserve">most </w:t>
+      </w:r>
+      <w:r>
+        <w:rPr>
+          <w:sz w:val="24"/>
+          <w:szCs w:val="24"/>
+        </w:rPr>
+        <w:t>efficient because it uses the same key to both encrypt and decrypt but require</w:t>
+      </w:r>
+      <w:r>
+        <w:rPr>
+          <w:sz w:val="24"/>
+          <w:szCs w:val="24"/>
+        </w:rPr>
+        <w:t>s</w:t>
+      </w:r>
+      <w:r>
+        <w:rPr>
+          <w:sz w:val="24"/>
+          <w:szCs w:val="24"/>
+        </w:rPr>
+        <w:t xml:space="preserve"> a secure way to share a key</w:t>
+      </w:r>
+    </w:p>
+    <w:p>
+      <w:pPr>
+        <w:rPr>
+          <w:sz w:val="24"/>
+          <w:szCs w:val="24"/>
+        </w:rPr>
+      </w:pPr>
+      <w:r>
+        <w:rPr>
+          <w:i/>
+          <w:iCs/>
+          <w:sz w:val="24"/>
+          <w:szCs w:val="24"/>
+        </w:rPr>
+        <w:t>Asymmetric Encryption</w:t>
+      </w:r>
+      <w:r>
+        <w:rPr>
+          <w:sz w:val="24"/>
+          <w:szCs w:val="24"/>
+        </w:rPr>
+        <w:t xml:space="preserve"> is the most common in terms of establishing trust. This method uses two keys. Public key for encryption and Private key for decryption. </w:t>
+      </w:r>
+      <w:r>
+        <w:rPr>
+          <w:sz w:val="24"/>
+          <w:szCs w:val="24"/>
+        </w:rPr>
+        <w:br/>
+        <w:t xml:space="preserve">Public key anyone </w:t>
+      </w:r>
+      <w:r>
+        <w:rPr>
+          <w:sz w:val="24"/>
+          <w:szCs w:val="24"/>
+        </w:rPr>
+        <w:t xml:space="preserve">can </w:t>
+      </w:r>
+      <w:r>
+        <w:rPr>
+          <w:sz w:val="24"/>
+          <w:szCs w:val="24"/>
+        </w:rPr>
+        <w:t xml:space="preserve">use to encrypt, and only you have a </w:t>
+      </w:r>
+      <w:proofErr w:type="gramStart"/>
+      <w:r>
+        <w:rPr>
+          <w:sz w:val="24"/>
+          <w:szCs w:val="24"/>
+        </w:rPr>
+        <w:t>Private</w:t>
+      </w:r>
+      <w:proofErr w:type="gramEnd"/>
+      <w:r>
+        <w:rPr>
+          <w:sz w:val="24"/>
+          <w:szCs w:val="24"/>
+        </w:rPr>
+        <w:t xml:space="preserve"> key to decrypt. This way of encryption is applied e.g.:</w:t>
+      </w:r>
+    </w:p>
+    <w:p>
+      <w:pPr>
+        <w:pStyle w:val="Akapitzlist"/>
+        <w:numPr>
+          <w:ilvl w:val="0"/>
+          <w:numId w:val="10"/>
+        </w:numPr>
+        <w:rPr>
+          <w:sz w:val="24"/>
+          <w:szCs w:val="24"/>
+        </w:rPr>
+      </w:pPr>
+      <w:r>
+        <w:rPr>
+          <w:sz w:val="24"/>
+          <w:szCs w:val="24"/>
+        </w:rPr>
+        <w:t>Cryptocurrency</w:t>
+      </w:r>
+    </w:p>
+    <w:p>
+      <w:pPr>
+        <w:pStyle w:val="Akapitzlist"/>
+        <w:numPr>
+          <w:ilvl w:val="0"/>
+          <w:numId w:val="10"/>
+        </w:numPr>
+        <w:rPr>
+          <w:sz w:val="24"/>
+          <w:szCs w:val="24"/>
+        </w:rPr>
+      </w:pPr>
+      <w:r>
+        <w:rPr>
+          <w:sz w:val="24"/>
+          <w:szCs w:val="24"/>
+        </w:rPr>
+        <w:t>SSL/TLS – at the beginning of connection</w:t>
+      </w:r>
+    </w:p>
+    <w:p>
+      <w:pPr>
+        <w:rPr>
+          <w:sz w:val="24"/>
+          <w:szCs w:val="24"/>
+        </w:rPr>
+      </w:pPr>
+      <w:r>
+        <w:rPr>
+          <w:sz w:val="24"/>
+          <w:szCs w:val="24"/>
+        </w:rPr>
+        <w:t xml:space="preserve">It enables secure online transactions, protect sensitive data which </w:t>
+      </w:r>
+      <w:r>
+        <w:rPr>
+          <w:sz w:val="24"/>
+          <w:szCs w:val="24"/>
+        </w:rPr>
+        <w:t>is</w:t>
+      </w:r>
+      <w:r>
+        <w:rPr>
+          <w:sz w:val="24"/>
+          <w:szCs w:val="24"/>
+        </w:rPr>
+        <w:t xml:space="preserve"> stored in databases (such as passwords, credit or debit cards’ pins).</w:t>
+      </w:r>
+    </w:p>
+    <w:p>
+      <w:pPr>
+        <w:rPr>
+          <w:sz w:val="24"/>
+          <w:szCs w:val="24"/>
+        </w:rPr>
+      </w:pPr>
+    </w:p>
+    <w:p>
+      <w:pPr>
+        <w:rPr>
+          <w:sz w:val="24"/>
+          <w:szCs w:val="24"/>
+        </w:rPr>
+      </w:pPr>
+      <w:r>
+        <w:rPr>
+          <w:i/>
+          <w:iCs/>
+          <w:sz w:val="24"/>
+          <w:szCs w:val="24"/>
+        </w:rPr>
+        <w:t>Hashing</w:t>
+      </w:r>
+      <w:r>
+        <w:rPr>
+          <w:sz w:val="24"/>
+          <w:szCs w:val="24"/>
+        </w:rPr>
+        <w:t xml:space="preserve"> </w:t>
+      </w:r>
+      <w:r>
+        <w:rPr>
+          <w:sz w:val="24"/>
+          <w:szCs w:val="24"/>
+        </w:rPr>
+        <w:t>is a method for converting data values into unique characters called hashes</w:t>
+      </w:r>
+      <w:r>
+        <w:rPr>
+          <w:sz w:val="24"/>
+          <w:szCs w:val="24"/>
+        </w:rPr>
+        <w:t>. Unlike encryption, it is a one-way process. Hashi</w:t>
+      </w:r>
+      <w:r>
+        <w:rPr>
+          <w:sz w:val="24"/>
+          <w:szCs w:val="24"/>
+        </w:rPr>
+        <w:t>ng is used for secure and quick access and is essential</w:t>
+      </w:r>
+      <w:r>
+        <w:rPr>
+          <w:sz w:val="24"/>
+          <w:szCs w:val="24"/>
+        </w:rPr>
+        <w:t xml:space="preserve"> for data integrity. </w:t>
+      </w:r>
+    </w:p>
+    <w:p>
+      <w:pPr>
+        <w:rPr>
+          <w:sz w:val="24"/>
+          <w:szCs w:val="24"/>
+        </w:rPr>
+      </w:pPr>
+      <w:r>
+        <w:rPr>
+          <w:sz w:val="24"/>
+          <w:szCs w:val="24"/>
+        </w:rPr>
+        <w:t>This cryptographic technique</w:t>
+      </w:r>
+      <w:r>
+        <w:rPr>
+          <w:sz w:val="24"/>
+          <w:szCs w:val="24"/>
+        </w:rPr>
+        <w:t xml:space="preserve"> </w:t>
+      </w:r>
+      <w:r>
+        <w:rPr>
+          <w:sz w:val="24"/>
+          <w:szCs w:val="24"/>
+        </w:rPr>
+        <w:t>is applied in</w:t>
+      </w:r>
+      <w:r>
+        <w:rPr>
+          <w:sz w:val="24"/>
+          <w:szCs w:val="24"/>
+        </w:rPr>
+        <w:t>:</w:t>
+      </w:r>
+    </w:p>
+    <w:p>
+      <w:pPr>
+        <w:pStyle w:val="Akapitzlist"/>
+        <w:numPr>
+          <w:ilvl w:val="0"/>
+          <w:numId w:val="11"/>
+        </w:numPr>
+        <w:rPr>
+          <w:sz w:val="24"/>
+          <w:szCs w:val="24"/>
+        </w:rPr>
+      </w:pPr>
+      <w:r>
+        <w:rPr>
+          <w:sz w:val="24"/>
+          <w:szCs w:val="24"/>
+        </w:rPr>
+        <w:t>Passwords</w:t>
+      </w:r>
+      <w:r>
+        <w:rPr>
+          <w:sz w:val="24"/>
+          <w:szCs w:val="24"/>
+        </w:rPr>
+        <w:t xml:space="preserve"> storage </w:t>
+      </w:r>
+    </w:p>
+    <w:p>
+      <w:pPr>
+        <w:pStyle w:val="Akapitzlist"/>
+        <w:numPr>
+          <w:ilvl w:val="0"/>
+          <w:numId w:val="11"/>
+        </w:numPr>
+        <w:rPr>
+          <w:sz w:val="24"/>
+          <w:szCs w:val="24"/>
+        </w:rPr>
+      </w:pPr>
+      <w:r>
+        <w:rPr>
+          <w:sz w:val="24"/>
+          <w:szCs w:val="24"/>
+        </w:rPr>
+        <w:t>Data Structure (Has</w:t>
+      </w:r>
+      <w:r>
+        <w:rPr>
+          <w:sz w:val="24"/>
+          <w:szCs w:val="24"/>
+        </w:rPr>
+        <w:t>h Tables)</w:t>
+      </w:r>
+    </w:p>
+    <w:p>
+      <w:pPr>
+        <w:pStyle w:val="Akapitzlist"/>
+        <w:numPr>
+          <w:ilvl w:val="0"/>
+          <w:numId w:val="11"/>
+        </w:numPr>
+        <w:rPr>
+          <w:sz w:val="24"/>
+          <w:szCs w:val="24"/>
+        </w:rPr>
+      </w:pPr>
+      <w:r>
+        <w:rPr>
+          <w:sz w:val="24"/>
+          <w:szCs w:val="24"/>
+        </w:rPr>
+        <w:t>Integrity Verification</w:t>
+      </w:r>
+    </w:p>
+    <w:p>
+      <w:pPr>
+        <w:rPr>
+          <w:sz w:val="24"/>
+          <w:szCs w:val="24"/>
+        </w:rPr>
+      </w:pPr>
+      <w:r>
+        <w:rPr>
+          <w:sz w:val="24"/>
+          <w:szCs w:val="24"/>
+        </w:rPr>
+        <w:t>It acts</w:t>
+      </w:r>
+      <w:r>
+        <w:rPr>
+          <w:sz w:val="24"/>
+          <w:szCs w:val="24"/>
+        </w:rPr>
+        <w:t xml:space="preserve"> as </w:t>
+      </w:r>
+      <w:r>
+        <w:rPr>
+          <w:sz w:val="24"/>
+          <w:szCs w:val="24"/>
+        </w:rPr>
+        <w:t>a one</w:t>
+      </w:r>
+      <w:r>
+        <w:rPr>
+          <w:sz w:val="24"/>
+          <w:szCs w:val="24"/>
+        </w:rPr>
+        <w:t xml:space="preserve">-way digital fingerprint that turns data int unique </w:t>
+      </w:r>
+      <w:r>
+        <w:rPr>
+          <w:sz w:val="24"/>
+          <w:szCs w:val="24"/>
+        </w:rPr>
+        <w:t xml:space="preserve">string to </w:t>
+      </w:r>
+      <w:r>
+        <w:rPr>
+          <w:sz w:val="24"/>
+          <w:szCs w:val="24"/>
+        </w:rPr>
+        <w:t>verify</w:t>
+      </w:r>
+      <w:r>
+        <w:rPr>
+          <w:sz w:val="24"/>
+          <w:szCs w:val="24"/>
+        </w:rPr>
+        <w:t xml:space="preserve"> integrity </w:t>
+      </w:r>
+      <w:r>
+        <w:rPr>
+          <w:sz w:val="24"/>
+          <w:szCs w:val="24"/>
+        </w:rPr>
+        <w:t>without revealing the original content.</w:t>
+      </w:r>
+    </w:p>
+    <w:p>
+      <w:pPr>
+        <w:rPr>
+          <w:sz w:val="24"/>
+          <w:szCs w:val="24"/>
+        </w:rPr>
+      </w:pPr>
+      <w:r>
+        <w:rPr>
+          <w:sz w:val="24"/>
+          <w:szCs w:val="24"/>
+        </w:rPr>
+        <w:t xml:space="preserve">The whole </w:t>
+      </w:r>
+      <w:r>
+        <w:rPr>
+          <w:sz w:val="24"/>
+          <w:szCs w:val="24"/>
+        </w:rPr>
+        <w:t>modern technological world</w:t>
+      </w:r>
+      <w:r>
+        <w:rPr>
+          <w:sz w:val="24"/>
+          <w:szCs w:val="24"/>
+        </w:rPr>
+        <w:t xml:space="preserve"> </w:t>
+      </w:r>
+      <w:r>
+        <w:rPr>
+          <w:sz w:val="24"/>
+          <w:szCs w:val="24"/>
+        </w:rPr>
+        <w:t xml:space="preserve">where all people use the internet </w:t>
+      </w:r>
+      <w:r>
+        <w:rPr>
+          <w:sz w:val="24"/>
+          <w:szCs w:val="24"/>
+        </w:rPr>
+        <w:t>for</w:t>
+      </w:r>
+      <w:r>
+        <w:rPr>
+          <w:sz w:val="24"/>
+          <w:szCs w:val="24"/>
+        </w:rPr>
+        <w:t xml:space="preserve"> communication, sending sensitive information, log into banks, </w:t>
+      </w:r>
+      <w:r>
+        <w:rPr>
+          <w:sz w:val="24"/>
+          <w:szCs w:val="24"/>
+        </w:rPr>
+        <w:t xml:space="preserve">and </w:t>
+      </w:r>
+      <w:r>
+        <w:rPr>
+          <w:sz w:val="24"/>
+          <w:szCs w:val="24"/>
+        </w:rPr>
+        <w:t xml:space="preserve">social media, connecting to volume of websites cryptographic system are incredibly important. </w:t>
+      </w:r>
+    </w:p>
+    <w:p>
+      <w:pPr>
+        <w:rPr>
+          <w:sz w:val="24"/>
+          <w:szCs w:val="24"/>
+        </w:rPr>
+      </w:pPr>
+      <w:r>
+        <w:rPr>
+          <w:sz w:val="24"/>
+          <w:szCs w:val="24"/>
+        </w:rPr>
+        <w:t>U</w:t>
+      </w:r>
+      <w:r>
+        <w:rPr>
+          <w:sz w:val="24"/>
+          <w:szCs w:val="24"/>
+        </w:rPr>
+        <w:t>sing applications like WhatsApp, Messenger, Telegram etc. send</w:t>
+      </w:r>
+      <w:r>
+        <w:rPr>
+          <w:sz w:val="24"/>
+          <w:szCs w:val="24"/>
+        </w:rPr>
+        <w:t>s</w:t>
+      </w:r>
+      <w:r>
+        <w:rPr>
+          <w:sz w:val="24"/>
+          <w:szCs w:val="24"/>
+        </w:rPr>
+        <w:t xml:space="preserve"> millions of private and business information. Those messages are encrypted every time they are sent and decrypt</w:t>
+      </w:r>
+      <w:r>
+        <w:rPr>
+          <w:sz w:val="24"/>
+          <w:szCs w:val="24"/>
+        </w:rPr>
+        <w:t>ed</w:t>
+      </w:r>
+      <w:r>
+        <w:rPr>
+          <w:sz w:val="24"/>
+          <w:szCs w:val="24"/>
+        </w:rPr>
+        <w:t xml:space="preserve"> when</w:t>
+      </w:r>
+      <w:r>
+        <w:rPr>
+          <w:sz w:val="24"/>
+          <w:szCs w:val="24"/>
+        </w:rPr>
+        <w:t xml:space="preserve"> the</w:t>
+      </w:r>
+      <w:r>
+        <w:rPr>
+          <w:sz w:val="24"/>
+          <w:szCs w:val="24"/>
+        </w:rPr>
+        <w:t xml:space="preserve"> receiver gets the message. </w:t>
+      </w:r>
+      <w:r>
+        <w:rPr>
+          <w:sz w:val="24"/>
+          <w:szCs w:val="24"/>
+        </w:rPr>
+        <w:br/>
+        <w:t>Every time people log into their bank accounts</w:t>
+      </w:r>
+      <w:r>
+        <w:rPr>
+          <w:sz w:val="24"/>
+          <w:szCs w:val="24"/>
+        </w:rPr>
+        <w:t>,</w:t>
+      </w:r>
+      <w:r>
+        <w:rPr>
+          <w:sz w:val="24"/>
+          <w:szCs w:val="24"/>
+        </w:rPr>
+        <w:t xml:space="preserve"> encryption must be involved.</w:t>
+      </w:r>
+      <w:r>
+        <w:rPr>
+          <w:sz w:val="24"/>
+          <w:szCs w:val="24"/>
+        </w:rPr>
+        <w:br/>
+        <w:t>Without cryptographic system</w:t>
+      </w:r>
+      <w:r>
+        <w:rPr>
+          <w:sz w:val="24"/>
+          <w:szCs w:val="24"/>
+        </w:rPr>
+        <w:t>,</w:t>
+      </w:r>
+      <w:r>
+        <w:rPr>
+          <w:sz w:val="24"/>
+          <w:szCs w:val="24"/>
+        </w:rPr>
+        <w:t xml:space="preserve"> all that sensitive information could be stolen and used in </w:t>
+      </w:r>
+      <w:r>
+        <w:rPr>
+          <w:sz w:val="24"/>
+          <w:szCs w:val="24"/>
+        </w:rPr>
+        <w:t>a</w:t>
+      </w:r>
+      <w:r>
+        <w:rPr>
+          <w:sz w:val="24"/>
+          <w:szCs w:val="24"/>
+        </w:rPr>
+        <w:t xml:space="preserve"> way where no one would want to. </w:t>
+      </w:r>
+    </w:p>
+    <w:p>
+      <w:pPr>
+        <w:rPr>
+          <w:sz w:val="24"/>
+          <w:szCs w:val="24"/>
+        </w:rPr>
+      </w:pPr>
+      <w:r>
+        <w:rPr>
+          <w:sz w:val="24"/>
+          <w:szCs w:val="24"/>
+        </w:rPr>
+        <w:t>It is a vast ecosystem of communication, finance, and social interaction where digital information must be protected by cryptographic systems. All this information shows how cryptographic systems are extremely important for all users around the world.</w:t>
+      </w:r>
+    </w:p>
+    <w:p>
+      <w:pPr>
         <w:pStyle w:val="Nagwek11"/>
         <w:numPr>
           <w:ilvl w:val="0"/>
           <w:numId w:val="0"/>
         </w:numPr>
-        <w:ind w:left="432" w:hanging="432"/>
+        <w:ind w:left="1224"/>
+        <w:rPr>
+          <w:b/>
+          <w:bCs/>
+          <w:sz w:val="24"/>
+          <w:szCs w:val="24"/>
+        </w:rPr>
+      </w:pPr>
+    </w:p>
+    <w:p>
+      <w:pPr>
+        <w:pStyle w:val="Nagwek11"/>
+        <w:numPr>
+          <w:ilvl w:val="0"/>
+          <w:numId w:val="0"/>
+        </w:numPr>
+        <w:ind w:left="1224"/>
+        <w:rPr>
+          <w:b/>
+          <w:bCs/>
+          <w:sz w:val="24"/>
+          <w:szCs w:val="24"/>
+        </w:rPr>
+      </w:pPr>
+    </w:p>
+    <w:p>
+      <w:pPr>
         <w:rPr>
           <w:b/>
           <w:bCs/>
@@ -246,987 +1287,6 @@
           <w:sz w:val="28"/>
           <w:szCs w:val="28"/>
         </w:rPr>
-        <w:t xml:space="preserve">Cryptographic System and their </w:t>
-      </w:r>
-      <w:r>
-        <w:rPr>
-          <w:b/>
-          <w:bCs/>
-          <w:sz w:val="28"/>
-          <w:szCs w:val="28"/>
-        </w:rPr>
-        <w:t>I</w:t>
-      </w:r>
-      <w:r>
-        <w:rPr>
-          <w:b/>
-          <w:bCs/>
-          <w:sz w:val="28"/>
-          <w:szCs w:val="28"/>
-        </w:rPr>
-        <w:t xml:space="preserve">mportance in </w:t>
-      </w:r>
-      <w:r>
-        <w:rPr>
-          <w:b/>
-          <w:bCs/>
-          <w:sz w:val="28"/>
-          <w:szCs w:val="28"/>
-        </w:rPr>
-        <w:t>S</w:t>
-      </w:r>
-      <w:r>
-        <w:rPr>
-          <w:b/>
-          <w:bCs/>
-          <w:sz w:val="28"/>
-          <w:szCs w:val="28"/>
-        </w:rPr>
-        <w:t xml:space="preserve">ecuring </w:t>
-      </w:r>
-      <w:r>
-        <w:rPr>
-          <w:b/>
-          <w:bCs/>
-          <w:sz w:val="28"/>
-          <w:szCs w:val="28"/>
-        </w:rPr>
-        <w:t>D</w:t>
-      </w:r>
-      <w:r>
-        <w:rPr>
-          <w:b/>
-          <w:bCs/>
-          <w:sz w:val="28"/>
-          <w:szCs w:val="28"/>
-        </w:rPr>
-        <w:t>igital</w:t>
-      </w:r>
-      <w:r>
-        <w:rPr>
-          <w:b/>
-          <w:bCs/>
-          <w:sz w:val="28"/>
-          <w:szCs w:val="28"/>
-        </w:rPr>
-        <w:t xml:space="preserve"> </w:t>
-      </w:r>
-      <w:r>
-        <w:rPr>
-          <w:b/>
-          <w:bCs/>
-          <w:sz w:val="28"/>
-          <w:szCs w:val="28"/>
-        </w:rPr>
-        <w:t>I</w:t>
-      </w:r>
-      <w:r>
-        <w:rPr>
-          <w:b/>
-          <w:bCs/>
-          <w:sz w:val="28"/>
-          <w:szCs w:val="28"/>
-        </w:rPr>
-        <w:t>nformation.</w:t>
-      </w:r>
-    </w:p>
-    <w:p>
-      <w:pPr>
-        <w:rPr>
-          <w:sz w:val="24"/>
-          <w:szCs w:val="24"/>
-        </w:rPr>
-      </w:pPr>
-      <w:r>
-        <w:rPr>
-          <w:i/>
-          <w:iCs/>
-          <w:sz w:val="24"/>
-          <w:szCs w:val="24"/>
-        </w:rPr>
-        <w:t>Cryptographic systems</w:t>
-      </w:r>
-      <w:r>
-        <w:rPr>
-          <w:sz w:val="24"/>
-          <w:szCs w:val="24"/>
-        </w:rPr>
-        <w:t xml:space="preserve"> are fundamental to the modern digital world, </w:t>
-      </w:r>
-      <w:r>
-        <w:rPr>
-          <w:sz w:val="24"/>
-          <w:szCs w:val="24"/>
-        </w:rPr>
-        <w:t xml:space="preserve">however </w:t>
-      </w:r>
-      <w:r>
-        <w:rPr>
-          <w:sz w:val="24"/>
-          <w:szCs w:val="24"/>
-        </w:rPr>
-        <w:t>when</w:t>
-      </w:r>
-      <w:r>
-        <w:rPr>
-          <w:sz w:val="24"/>
-          <w:szCs w:val="24"/>
-        </w:rPr>
-        <w:t xml:space="preserve"> </w:t>
-      </w:r>
-      <w:r>
-        <w:rPr>
-          <w:sz w:val="24"/>
-          <w:szCs w:val="24"/>
-        </w:rPr>
-        <w:t xml:space="preserve">explaining what cryptographic systems are, it is necessary to briefly explain what cryptography itself is. </w:t>
-      </w:r>
-      <w:r>
-        <w:rPr>
-          <w:sz w:val="24"/>
-          <w:szCs w:val="24"/>
-        </w:rPr>
-        <w:br/>
-        <w:t xml:space="preserve">Briefly, </w:t>
-      </w:r>
-      <w:r>
-        <w:rPr>
-          <w:i/>
-          <w:iCs/>
-          <w:sz w:val="24"/>
-          <w:szCs w:val="24"/>
-        </w:rPr>
-        <w:t>cryptography</w:t>
-      </w:r>
-      <w:r>
-        <w:rPr>
-          <w:sz w:val="24"/>
-          <w:szCs w:val="24"/>
-        </w:rPr>
-        <w:t xml:space="preserve"> is a technique of encrypting information (messages, passwords, transactions etc</w:t>
-      </w:r>
-      <w:r>
-        <w:rPr>
-          <w:sz w:val="24"/>
-          <w:szCs w:val="24"/>
-        </w:rPr>
-        <w:t>.</w:t>
-      </w:r>
-      <w:r>
-        <w:rPr>
-          <w:sz w:val="24"/>
-          <w:szCs w:val="24"/>
-        </w:rPr>
-        <w:t>) through cryptographic algorithms.  It converts plain text into ciphertext.</w:t>
-      </w:r>
-    </w:p>
-    <w:p>
-      <w:pPr>
-        <w:rPr>
-          <w:sz w:val="24"/>
-          <w:szCs w:val="24"/>
-        </w:rPr>
-      </w:pPr>
-      <w:r>
-        <w:rPr>
-          <w:sz w:val="24"/>
-          <w:szCs w:val="24"/>
-        </w:rPr>
-        <w:t xml:space="preserve">The modern world uses cryptographic systems to protect users around the world. Cryptographic systems are methods where information is disguised. It means that only </w:t>
-      </w:r>
-      <w:r>
-        <w:rPr>
-          <w:sz w:val="24"/>
-          <w:szCs w:val="24"/>
-        </w:rPr>
-        <w:t xml:space="preserve">the </w:t>
-      </w:r>
-      <w:r>
-        <w:rPr>
-          <w:sz w:val="24"/>
-          <w:szCs w:val="24"/>
-        </w:rPr>
-        <w:t xml:space="preserve">person with the specific key can read it. </w:t>
-      </w:r>
-    </w:p>
-    <w:p>
-      <w:pPr>
-        <w:rPr>
-          <w:sz w:val="24"/>
-          <w:szCs w:val="24"/>
-        </w:rPr>
-      </w:pPr>
-      <w:r>
-        <w:rPr>
-          <w:sz w:val="24"/>
-          <w:szCs w:val="24"/>
-        </w:rPr>
-        <w:t xml:space="preserve">Cryptographic systems are used everywhere around the world. Without </w:t>
-      </w:r>
-      <w:r>
-        <w:rPr>
-          <w:sz w:val="24"/>
-          <w:szCs w:val="24"/>
-        </w:rPr>
-        <w:t>them</w:t>
-      </w:r>
-      <w:r>
-        <w:rPr>
-          <w:sz w:val="24"/>
-          <w:szCs w:val="24"/>
-        </w:rPr>
-        <w:t xml:space="preserve">, the security and functionality of the entire digital world would be compromised.  </w:t>
-      </w:r>
-    </w:p>
-    <w:p>
-      <w:pPr>
-        <w:rPr>
-          <w:sz w:val="24"/>
-          <w:szCs w:val="24"/>
-        </w:rPr>
-      </w:pPr>
-      <w:r>
-        <w:rPr>
-          <w:sz w:val="24"/>
-          <w:szCs w:val="24"/>
-        </w:rPr>
-        <w:t xml:space="preserve">There are </w:t>
-      </w:r>
-      <w:r>
-        <w:rPr>
-          <w:sz w:val="24"/>
-          <w:szCs w:val="24"/>
-        </w:rPr>
-        <w:t>two</w:t>
-      </w:r>
-      <w:r>
-        <w:rPr>
-          <w:sz w:val="24"/>
-          <w:szCs w:val="24"/>
-        </w:rPr>
-        <w:t xml:space="preserve"> primary types of cryptography which are used in the modern digital world. The first one is Symmetric Encryption and second is Asymmetric Encryption</w:t>
-      </w:r>
-      <w:r>
-        <w:rPr>
-          <w:sz w:val="24"/>
-          <w:szCs w:val="24"/>
-        </w:rPr>
-        <w:t>.</w:t>
-      </w:r>
-    </w:p>
-    <w:p>
-      <w:pPr>
-        <w:rPr>
-          <w:sz w:val="24"/>
-          <w:szCs w:val="24"/>
-        </w:rPr>
-      </w:pPr>
-      <w:r>
-        <w:rPr>
-          <w:sz w:val="24"/>
-          <w:szCs w:val="24"/>
-        </w:rPr>
-        <w:t>Also,</w:t>
-      </w:r>
-      <w:r>
-        <w:rPr>
-          <w:sz w:val="24"/>
-          <w:szCs w:val="24"/>
-        </w:rPr>
-        <w:t xml:space="preserve"> </w:t>
-      </w:r>
-      <w:r>
-        <w:rPr>
-          <w:sz w:val="24"/>
-          <w:szCs w:val="24"/>
-        </w:rPr>
-        <w:t xml:space="preserve">there is hashing which is </w:t>
-      </w:r>
-      <w:r>
-        <w:rPr>
-          <w:sz w:val="24"/>
-          <w:szCs w:val="24"/>
-        </w:rPr>
-        <w:t>digital fingerprint.</w:t>
-      </w:r>
-    </w:p>
-    <w:p>
-      <w:pPr>
-        <w:rPr>
-          <w:sz w:val="24"/>
-          <w:szCs w:val="24"/>
-        </w:rPr>
-      </w:pPr>
-      <w:r>
-        <w:rPr>
-          <w:i/>
-          <w:iCs/>
-          <w:sz w:val="24"/>
-          <w:szCs w:val="24"/>
-        </w:rPr>
-        <w:t>Symmetric Encryption</w:t>
-      </w:r>
-      <w:r>
-        <w:rPr>
-          <w:sz w:val="24"/>
-          <w:szCs w:val="24"/>
-        </w:rPr>
-        <w:t xml:space="preserve"> is the most common where a volume of data must be encrypted. It is the fastest and most efficient way and can effortlessly encrypt gigabytes of data. This way of encryption is applied e.g.:</w:t>
-      </w:r>
-    </w:p>
-    <w:p>
-      <w:pPr>
-        <w:pStyle w:val="Akapitzlist"/>
-        <w:numPr>
-          <w:ilvl w:val="0"/>
-          <w:numId w:val="9"/>
-        </w:numPr>
-        <w:rPr>
-          <w:sz w:val="24"/>
-          <w:szCs w:val="24"/>
-        </w:rPr>
-      </w:pPr>
-      <w:r>
-        <w:rPr>
-          <w:sz w:val="24"/>
-          <w:szCs w:val="24"/>
-        </w:rPr>
-        <w:lastRenderedPageBreak/>
-        <w:t>in database security</w:t>
-      </w:r>
-    </w:p>
-    <w:p>
-      <w:pPr>
-        <w:pStyle w:val="Akapitzlist"/>
-        <w:numPr>
-          <w:ilvl w:val="0"/>
-          <w:numId w:val="9"/>
-        </w:numPr>
-        <w:rPr>
-          <w:sz w:val="24"/>
-          <w:szCs w:val="24"/>
-        </w:rPr>
-      </w:pPr>
-      <w:r>
-        <w:rPr>
-          <w:sz w:val="24"/>
-          <w:szCs w:val="24"/>
-        </w:rPr>
-        <w:t>Wi-Fi (WPA2/WPA3)</w:t>
-      </w:r>
-    </w:p>
-    <w:p>
-      <w:pPr>
-        <w:rPr>
-          <w:sz w:val="24"/>
-          <w:szCs w:val="24"/>
-        </w:rPr>
-      </w:pPr>
-      <w:r>
-        <w:rPr>
-          <w:sz w:val="24"/>
-          <w:szCs w:val="24"/>
-        </w:rPr>
-        <w:t xml:space="preserve">It is fast and </w:t>
-      </w:r>
-      <w:r>
-        <w:rPr>
-          <w:sz w:val="24"/>
-          <w:szCs w:val="24"/>
-        </w:rPr>
-        <w:t xml:space="preserve">most </w:t>
-      </w:r>
-      <w:r>
-        <w:rPr>
-          <w:sz w:val="24"/>
-          <w:szCs w:val="24"/>
-        </w:rPr>
-        <w:t>efficient because it uses the same key to both encrypt and decrypt but require</w:t>
-      </w:r>
-      <w:r>
-        <w:rPr>
-          <w:sz w:val="24"/>
-          <w:szCs w:val="24"/>
-        </w:rPr>
-        <w:t>s</w:t>
-      </w:r>
-      <w:r>
-        <w:rPr>
-          <w:sz w:val="24"/>
-          <w:szCs w:val="24"/>
-        </w:rPr>
-        <w:t xml:space="preserve"> a secure way to share a key</w:t>
-      </w:r>
-    </w:p>
-    <w:p>
-      <w:pPr>
-        <w:rPr>
-          <w:sz w:val="24"/>
-          <w:szCs w:val="24"/>
-        </w:rPr>
-      </w:pPr>
-      <w:r>
-        <w:rPr>
-          <w:i/>
-          <w:iCs/>
-          <w:sz w:val="24"/>
-          <w:szCs w:val="24"/>
-        </w:rPr>
-        <w:t>Asymmetric Encryption</w:t>
-      </w:r>
-      <w:r>
-        <w:rPr>
-          <w:sz w:val="24"/>
-          <w:szCs w:val="24"/>
-        </w:rPr>
-        <w:t xml:space="preserve"> is the most common in terms of establishing trust. This method uses two keys. Public key for encryption and Private key for decryption. </w:t>
-      </w:r>
-      <w:r>
-        <w:rPr>
-          <w:sz w:val="24"/>
-          <w:szCs w:val="24"/>
-        </w:rPr>
-        <w:br/>
-        <w:t xml:space="preserve">Public key anyone </w:t>
-      </w:r>
-      <w:r>
-        <w:rPr>
-          <w:sz w:val="24"/>
-          <w:szCs w:val="24"/>
-        </w:rPr>
-        <w:t xml:space="preserve">can </w:t>
-      </w:r>
-      <w:r>
-        <w:rPr>
-          <w:sz w:val="24"/>
-          <w:szCs w:val="24"/>
-        </w:rPr>
-        <w:t>use to encrypt, and only you have a Private key to decrypt. This way of encryption is applied e.g.:</w:t>
-      </w:r>
-    </w:p>
-    <w:p>
-      <w:pPr>
-        <w:pStyle w:val="Akapitzlist"/>
-        <w:numPr>
-          <w:ilvl w:val="0"/>
-          <w:numId w:val="10"/>
-        </w:numPr>
-        <w:rPr>
-          <w:sz w:val="24"/>
-          <w:szCs w:val="24"/>
-        </w:rPr>
-      </w:pPr>
-      <w:r>
-        <w:rPr>
-          <w:sz w:val="24"/>
-          <w:szCs w:val="24"/>
-        </w:rPr>
-        <w:t>Cryptocurrency</w:t>
-      </w:r>
-    </w:p>
-    <w:p>
-      <w:pPr>
-        <w:pStyle w:val="Akapitzlist"/>
-        <w:numPr>
-          <w:ilvl w:val="0"/>
-          <w:numId w:val="10"/>
-        </w:numPr>
-        <w:rPr>
-          <w:sz w:val="24"/>
-          <w:szCs w:val="24"/>
-        </w:rPr>
-      </w:pPr>
-      <w:r>
-        <w:rPr>
-          <w:sz w:val="24"/>
-          <w:szCs w:val="24"/>
-        </w:rPr>
-        <w:t>SSL/TLS – at the beginning of connection</w:t>
-      </w:r>
-    </w:p>
-    <w:p>
-      <w:pPr>
-        <w:rPr>
-          <w:sz w:val="24"/>
-          <w:szCs w:val="24"/>
-        </w:rPr>
-      </w:pPr>
-      <w:r>
-        <w:rPr>
-          <w:sz w:val="24"/>
-          <w:szCs w:val="24"/>
-        </w:rPr>
-        <w:t>It enables to secure online transactions, protect sensitive data which are stored in databases (such as passwords, credit or debit cards’ pins).</w:t>
-      </w:r>
-    </w:p>
-    <w:p>
-      <w:pPr>
-        <w:rPr>
-          <w:sz w:val="24"/>
-          <w:szCs w:val="24"/>
-        </w:rPr>
-      </w:pPr>
-    </w:p>
-    <w:p>
-      <w:pPr>
-        <w:rPr>
-          <w:sz w:val="24"/>
-          <w:szCs w:val="24"/>
-        </w:rPr>
-      </w:pPr>
-      <w:r>
-        <w:rPr>
-          <w:i/>
-          <w:iCs/>
-          <w:sz w:val="24"/>
-          <w:szCs w:val="24"/>
-        </w:rPr>
-        <w:t>Hashing</w:t>
-      </w:r>
-      <w:r>
-        <w:rPr>
-          <w:sz w:val="24"/>
-          <w:szCs w:val="24"/>
-        </w:rPr>
-        <w:t xml:space="preserve"> </w:t>
-      </w:r>
-      <w:r>
-        <w:rPr>
-          <w:sz w:val="24"/>
-          <w:szCs w:val="24"/>
-        </w:rPr>
-        <w:t>is a method for converting data values into unique characters called hashes</w:t>
-      </w:r>
-      <w:r>
-        <w:rPr>
-          <w:sz w:val="24"/>
-          <w:szCs w:val="24"/>
-        </w:rPr>
-        <w:t>. Unlike encryption, it is a one-way process. Hashi</w:t>
-      </w:r>
-      <w:r>
-        <w:rPr>
-          <w:sz w:val="24"/>
-          <w:szCs w:val="24"/>
-        </w:rPr>
-        <w:t>ng is used for secure and quick access and is essential</w:t>
-      </w:r>
-      <w:r>
-        <w:rPr>
-          <w:sz w:val="24"/>
-          <w:szCs w:val="24"/>
-        </w:rPr>
-        <w:t xml:space="preserve"> for data integrity. </w:t>
-      </w:r>
-    </w:p>
-    <w:p>
-      <w:pPr>
-        <w:rPr>
-          <w:sz w:val="24"/>
-          <w:szCs w:val="24"/>
-        </w:rPr>
-      </w:pPr>
-      <w:r>
-        <w:rPr>
-          <w:sz w:val="24"/>
-          <w:szCs w:val="24"/>
-        </w:rPr>
-        <w:t>This cryptographic technique</w:t>
-      </w:r>
-      <w:r>
-        <w:rPr>
-          <w:sz w:val="24"/>
-          <w:szCs w:val="24"/>
-        </w:rPr>
-        <w:t xml:space="preserve"> </w:t>
-      </w:r>
-      <w:r>
-        <w:rPr>
-          <w:sz w:val="24"/>
-          <w:szCs w:val="24"/>
-        </w:rPr>
-        <w:t>is applied in</w:t>
-      </w:r>
-      <w:r>
-        <w:rPr>
-          <w:sz w:val="24"/>
-          <w:szCs w:val="24"/>
-        </w:rPr>
-        <w:t>:</w:t>
-      </w:r>
-    </w:p>
-    <w:p>
-      <w:pPr>
-        <w:pStyle w:val="Akapitzlist"/>
-        <w:numPr>
-          <w:ilvl w:val="0"/>
-          <w:numId w:val="11"/>
-        </w:numPr>
-        <w:rPr>
-          <w:sz w:val="24"/>
-          <w:szCs w:val="24"/>
-        </w:rPr>
-      </w:pPr>
-      <w:r>
-        <w:rPr>
-          <w:sz w:val="24"/>
-          <w:szCs w:val="24"/>
-        </w:rPr>
-        <w:t>Passwords</w:t>
-      </w:r>
-      <w:r>
-        <w:rPr>
-          <w:sz w:val="24"/>
-          <w:szCs w:val="24"/>
-        </w:rPr>
-        <w:t xml:space="preserve"> storage </w:t>
-      </w:r>
-    </w:p>
-    <w:p>
-      <w:pPr>
-        <w:pStyle w:val="Akapitzlist"/>
-        <w:numPr>
-          <w:ilvl w:val="0"/>
-          <w:numId w:val="11"/>
-        </w:numPr>
-        <w:rPr>
-          <w:sz w:val="24"/>
-          <w:szCs w:val="24"/>
-        </w:rPr>
-      </w:pPr>
-      <w:r>
-        <w:rPr>
-          <w:sz w:val="24"/>
-          <w:szCs w:val="24"/>
-        </w:rPr>
-        <w:t>Data Structure (Has</w:t>
-      </w:r>
-      <w:r>
-        <w:rPr>
-          <w:sz w:val="24"/>
-          <w:szCs w:val="24"/>
-        </w:rPr>
-        <w:t>h Tables)</w:t>
-      </w:r>
-    </w:p>
-    <w:p>
-      <w:pPr>
-        <w:pStyle w:val="Akapitzlist"/>
-        <w:numPr>
-          <w:ilvl w:val="0"/>
-          <w:numId w:val="11"/>
-        </w:numPr>
-        <w:rPr>
-          <w:sz w:val="24"/>
-          <w:szCs w:val="24"/>
-        </w:rPr>
-      </w:pPr>
-      <w:r>
-        <w:rPr>
-          <w:sz w:val="24"/>
-          <w:szCs w:val="24"/>
-        </w:rPr>
-        <w:t>Integrity Verification</w:t>
-      </w:r>
-    </w:p>
-    <w:p>
-      <w:pPr>
-        <w:rPr>
-          <w:sz w:val="24"/>
-          <w:szCs w:val="24"/>
-        </w:rPr>
-      </w:pPr>
-      <w:r>
-        <w:rPr>
-          <w:sz w:val="24"/>
-          <w:szCs w:val="24"/>
-        </w:rPr>
-        <w:t>It acts</w:t>
-      </w:r>
-      <w:r>
-        <w:rPr>
-          <w:sz w:val="24"/>
-          <w:szCs w:val="24"/>
-        </w:rPr>
-        <w:t xml:space="preserve"> as </w:t>
-      </w:r>
-      <w:r>
-        <w:rPr>
-          <w:sz w:val="24"/>
-          <w:szCs w:val="24"/>
-        </w:rPr>
-        <w:t>a one</w:t>
-      </w:r>
-      <w:r>
-        <w:rPr>
-          <w:sz w:val="24"/>
-          <w:szCs w:val="24"/>
-        </w:rPr>
-        <w:t xml:space="preserve">-way digital fingerprint that turns data int unique </w:t>
-      </w:r>
-      <w:r>
-        <w:rPr>
-          <w:sz w:val="24"/>
-          <w:szCs w:val="24"/>
-        </w:rPr>
-        <w:t xml:space="preserve">string to </w:t>
-      </w:r>
-      <w:r>
-        <w:rPr>
-          <w:sz w:val="24"/>
-          <w:szCs w:val="24"/>
-        </w:rPr>
-        <w:t>verify</w:t>
-      </w:r>
-      <w:r>
-        <w:rPr>
-          <w:sz w:val="24"/>
-          <w:szCs w:val="24"/>
-        </w:rPr>
-        <w:t xml:space="preserve"> integrity </w:t>
-      </w:r>
-      <w:r>
-        <w:rPr>
-          <w:sz w:val="24"/>
-          <w:szCs w:val="24"/>
-        </w:rPr>
-        <w:t>without revealing the original content.</w:t>
-      </w:r>
-    </w:p>
-    <w:p>
-      <w:pPr>
-        <w:rPr>
-          <w:sz w:val="24"/>
-          <w:szCs w:val="24"/>
-        </w:rPr>
-      </w:pPr>
-      <w:r>
-        <w:rPr>
-          <w:sz w:val="24"/>
-          <w:szCs w:val="24"/>
-        </w:rPr>
-        <w:t xml:space="preserve">The whole modern digital world where all people use the internet </w:t>
-      </w:r>
-      <w:r>
-        <w:rPr>
-          <w:sz w:val="24"/>
-          <w:szCs w:val="24"/>
-        </w:rPr>
-        <w:t>for</w:t>
-      </w:r>
-      <w:r>
-        <w:rPr>
-          <w:sz w:val="24"/>
-          <w:szCs w:val="24"/>
-        </w:rPr>
-        <w:t xml:space="preserve"> communication, sending sensitive information, log into banks, </w:t>
-      </w:r>
-      <w:r>
-        <w:rPr>
-          <w:sz w:val="24"/>
-          <w:szCs w:val="24"/>
-        </w:rPr>
-        <w:t xml:space="preserve">and </w:t>
-      </w:r>
-      <w:r>
-        <w:rPr>
-          <w:sz w:val="24"/>
-          <w:szCs w:val="24"/>
-        </w:rPr>
-        <w:t xml:space="preserve">social media, connecting to volume of websites cryptographic system are incredibly important. </w:t>
-      </w:r>
-    </w:p>
-    <w:p>
-      <w:pPr>
-        <w:rPr>
-          <w:sz w:val="24"/>
-          <w:szCs w:val="24"/>
-        </w:rPr>
-      </w:pPr>
-      <w:r>
-        <w:rPr>
-          <w:sz w:val="24"/>
-          <w:szCs w:val="24"/>
-        </w:rPr>
-        <w:t>U</w:t>
-      </w:r>
-      <w:r>
-        <w:rPr>
-          <w:sz w:val="24"/>
-          <w:szCs w:val="24"/>
-        </w:rPr>
-        <w:t>sing applications like WhatsApp, Messenger, Telegram etc. send</w:t>
-      </w:r>
-      <w:r>
-        <w:rPr>
-          <w:sz w:val="24"/>
-          <w:szCs w:val="24"/>
-        </w:rPr>
-        <w:t>s</w:t>
-      </w:r>
-      <w:r>
-        <w:rPr>
-          <w:sz w:val="24"/>
-          <w:szCs w:val="24"/>
-        </w:rPr>
-        <w:t xml:space="preserve"> millions of private and business information. Those messages are encrypted every time they are sent and decrypt</w:t>
-      </w:r>
-      <w:r>
-        <w:rPr>
-          <w:sz w:val="24"/>
-          <w:szCs w:val="24"/>
-        </w:rPr>
-        <w:t>ed</w:t>
-      </w:r>
-      <w:r>
-        <w:rPr>
-          <w:sz w:val="24"/>
-          <w:szCs w:val="24"/>
-        </w:rPr>
-        <w:t xml:space="preserve"> when</w:t>
-      </w:r>
-      <w:r>
-        <w:rPr>
-          <w:sz w:val="24"/>
-          <w:szCs w:val="24"/>
-        </w:rPr>
-        <w:t xml:space="preserve"> the</w:t>
-      </w:r>
-      <w:r>
-        <w:rPr>
-          <w:sz w:val="24"/>
-          <w:szCs w:val="24"/>
-        </w:rPr>
-        <w:t xml:space="preserve"> receiver gets the message. </w:t>
-      </w:r>
-      <w:r>
-        <w:rPr>
-          <w:sz w:val="24"/>
-          <w:szCs w:val="24"/>
-        </w:rPr>
-        <w:br/>
-        <w:t>Every time people log into their bank accounts</w:t>
-      </w:r>
-      <w:r>
-        <w:rPr>
-          <w:sz w:val="24"/>
-          <w:szCs w:val="24"/>
-        </w:rPr>
-        <w:t>,</w:t>
-      </w:r>
-      <w:r>
-        <w:rPr>
-          <w:sz w:val="24"/>
-          <w:szCs w:val="24"/>
-        </w:rPr>
-        <w:t xml:space="preserve"> encryption must be involved.</w:t>
-      </w:r>
-      <w:r>
-        <w:rPr>
-          <w:sz w:val="24"/>
-          <w:szCs w:val="24"/>
-        </w:rPr>
-        <w:br/>
-        <w:t>Without cryptographic system</w:t>
-      </w:r>
-      <w:r>
-        <w:rPr>
-          <w:sz w:val="24"/>
-          <w:szCs w:val="24"/>
-        </w:rPr>
-        <w:t>,</w:t>
-      </w:r>
-      <w:r>
-        <w:rPr>
-          <w:sz w:val="24"/>
-          <w:szCs w:val="24"/>
-        </w:rPr>
-        <w:t xml:space="preserve"> all that sensitive information could be stolen and used in </w:t>
-      </w:r>
-      <w:r>
-        <w:rPr>
-          <w:sz w:val="24"/>
-          <w:szCs w:val="24"/>
-        </w:rPr>
-        <w:t>a</w:t>
-      </w:r>
-      <w:r>
-        <w:rPr>
-          <w:sz w:val="24"/>
-          <w:szCs w:val="24"/>
-        </w:rPr>
-        <w:t xml:space="preserve"> way where no one would want to. </w:t>
-      </w:r>
-    </w:p>
-    <w:p>
-      <w:pPr>
-        <w:rPr>
-          <w:sz w:val="24"/>
-          <w:szCs w:val="24"/>
-        </w:rPr>
-      </w:pPr>
-      <w:r>
-        <w:rPr>
-          <w:sz w:val="24"/>
-          <w:szCs w:val="24"/>
-        </w:rPr>
-        <w:t>It is a vast ecosystem of communication, finance, and social interaction where digital information must be protected by cryptographic systems. All this information shows how cryptographic systems are extremely important for all users around the world.</w:t>
-      </w:r>
-    </w:p>
-    <w:p>
-      <w:pPr>
-        <w:pStyle w:val="Nagwek11"/>
-        <w:numPr>
-          <w:ilvl w:val="0"/>
-          <w:numId w:val="0"/>
-        </w:numPr>
-        <w:ind w:left="1224"/>
-        <w:rPr>
-          <w:b/>
-          <w:bCs/>
-          <w:sz w:val="24"/>
-          <w:szCs w:val="24"/>
-        </w:rPr>
-      </w:pPr>
-    </w:p>
-    <w:p>
-      <w:pPr>
-        <w:pStyle w:val="Nagwek11"/>
-        <w:numPr>
-          <w:ilvl w:val="0"/>
-          <w:numId w:val="0"/>
-        </w:numPr>
-        <w:ind w:left="1224"/>
-        <w:rPr>
-          <w:b/>
-          <w:bCs/>
-          <w:sz w:val="24"/>
-          <w:szCs w:val="24"/>
-        </w:rPr>
-      </w:pPr>
-    </w:p>
-    <w:p>
-      <w:pPr>
-        <w:pStyle w:val="Nagwek11"/>
-        <w:numPr>
-          <w:ilvl w:val="0"/>
-          <w:numId w:val="0"/>
-        </w:numPr>
-        <w:ind w:left="432" w:hanging="432"/>
-        <w:rPr>
-          <w:b/>
-          <w:bCs/>
-          <w:sz w:val="28"/>
-          <w:szCs w:val="28"/>
-        </w:rPr>
-      </w:pPr>
-      <w:r>
-        <w:rPr>
-          <w:b/>
-          <w:bCs/>
-          <w:sz w:val="28"/>
-          <w:szCs w:val="28"/>
-        </w:rPr>
         <w:lastRenderedPageBreak/>
         <w:t>Application of Cryptographic Methods in Securing E-commerce Transactions, Customer Data, and Company Communications.</w:t>
       </w:r>
@@ -1346,7 +1406,21 @@
           <w:sz w:val="24"/>
           <w:szCs w:val="24"/>
         </w:rPr>
-        <w:t xml:space="preserve">TLS is a secured protocol to ensure privacy and data communication over the network by providing authentication, data integrity, and encryption. It ensures that all data cannot be read, intercepted, or modified. [2]. To make sure that transactions and communications on the internet are secured, digital signature must be used. </w:t>
+        <w:t xml:space="preserve">TLS is a secured protocol to ensure privacy and data communication over the network by providing authentication, data integrity, and encryption. It ensures that all data cannot be read, intercepted, or modified. [2]. To make sure that transactions and communications on the internet are secured, digital signature </w:t>
+      </w:r>
+      <w:r>
+        <w:rPr>
+          <w:sz w:val="24"/>
+          <w:szCs w:val="24"/>
+        </w:rPr>
+        <w:t>should</w:t>
+      </w:r>
+      <w:r>
+        <w:rPr>
+          <w:sz w:val="24"/>
+          <w:szCs w:val="24"/>
+        </w:rPr>
+        <w:t xml:space="preserve"> be used. </w:t>
       </w:r>
     </w:p>
     <w:p>
@@ -1505,7 +1579,23 @@
           <w:sz w:val="24"/>
           <w:szCs w:val="24"/>
         </w:rPr>
-        <w:t xml:space="preserve">  “The Average Number of Credit Card Transactions Per Day &amp; Year”. CardsRates. Updated: June 19, 2025. Available:</w:t>
+        <w:t xml:space="preserve">  “The Average Number of Credit Card Transactions Per Day &amp; Year”. </w:t>
+      </w:r>
+      <w:proofErr w:type="spellStart"/>
+      <w:r>
+        <w:rPr>
+          <w:sz w:val="24"/>
+          <w:szCs w:val="24"/>
+        </w:rPr>
+        <w:t>CardsRates</w:t>
+      </w:r>
+      <w:proofErr w:type="spellEnd"/>
+      <w:r>
+        <w:rPr>
+          <w:sz w:val="24"/>
+          <w:szCs w:val="24"/>
+        </w:rPr>
+        <w:t>. Updated: June 19, 2025. Available:</w:t>
       </w:r>
       <w:r>
         <w:rPr>
@@ -1515,7 +1605,7 @@
         </w:rPr>
         <w:t xml:space="preserve"> </w:t>
       </w:r>
-      <w:hyperlink r:id="rId7" w:history="1">
+      <w:hyperlink r:id="rId7" w:anchor=":~:text=Credit%20Card%20Transactions%20Globally,reach%20604.1%20billion%20in%202025.&amp;text=According%20to%20data%20collected%20by%20Capital%20One%20Shopping%2C%20there%20were,25%2C091%20per%20second" w:history="1">
         <w:r>
           <w:rPr>
             <w:rStyle w:val="Hipercze"/>
@@ -1554,7 +1644,23 @@
           <w:sz w:val="24"/>
           <w:szCs w:val="24"/>
         </w:rPr>
-        <w:t>What is TLS (Transport Lyer Security)?. Cloudf</w:t>
+        <w:t>What is TLS (Transport Lyer Security</w:t>
+      </w:r>
+      <w:proofErr w:type="gramStart"/>
+      <w:r>
+        <w:rPr>
+          <w:sz w:val="24"/>
+          <w:szCs w:val="24"/>
+        </w:rPr>
+        <w:t>)?.</w:t>
+      </w:r>
+      <w:proofErr w:type="gramEnd"/>
+      <w:r>
+        <w:rPr>
+          <w:sz w:val="24"/>
+          <w:szCs w:val="24"/>
+        </w:rPr>
+        <w:t xml:space="preserve"> Cloudf</w:t>
       </w:r>
       <w:r>
         <w:rPr>
@@ -1654,14 +1760,299 @@
           <w:ilvl w:val="0"/>
           <w:numId w:val="0"/>
         </w:numPr>
-        <w:ind w:left="432" w:hanging="432"/>
-        <w:rPr>
-          <w:b/>
-          <w:bCs/>
-          <w:sz w:val="24"/>
-          <w:szCs w:val="24"/>
-        </w:rPr>
-      </w:pPr>
+        <w:rPr>
+          <w:b/>
+          <w:bCs/>
+          <w:sz w:val="24"/>
+          <w:szCs w:val="24"/>
+        </w:rPr>
+      </w:pPr>
+    </w:p>
+    <w:p>
+      <w:pPr>
+        <w:rPr>
+          <w:b/>
+          <w:bCs/>
+          <w:sz w:val="28"/>
+          <w:szCs w:val="28"/>
+        </w:rPr>
+      </w:pPr>
+      <w:r>
+        <w:rPr>
+          <w:b/>
+          <w:bCs/>
+          <w:sz w:val="28"/>
+          <w:szCs w:val="28"/>
+        </w:rPr>
+        <w:t>Three recommendations for Implementing Cryptographic System to Improve</w:t>
+      </w:r>
+      <w:r>
+        <w:rPr>
+          <w:b/>
+          <w:bCs/>
+          <w:sz w:val="28"/>
+          <w:szCs w:val="28"/>
+        </w:rPr>
+        <w:t xml:space="preserve"> </w:t>
+      </w:r>
+      <w:r>
+        <w:rPr>
+          <w:b/>
+          <w:bCs/>
+          <w:sz w:val="28"/>
+          <w:szCs w:val="28"/>
+        </w:rPr>
+        <w:t>Security and Prevent Future Data Breaches.</w:t>
+      </w:r>
+    </w:p>
+    <w:p>
+      <w:pPr>
+        <w:rPr>
+          <w:b/>
+          <w:bCs/>
+          <w:sz w:val="24"/>
+          <w:szCs w:val="24"/>
+        </w:rPr>
+      </w:pPr>
+      <w:r>
+        <w:rPr>
+          <w:b/>
+          <w:bCs/>
+          <w:sz w:val="24"/>
+          <w:szCs w:val="24"/>
+        </w:rPr>
+        <w:t>Three recommendations for Implementing Cryptographic Systems:</w:t>
+      </w:r>
+    </w:p>
+    <w:p>
+      <w:pPr>
+        <w:pStyle w:val="Akapitzlist"/>
+        <w:numPr>
+          <w:ilvl w:val="0"/>
+          <w:numId w:val="13"/>
+        </w:numPr>
+      </w:pPr>
+      <w:r>
+        <w:rPr>
+          <w:b/>
+          <w:bCs/>
+        </w:rPr>
+        <w:t>Deploy End-to-End Encryption (E2EE) for Communication</w:t>
+      </w:r>
+      <w:r>
+        <w:rPr>
+          <w:b/>
+          <w:bCs/>
+        </w:rPr>
+        <w:t xml:space="preserve"> [1]</w:t>
+      </w:r>
+    </w:p>
+    <w:p>
+      <w:pPr>
+        <w:pStyle w:val="Akapitzlist"/>
+      </w:pPr>
+      <w:r>
+        <w:t xml:space="preserve">To secure communication, company instead of focusing only on the securing servers, they should deploy systems where decryption keys are located only on the users’ terminal devices. </w:t>
+      </w:r>
+    </w:p>
+    <w:p>
+      <w:pPr>
+        <w:pStyle w:val="Akapitzlist"/>
+      </w:pPr>
+      <w:r>
+        <w:t xml:space="preserve">To protect personal data and sensitive information should be implementing end-to-end encryption. </w:t>
+      </w:r>
+      <w:r>
+        <w:br/>
+        <w:t xml:space="preserve">E2EE method is widely used in secure communication, password management, data storage, file sharing. Implementation of instant messaging and collaboration tools, instead standard, unencrypted channel e.g. Signal for Enterprise, </w:t>
+      </w:r>
+      <w:r>
+        <w:t>Wickr Enterprise</w:t>
+      </w:r>
+      <w:r>
+        <w:t>.</w:t>
+      </w:r>
+    </w:p>
+    <w:p>
+      <w:pPr>
+        <w:pStyle w:val="Akapitzlist"/>
+      </w:pPr>
+    </w:p>
+    <w:p>
+      <w:pPr>
+        <w:pStyle w:val="Akapitzlist"/>
+        <w:numPr>
+          <w:ilvl w:val="0"/>
+          <w:numId w:val="13"/>
+        </w:numPr>
+      </w:pPr>
+      <w:r>
+        <w:rPr>
+          <w:b/>
+          <w:bCs/>
+        </w:rPr>
+        <w:t>Implement Salted Hashing for Credential Protection</w:t>
+      </w:r>
+      <w:r>
+        <w:rPr>
+          <w:b/>
+          <w:bCs/>
+        </w:rPr>
+        <w:t xml:space="preserve"> [2]</w:t>
+      </w:r>
+    </w:p>
+    <w:p>
+      <w:pPr>
+        <w:pStyle w:val="Akapitzlist"/>
+      </w:pPr>
+      <w:r>
+        <w:t xml:space="preserve">Another critical security measure is the implementation of salted hashing. </w:t>
+      </w:r>
+      <w:r>
+        <w:br/>
+        <w:t>Hashing ensures that sensitive data has not been tampered with, while salting adds random data before the password. Salting also ensures that the same password is hashed differently.</w:t>
+      </w:r>
+    </w:p>
+    <w:p>
+      <w:pPr>
+        <w:pStyle w:val="Akapitzlist"/>
+      </w:pPr>
+    </w:p>
+    <w:p>
+      <w:pPr>
+        <w:pStyle w:val="Akapitzlist"/>
+        <w:numPr>
+          <w:ilvl w:val="0"/>
+          <w:numId w:val="13"/>
+        </w:numPr>
+      </w:pPr>
+      <w:r>
+        <w:rPr>
+          <w:b/>
+          <w:bCs/>
+        </w:rPr>
+        <w:t> Secure Data at Rest with KMS and HSM</w:t>
+      </w:r>
+      <w:r>
+        <w:rPr>
+          <w:b/>
+          <w:bCs/>
+        </w:rPr>
+        <w:t xml:space="preserve"> [3]</w:t>
+      </w:r>
+    </w:p>
+    <w:p>
+      <w:pPr>
+        <w:ind w:left="720"/>
+      </w:pPr>
+      <w:r>
+        <w:t xml:space="preserve">We come to the place where data is currently stored. It can be on a </w:t>
+      </w:r>
+      <w:proofErr w:type="gramStart"/>
+      <w:r>
+        <w:t>computer’s</w:t>
+      </w:r>
+      <w:proofErr w:type="gramEnd"/>
+      <w:r>
+        <w:t xml:space="preserve"> or server’s hard disk. This is referred to as “Data at Rest”. Securing data typically involves encryption, where the cryptographic keys are managed by a Key Management Service (KMS), </w:t>
+      </w:r>
+      <w:r>
+        <w:t>which controls the key lifecycle,</w:t>
+      </w:r>
+      <w:r>
+        <w:t xml:space="preserve"> while most critical keys are generated and stored in a Hardware Security Module (HSM), </w:t>
+      </w:r>
+      <w:r>
+        <w:t>a dedicated hardware device that provides strong physical and logical isolation for cryptographic operations.</w:t>
+      </w:r>
+    </w:p>
+    <w:p/>
+    <w:p/>
+    <w:p>
+      <w:pPr>
+        <w:pStyle w:val="Akapitzlist"/>
+        <w:numPr>
+          <w:ilvl w:val="0"/>
+          <w:numId w:val="12"/>
+        </w:numPr>
+        <w:rPr>
+          <w:sz w:val="24"/>
+          <w:szCs w:val="24"/>
+        </w:rPr>
+      </w:pPr>
+      <w:r>
+        <w:rPr>
+          <w:sz w:val="24"/>
+          <w:szCs w:val="24"/>
+        </w:rPr>
+        <w:t>What is end-to-end encryption (E2EE). IBM. Available:</w:t>
+      </w:r>
+    </w:p>
+    <w:p>
+      <w:pPr>
+        <w:pStyle w:val="Akapitzlist"/>
+        <w:rPr>
+          <w:sz w:val="24"/>
+          <w:szCs w:val="24"/>
+        </w:rPr>
+      </w:pPr>
+      <w:hyperlink r:id="rId9" w:history="1">
+        <w:r>
+          <w:rPr>
+            <w:rStyle w:val="Hipercze"/>
+            <w:sz w:val="24"/>
+            <w:szCs w:val="24"/>
+          </w:rPr>
+          <w:t>https://www.ibm.com/think/topics/end-to-end-encryption</w:t>
+        </w:r>
+      </w:hyperlink>
+    </w:p>
+    <w:p>
+      <w:pPr>
+        <w:pStyle w:val="Akapitzlist"/>
+        <w:numPr>
+          <w:ilvl w:val="0"/>
+          <w:numId w:val="12"/>
+        </w:numPr>
+      </w:pPr>
+      <w:r>
+        <w:lastRenderedPageBreak/>
+        <w:t>Hashing functions</w:t>
+      </w:r>
+      <w:r>
+        <w:t xml:space="preserve">. IBM. Last updated: 2021-03-08. Available: </w:t>
+      </w:r>
+      <w:hyperlink r:id="rId10" w:history="1">
+        <w:r>
+          <w:rPr>
+            <w:rStyle w:val="Hipercze"/>
+          </w:rPr>
+          <w:t>https://www.ibm.com/docs/en/psfa/7.1.0?topic=toolkit-hashing-functions</w:t>
+        </w:r>
+      </w:hyperlink>
+    </w:p>
+    <w:p>
+      <w:pPr>
+        <w:pStyle w:val="Akapitzlist"/>
+        <w:numPr>
+          <w:ilvl w:val="0"/>
+          <w:numId w:val="12"/>
+        </w:numPr>
+      </w:pPr>
+      <w:r>
+        <w:t xml:space="preserve">How Enterprise Data Security Can Be Achieved with KMS and HSM. </w:t>
+      </w:r>
+      <w:proofErr w:type="spellStart"/>
+      <w:r>
+        <w:t>Fortanix</w:t>
+      </w:r>
+      <w:proofErr w:type="spellEnd"/>
+      <w:r>
+        <w:t xml:space="preserve">. Last updated: 2025-07-16. Available: </w:t>
+      </w:r>
+      <w:r>
+        <w:t>https://www.fortanix.com/blog/how-to-achieve-enterprise-data-security-with-kms-hsm</w:t>
+      </w:r>
     </w:p>
     <w:p>
       <w:pPr>
@@ -1678,6 +2069,15 @@
           <w:szCs w:val="24"/>
         </w:rPr>
       </w:pPr>
+      <w:r>
+        <w:rPr>
+          <w:b/>
+          <w:bCs/>
+          <w:sz w:val="24"/>
+          <w:szCs w:val="24"/>
+        </w:rPr>
+        <w:br/>
+      </w:r>
     </w:p>
     <w:p>
       <w:pPr>
@@ -1687,21 +2087,46 @@
           <w:numId w:val="0"/>
         </w:numPr>
         <w:ind w:left="432" w:hanging="432"/>
-        <w:rPr>
-          <w:b/>
-          <w:bCs/>
-          <w:sz w:val="24"/>
-          <w:szCs w:val="24"/>
-        </w:rPr>
-      </w:pPr>
-      <w:r>
-        <w:rPr>
-          <w:b/>
-          <w:bCs/>
-          <w:sz w:val="24"/>
-          <w:szCs w:val="24"/>
-        </w:rPr>
-        <w:t>Three recommendations for Implementing Cryptographic System to Improve Security and Prevent Future Data Breaches.</w:t>
+        <w:jc w:val="center"/>
+        <w:rPr>
+          <w:b/>
+          <w:bCs/>
+          <w:sz w:val="36"/>
+          <w:szCs w:val="36"/>
+        </w:rPr>
+      </w:pPr>
+      <w:r>
+        <w:rPr>
+          <w:b/>
+          <w:bCs/>
+          <w:sz w:val="36"/>
+          <w:szCs w:val="36"/>
+        </w:rPr>
+        <w:t>Task B</w:t>
+      </w:r>
+    </w:p>
+    <w:p>
+      <w:pPr>
+        <w:pStyle w:val="Nagwek11"/>
+        <w:numPr>
+          <w:ilvl w:val="0"/>
+          <w:numId w:val="7"/>
+        </w:numPr>
+        <w:rPr>
+          <w:b/>
+          <w:bCs/>
+          <w:sz w:val="24"/>
+          <w:szCs w:val="24"/>
+        </w:rPr>
+      </w:pPr>
+      <w:r>
+        <w:rPr>
+          <w:b/>
+          <w:bCs/>
+          <w:sz w:val="24"/>
+          <w:szCs w:val="24"/>
+        </w:rPr>
+        <w:t>Overview of Languages used</w:t>
       </w:r>
     </w:p>
     <w:p>
@@ -1711,22 +2136,90 @@
           <w:ilvl w:val="0"/>
           <w:numId w:val="0"/>
         </w:numPr>
-        <w:ind w:left="1224"/>
-        <w:rPr>
-          <w:b/>
-          <w:bCs/>
-          <w:sz w:val="24"/>
-          <w:szCs w:val="24"/>
-        </w:rPr>
-      </w:pPr>
-      <w:r>
-        <w:rPr>
-          <w:b/>
-          <w:bCs/>
-          <w:sz w:val="24"/>
-          <w:szCs w:val="24"/>
-        </w:rPr>
-        <w:br/>
+        <w:ind w:left="360"/>
+        <w:rPr>
+          <w:sz w:val="24"/>
+          <w:szCs w:val="24"/>
+        </w:rPr>
+      </w:pPr>
+      <w:r>
+        <w:rPr>
+          <w:b/>
+          <w:bCs/>
+          <w:sz w:val="24"/>
+          <w:szCs w:val="24"/>
+        </w:rPr>
+        <w:t>HTML</w:t>
+      </w:r>
+      <w:r>
+        <w:rPr>
+          <w:sz w:val="24"/>
+          <w:szCs w:val="24"/>
+        </w:rPr>
+        <w:t xml:space="preserve"> stands for Hyper Text Markup Lan</w:t>
+      </w:r>
+      <w:r>
+        <w:rPr>
+          <w:sz w:val="24"/>
+          <w:szCs w:val="24"/>
+        </w:rPr>
+        <w:t xml:space="preserve">guage. </w:t>
+      </w:r>
+      <w:r>
+        <w:rPr>
+          <w:sz w:val="24"/>
+          <w:szCs w:val="24"/>
+        </w:rPr>
+        <w:t>The main role of HTML is a structure and cont</w:t>
+      </w:r>
+      <w:r>
+        <w:rPr>
+          <w:sz w:val="24"/>
+          <w:szCs w:val="24"/>
+        </w:rPr>
+        <w:t xml:space="preserve">ent of webpage. It </w:t>
+      </w:r>
+      <w:r>
+        <w:rPr>
+          <w:sz w:val="24"/>
+          <w:szCs w:val="24"/>
+        </w:rPr>
+        <w:t>defines</w:t>
+      </w:r>
+      <w:r>
+        <w:rPr>
+          <w:sz w:val="24"/>
+          <w:szCs w:val="24"/>
+        </w:rPr>
+        <w:t xml:space="preserve"> </w:t>
+      </w:r>
+      <w:r>
+        <w:rPr>
+          <w:sz w:val="24"/>
+          <w:szCs w:val="24"/>
+        </w:rPr>
+        <w:t xml:space="preserve">elements such as headers, </w:t>
+      </w:r>
+      <w:r>
+        <w:rPr>
+          <w:sz w:val="24"/>
+          <w:szCs w:val="24"/>
+        </w:rPr>
+        <w:t>paragraphs</w:t>
+      </w:r>
+      <w:r>
+        <w:rPr>
+          <w:sz w:val="24"/>
+          <w:szCs w:val="24"/>
+        </w:rPr>
+        <w:t>, images</w:t>
+      </w:r>
+      <w:r>
+        <w:rPr>
+          <w:sz w:val="24"/>
+          <w:szCs w:val="24"/>
+        </w:rPr>
+        <w:t>, forms.</w:t>
       </w:r>
     </w:p>
     <w:p>
@@ -1736,6 +2229,646 @@
           <w:ilvl w:val="0"/>
           <w:numId w:val="0"/>
         </w:numPr>
+        <w:ind w:left="360"/>
+        <w:rPr>
+          <w:sz w:val="24"/>
+          <w:szCs w:val="24"/>
+        </w:rPr>
+      </w:pPr>
+      <w:r>
+        <w:rPr>
+          <w:b/>
+          <w:bCs/>
+          <w:sz w:val="24"/>
+          <w:szCs w:val="24"/>
+        </w:rPr>
+        <w:t xml:space="preserve">CSS </w:t>
+      </w:r>
+      <w:r>
+        <w:rPr>
+          <w:sz w:val="24"/>
+          <w:szCs w:val="24"/>
+        </w:rPr>
+        <w:t xml:space="preserve">stands for Cascading Style Sheets. </w:t>
+      </w:r>
+      <w:r>
+        <w:rPr>
+          <w:sz w:val="24"/>
+          <w:szCs w:val="24"/>
+        </w:rPr>
+        <w:t xml:space="preserve">CSS </w:t>
+      </w:r>
+      <w:r>
+        <w:rPr>
+          <w:sz w:val="24"/>
+          <w:szCs w:val="24"/>
+        </w:rPr>
+        <w:t xml:space="preserve">is used to define </w:t>
+      </w:r>
+      <w:r>
+        <w:rPr>
+          <w:sz w:val="24"/>
+          <w:szCs w:val="24"/>
+        </w:rPr>
+        <w:t xml:space="preserve">styles for a web pages. </w:t>
+      </w:r>
+      <w:r>
+        <w:rPr>
+          <w:sz w:val="24"/>
+          <w:szCs w:val="24"/>
+        </w:rPr>
+        <w:t xml:space="preserve">It </w:t>
+      </w:r>
+      <w:r>
+        <w:rPr>
+          <w:sz w:val="24"/>
+          <w:szCs w:val="24"/>
+        </w:rPr>
+        <w:t>creates</w:t>
+      </w:r>
+      <w:r>
+        <w:rPr>
+          <w:sz w:val="24"/>
+          <w:szCs w:val="24"/>
+        </w:rPr>
+        <w:t xml:space="preserve"> layouts</w:t>
+      </w:r>
+      <w:r>
+        <w:rPr>
+          <w:sz w:val="24"/>
+          <w:szCs w:val="24"/>
+        </w:rPr>
+        <w:t>, such as grid layouts</w:t>
+      </w:r>
+      <w:r>
+        <w:rPr>
+          <w:sz w:val="24"/>
+          <w:szCs w:val="24"/>
+        </w:rPr>
+        <w:t xml:space="preserve">. </w:t>
+      </w:r>
+      <w:r>
+        <w:rPr>
+          <w:sz w:val="24"/>
+          <w:szCs w:val="24"/>
+        </w:rPr>
+        <w:t xml:space="preserve">CSS can be used to animations. </w:t>
+      </w:r>
+    </w:p>
+    <w:p>
+      <w:pPr>
+        <w:pStyle w:val="Nagwek11"/>
+        <w:numPr>
+          <w:ilvl w:val="0"/>
+          <w:numId w:val="0"/>
+        </w:numPr>
+        <w:ind w:left="360"/>
+        <w:rPr>
+          <w:sz w:val="24"/>
+          <w:szCs w:val="24"/>
+        </w:rPr>
+      </w:pPr>
+      <w:r>
+        <w:rPr>
+          <w:b/>
+          <w:bCs/>
+          <w:sz w:val="24"/>
+          <w:szCs w:val="24"/>
+        </w:rPr>
+        <w:t>JavaScript</w:t>
+      </w:r>
+      <w:r>
+        <w:rPr>
+          <w:b/>
+          <w:bCs/>
+          <w:sz w:val="24"/>
+          <w:szCs w:val="24"/>
+        </w:rPr>
+        <w:t xml:space="preserve"> </w:t>
+      </w:r>
+      <w:r>
+        <w:rPr>
+          <w:sz w:val="24"/>
+          <w:szCs w:val="24"/>
+        </w:rPr>
+        <w:t xml:space="preserve">is </w:t>
+      </w:r>
+      <w:r>
+        <w:rPr>
+          <w:sz w:val="24"/>
+          <w:szCs w:val="24"/>
+        </w:rPr>
+        <w:t>a client-side scripting language.</w:t>
+      </w:r>
+      <w:r>
+        <w:rPr>
+          <w:sz w:val="24"/>
+          <w:szCs w:val="24"/>
+        </w:rPr>
+        <w:t xml:space="preserve"> </w:t>
+      </w:r>
+      <w:r>
+        <w:rPr>
+          <w:sz w:val="24"/>
+          <w:szCs w:val="24"/>
+        </w:rPr>
+        <w:t xml:space="preserve">JS enables to </w:t>
+      </w:r>
+      <w:r>
+        <w:rPr>
+          <w:sz w:val="24"/>
+          <w:szCs w:val="24"/>
+        </w:rPr>
+        <w:t>create dynamically updating content</w:t>
+      </w:r>
+      <w:r>
+        <w:rPr>
+          <w:sz w:val="24"/>
+          <w:szCs w:val="24"/>
+        </w:rPr>
+        <w:t>, animate images,</w:t>
+      </w:r>
+      <w:r>
+        <w:rPr>
+          <w:sz w:val="24"/>
+          <w:szCs w:val="24"/>
+        </w:rPr>
+        <w:t xml:space="preserve"> </w:t>
+      </w:r>
+      <w:r>
+        <w:rPr>
+          <w:sz w:val="24"/>
+          <w:szCs w:val="24"/>
+        </w:rPr>
+        <w:t>make</w:t>
+      </w:r>
+      <w:r>
+        <w:rPr>
+          <w:sz w:val="24"/>
+          <w:szCs w:val="24"/>
+        </w:rPr>
+        <w:t xml:space="preserve"> calculations</w:t>
+      </w:r>
+      <w:r>
+        <w:rPr>
+          <w:sz w:val="24"/>
+          <w:szCs w:val="24"/>
+        </w:rPr>
+        <w:t xml:space="preserve">. </w:t>
+      </w:r>
+    </w:p>
+    <w:p>
+      <w:pPr>
+        <w:pStyle w:val="Nagwek11"/>
+        <w:numPr>
+          <w:ilvl w:val="0"/>
+          <w:numId w:val="0"/>
+        </w:numPr>
+        <w:ind w:left="432" w:hanging="72"/>
+        <w:rPr>
+          <w:sz w:val="24"/>
+          <w:szCs w:val="24"/>
+        </w:rPr>
+      </w:pPr>
+      <w:r>
+        <w:rPr>
+          <w:b/>
+          <w:bCs/>
+          <w:sz w:val="24"/>
+          <w:szCs w:val="24"/>
+        </w:rPr>
+        <w:t>PHP</w:t>
+      </w:r>
+      <w:r>
+        <w:rPr>
+          <w:sz w:val="24"/>
+          <w:szCs w:val="24"/>
+        </w:rPr>
+        <w:t xml:space="preserve"> </w:t>
+      </w:r>
+      <w:r>
+        <w:rPr>
+          <w:sz w:val="24"/>
+          <w:szCs w:val="24"/>
+        </w:rPr>
+        <w:t>(</w:t>
+      </w:r>
+      <w:r>
+        <w:rPr>
+          <w:sz w:val="24"/>
+          <w:szCs w:val="24"/>
+        </w:rPr>
+        <w:t>Hypertext Preprocessor</w:t>
+      </w:r>
+      <w:r>
+        <w:rPr>
+          <w:sz w:val="24"/>
+          <w:szCs w:val="24"/>
+        </w:rPr>
+        <w:t xml:space="preserve">) </w:t>
+      </w:r>
+      <w:r>
+        <w:rPr>
+          <w:sz w:val="24"/>
+          <w:szCs w:val="24"/>
+        </w:rPr>
+        <w:t xml:space="preserve">is server-side </w:t>
+      </w:r>
+      <w:r>
+        <w:rPr>
+          <w:sz w:val="24"/>
+          <w:szCs w:val="24"/>
+        </w:rPr>
+        <w:t>scripting</w:t>
+      </w:r>
+      <w:r>
+        <w:rPr>
+          <w:sz w:val="24"/>
+          <w:szCs w:val="24"/>
+        </w:rPr>
+        <w:t xml:space="preserve"> language that Is suited for web development. </w:t>
+      </w:r>
+      <w:r>
+        <w:rPr>
+          <w:sz w:val="24"/>
+          <w:szCs w:val="24"/>
+        </w:rPr>
+        <w:t xml:space="preserve">Its main role is </w:t>
+      </w:r>
+      <w:r>
+        <w:rPr>
+          <w:sz w:val="24"/>
+          <w:szCs w:val="24"/>
+        </w:rPr>
+        <w:t xml:space="preserve">to create dynamic websites those </w:t>
+      </w:r>
+      <w:r>
+        <w:rPr>
+          <w:sz w:val="24"/>
+          <w:szCs w:val="24"/>
+        </w:rPr>
+        <w:t>that response to user actions, retrieve data from datab</w:t>
+      </w:r>
+      <w:r>
+        <w:rPr>
+          <w:sz w:val="24"/>
+          <w:szCs w:val="24"/>
+        </w:rPr>
+        <w:t xml:space="preserve">ase etc. </w:t>
+      </w:r>
+      <w:r>
+        <w:rPr>
+          <w:sz w:val="24"/>
+          <w:szCs w:val="24"/>
+        </w:rPr>
+        <w:t xml:space="preserve"> </w:t>
+      </w:r>
+    </w:p>
+    <w:p>
+      <w:pPr>
+        <w:pStyle w:val="Nagwek11"/>
+        <w:numPr>
+          <w:ilvl w:val="0"/>
+          <w:numId w:val="7"/>
+        </w:numPr>
+        <w:rPr>
+          <w:b/>
+          <w:bCs/>
+          <w:sz w:val="24"/>
+          <w:szCs w:val="24"/>
+        </w:rPr>
+      </w:pPr>
+      <w:r>
+        <w:rPr>
+          <w:b/>
+          <w:bCs/>
+          <w:sz w:val="24"/>
+          <w:szCs w:val="24"/>
+        </w:rPr>
+        <w:t>Application Development</w:t>
+      </w:r>
+    </w:p>
+    <w:p>
+      <w:pPr>
+        <w:pStyle w:val="Nagwek11"/>
+        <w:numPr>
+          <w:ilvl w:val="1"/>
+          <w:numId w:val="7"/>
+        </w:numPr>
+        <w:rPr>
+          <w:sz w:val="24"/>
+          <w:szCs w:val="24"/>
+        </w:rPr>
+      </w:pPr>
+      <w:r>
+        <w:rPr>
+          <w:sz w:val="24"/>
+          <w:szCs w:val="24"/>
+        </w:rPr>
+        <w:t>Description of each language during developing the web application.</w:t>
+      </w:r>
+    </w:p>
+    <w:p>
+      <w:pPr>
+        <w:pStyle w:val="Nagwek11"/>
+        <w:numPr>
+          <w:ilvl w:val="2"/>
+          <w:numId w:val="7"/>
+        </w:numPr>
+        <w:rPr>
+          <w:sz w:val="24"/>
+          <w:szCs w:val="24"/>
+        </w:rPr>
+      </w:pPr>
+      <w:r>
+        <w:rPr>
+          <w:sz w:val="24"/>
+          <w:szCs w:val="24"/>
+        </w:rPr>
+        <w:t>HTML</w:t>
+      </w:r>
+    </w:p>
+    <w:p>
+      <w:pPr>
+        <w:pStyle w:val="Nagwek11"/>
+        <w:numPr>
+          <w:ilvl w:val="2"/>
+          <w:numId w:val="7"/>
+        </w:numPr>
+        <w:rPr>
+          <w:sz w:val="24"/>
+          <w:szCs w:val="24"/>
+        </w:rPr>
+      </w:pPr>
+      <w:r>
+        <w:rPr>
+          <w:sz w:val="24"/>
+          <w:szCs w:val="24"/>
+        </w:rPr>
+        <w:t>CSS</w:t>
+      </w:r>
+    </w:p>
+    <w:p>
+      <w:pPr>
+        <w:pStyle w:val="Nagwek11"/>
+        <w:numPr>
+          <w:ilvl w:val="2"/>
+          <w:numId w:val="7"/>
+        </w:numPr>
+        <w:rPr>
+          <w:sz w:val="24"/>
+          <w:szCs w:val="24"/>
+        </w:rPr>
+      </w:pPr>
+      <w:r>
+        <w:rPr>
+          <w:sz w:val="24"/>
+          <w:szCs w:val="24"/>
+        </w:rPr>
+        <w:t>JavaScript</w:t>
+      </w:r>
+    </w:p>
+    <w:p>
+      <w:pPr>
+        <w:pStyle w:val="Nagwek11"/>
+        <w:numPr>
+          <w:ilvl w:val="2"/>
+          <w:numId w:val="7"/>
+        </w:numPr>
+        <w:rPr>
+          <w:sz w:val="24"/>
+          <w:szCs w:val="24"/>
+        </w:rPr>
+      </w:pPr>
+      <w:r>
+        <w:rPr>
+          <w:sz w:val="24"/>
+          <w:szCs w:val="24"/>
+        </w:rPr>
+        <w:t>PHP – Server-side:</w:t>
+      </w:r>
+    </w:p>
+    <w:p>
+      <w:pPr>
+        <w:pStyle w:val="Nagwek11"/>
+        <w:numPr>
+          <w:ilvl w:val="0"/>
+          <w:numId w:val="7"/>
+        </w:numPr>
+        <w:rPr>
+          <w:b/>
+          <w:bCs/>
+          <w:sz w:val="24"/>
+          <w:szCs w:val="24"/>
+        </w:rPr>
+      </w:pPr>
+      <w:r>
+        <w:rPr>
+          <w:b/>
+          <w:bCs/>
+          <w:sz w:val="24"/>
+          <w:szCs w:val="24"/>
+        </w:rPr>
+        <w:t>Functionality</w:t>
+      </w:r>
+    </w:p>
+    <w:p>
+      <w:pPr>
+        <w:pStyle w:val="Nagwek11"/>
+        <w:numPr>
+          <w:ilvl w:val="1"/>
+          <w:numId w:val="7"/>
+        </w:numPr>
+        <w:rPr>
+          <w:sz w:val="24"/>
+          <w:szCs w:val="24"/>
+        </w:rPr>
+      </w:pPr>
+      <w:r>
+        <w:rPr>
+          <w:sz w:val="24"/>
+          <w:szCs w:val="24"/>
+        </w:rPr>
+        <w:t>Descriptions of the core features of to-do list application.</w:t>
+      </w:r>
+    </w:p>
+    <w:p>
+      <w:pPr>
+        <w:pStyle w:val="Nagwek11"/>
+        <w:numPr>
+          <w:ilvl w:val="2"/>
+          <w:numId w:val="7"/>
+        </w:numPr>
+        <w:rPr>
+          <w:sz w:val="24"/>
+          <w:szCs w:val="24"/>
+        </w:rPr>
+      </w:pPr>
+      <w:r>
+        <w:rPr>
+          <w:sz w:val="24"/>
+          <w:szCs w:val="24"/>
+        </w:rPr>
+        <w:t>Adding</w:t>
+      </w:r>
+    </w:p>
+    <w:p>
+      <w:pPr>
+        <w:pStyle w:val="Nagwek11"/>
+        <w:numPr>
+          <w:ilvl w:val="2"/>
+          <w:numId w:val="7"/>
+        </w:numPr>
+        <w:rPr>
+          <w:sz w:val="24"/>
+          <w:szCs w:val="24"/>
+        </w:rPr>
+      </w:pPr>
+      <w:r>
+        <w:rPr>
+          <w:sz w:val="24"/>
+          <w:szCs w:val="24"/>
+        </w:rPr>
+        <w:t>Editing</w:t>
+      </w:r>
+    </w:p>
+    <w:p>
+      <w:pPr>
+        <w:pStyle w:val="Nagwek11"/>
+        <w:numPr>
+          <w:ilvl w:val="2"/>
+          <w:numId w:val="7"/>
+        </w:numPr>
+        <w:rPr>
+          <w:sz w:val="24"/>
+          <w:szCs w:val="24"/>
+        </w:rPr>
+      </w:pPr>
+      <w:r>
+        <w:rPr>
+          <w:sz w:val="24"/>
+          <w:szCs w:val="24"/>
+        </w:rPr>
+        <w:t>Deleting</w:t>
+      </w:r>
+    </w:p>
+    <w:p>
+      <w:pPr>
+        <w:pStyle w:val="Nagwek11"/>
+        <w:numPr>
+          <w:ilvl w:val="1"/>
+          <w:numId w:val="7"/>
+        </w:numPr>
+        <w:rPr>
+          <w:sz w:val="24"/>
+          <w:szCs w:val="24"/>
+        </w:rPr>
+      </w:pPr>
+      <w:r>
+        <w:rPr>
+          <w:sz w:val="24"/>
+          <w:szCs w:val="24"/>
+        </w:rPr>
+        <w:t>Data Storage and Management</w:t>
+      </w:r>
+    </w:p>
+    <w:p>
+      <w:pPr>
+        <w:pStyle w:val="Nagwek11"/>
+        <w:numPr>
+          <w:ilvl w:val="0"/>
+          <w:numId w:val="7"/>
+        </w:numPr>
+        <w:rPr>
+          <w:b/>
+          <w:bCs/>
+          <w:sz w:val="24"/>
+          <w:szCs w:val="24"/>
+        </w:rPr>
+      </w:pPr>
+      <w:r>
+        <w:rPr>
+          <w:b/>
+          <w:bCs/>
+          <w:sz w:val="24"/>
+          <w:szCs w:val="24"/>
+        </w:rPr>
+        <w:t xml:space="preserve">Code </w:t>
+      </w:r>
+      <w:r>
+        <w:rPr>
+          <w:b/>
+          <w:bCs/>
+          <w:sz w:val="24"/>
+          <w:szCs w:val="24"/>
+        </w:rPr>
+        <w:t>Snippets</w:t>
+      </w:r>
+      <w:r>
+        <w:rPr>
+          <w:b/>
+          <w:bCs/>
+          <w:sz w:val="24"/>
+          <w:szCs w:val="24"/>
+        </w:rPr>
+        <w:t>:</w:t>
+      </w:r>
+    </w:p>
+    <w:p>
+      <w:pPr>
+        <w:pStyle w:val="Nagwek11"/>
+        <w:numPr>
+          <w:ilvl w:val="0"/>
+          <w:numId w:val="0"/>
+        </w:numPr>
+        <w:ind w:left="432" w:hanging="432"/>
+        <w:rPr>
+          <w:b/>
+          <w:bCs/>
+          <w:sz w:val="24"/>
+          <w:szCs w:val="24"/>
+        </w:rPr>
+      </w:pPr>
+    </w:p>
+    <w:p>
+      <w:pPr>
+        <w:pStyle w:val="Nagwek11"/>
+        <w:numPr>
+          <w:ilvl w:val="0"/>
+          <w:numId w:val="0"/>
+        </w:numPr>
+        <w:ind w:left="432" w:hanging="432"/>
+        <w:rPr>
+          <w:b/>
+          <w:bCs/>
+          <w:sz w:val="24"/>
+          <w:szCs w:val="24"/>
+        </w:rPr>
+      </w:pPr>
+    </w:p>
+    <w:p>
+      <w:pPr>
+        <w:pStyle w:val="Nagwek11"/>
+        <w:numPr>
+          <w:ilvl w:val="0"/>
+          <w:numId w:val="0"/>
+        </w:numPr>
+        <w:ind w:left="432" w:hanging="432"/>
+        <w:rPr>
+          <w:b/>
+          <w:bCs/>
+          <w:sz w:val="24"/>
+          <w:szCs w:val="24"/>
+        </w:rPr>
+      </w:pPr>
+    </w:p>
+    <w:p>
+      <w:pPr>
+        <w:pStyle w:val="Nagwek11"/>
+        <w:numPr>
+          <w:ilvl w:val="0"/>
+          <w:numId w:val="0"/>
+        </w:numPr>
         <w:ind w:left="432" w:hanging="432"/>
         <w:jc w:val="center"/>
         <w:rPr>
@@ -1752,402 +2885,7 @@
           <w:sz w:val="36"/>
           <w:szCs w:val="36"/>
         </w:rPr>
-        <w:t>Task B</w:t>
-      </w:r>
-    </w:p>
-    <w:p>
-      <w:pPr>
-        <w:pStyle w:val="Nagwek11"/>
-        <w:numPr>
-          <w:ilvl w:val="0"/>
-          <w:numId w:val="7"/>
-        </w:numPr>
-        <w:rPr>
-          <w:b/>
-          <w:bCs/>
-          <w:sz w:val="24"/>
-          <w:szCs w:val="24"/>
-        </w:rPr>
-      </w:pPr>
-      <w:r>
-        <w:rPr>
-          <w:b/>
-          <w:bCs/>
-          <w:sz w:val="24"/>
-          <w:szCs w:val="24"/>
-        </w:rPr>
-        <w:t>Overview of Languages used</w:t>
-      </w:r>
-    </w:p>
-    <w:p>
-      <w:pPr>
-        <w:pStyle w:val="Nagwek11"/>
-        <w:numPr>
-          <w:ilvl w:val="1"/>
-          <w:numId w:val="7"/>
-        </w:numPr>
-        <w:rPr>
-          <w:sz w:val="24"/>
-          <w:szCs w:val="24"/>
-        </w:rPr>
-      </w:pPr>
-      <w:r>
-        <w:rPr>
-          <w:sz w:val="24"/>
-          <w:szCs w:val="24"/>
-        </w:rPr>
-        <w:t xml:space="preserve">Role of HTML: </w:t>
-      </w:r>
-    </w:p>
-    <w:p>
-      <w:pPr>
-        <w:pStyle w:val="Nagwek11"/>
-        <w:numPr>
-          <w:ilvl w:val="1"/>
-          <w:numId w:val="7"/>
-        </w:numPr>
-        <w:rPr>
-          <w:sz w:val="24"/>
-          <w:szCs w:val="24"/>
-        </w:rPr>
-      </w:pPr>
-      <w:r>
-        <w:rPr>
-          <w:sz w:val="24"/>
-          <w:szCs w:val="24"/>
-        </w:rPr>
-        <w:t>Role of CSS:</w:t>
-      </w:r>
-    </w:p>
-    <w:p>
-      <w:pPr>
-        <w:pStyle w:val="Nagwek11"/>
-        <w:numPr>
-          <w:ilvl w:val="1"/>
-          <w:numId w:val="7"/>
-        </w:numPr>
-        <w:rPr>
-          <w:sz w:val="24"/>
-          <w:szCs w:val="24"/>
-        </w:rPr>
-      </w:pPr>
-      <w:r>
-        <w:rPr>
-          <w:sz w:val="24"/>
-          <w:szCs w:val="24"/>
-        </w:rPr>
-        <w:t>Role of JavaScript:</w:t>
-      </w:r>
-    </w:p>
-    <w:p>
-      <w:pPr>
-        <w:pStyle w:val="Nagwek11"/>
-        <w:numPr>
-          <w:ilvl w:val="1"/>
-          <w:numId w:val="7"/>
-        </w:numPr>
-        <w:rPr>
-          <w:sz w:val="24"/>
-          <w:szCs w:val="24"/>
-        </w:rPr>
-      </w:pPr>
-      <w:r>
-        <w:rPr>
-          <w:sz w:val="24"/>
-          <w:szCs w:val="24"/>
-        </w:rPr>
-        <w:t>Role of PHP:</w:t>
-      </w:r>
-    </w:p>
-    <w:p>
-      <w:pPr>
-        <w:pStyle w:val="Nagwek11"/>
-        <w:numPr>
-          <w:ilvl w:val="0"/>
-          <w:numId w:val="7"/>
-        </w:numPr>
-        <w:rPr>
-          <w:b/>
-          <w:bCs/>
-          <w:sz w:val="24"/>
-          <w:szCs w:val="24"/>
-        </w:rPr>
-      </w:pPr>
-      <w:r>
-        <w:rPr>
-          <w:b/>
-          <w:bCs/>
-          <w:sz w:val="24"/>
-          <w:szCs w:val="24"/>
-        </w:rPr>
-        <w:t>Application Development</w:t>
-      </w:r>
-    </w:p>
-    <w:p>
-      <w:pPr>
-        <w:pStyle w:val="Nagwek11"/>
-        <w:numPr>
-          <w:ilvl w:val="1"/>
-          <w:numId w:val="7"/>
-        </w:numPr>
-        <w:rPr>
-          <w:sz w:val="24"/>
-          <w:szCs w:val="24"/>
-        </w:rPr>
-      </w:pPr>
-      <w:r>
-        <w:rPr>
-          <w:sz w:val="24"/>
-          <w:szCs w:val="24"/>
-        </w:rPr>
-        <w:t>Description of each language during developing the web application.</w:t>
-      </w:r>
-    </w:p>
-    <w:p>
-      <w:pPr>
-        <w:pStyle w:val="Nagwek11"/>
-        <w:numPr>
-          <w:ilvl w:val="2"/>
-          <w:numId w:val="7"/>
-        </w:numPr>
-        <w:rPr>
-          <w:sz w:val="24"/>
-          <w:szCs w:val="24"/>
-        </w:rPr>
-      </w:pPr>
-      <w:r>
-        <w:rPr>
-          <w:sz w:val="24"/>
-          <w:szCs w:val="24"/>
-        </w:rPr>
-        <w:t>HTML</w:t>
-      </w:r>
-    </w:p>
-    <w:p>
-      <w:pPr>
-        <w:pStyle w:val="Nagwek11"/>
-        <w:numPr>
-          <w:ilvl w:val="2"/>
-          <w:numId w:val="7"/>
-        </w:numPr>
-        <w:rPr>
-          <w:sz w:val="24"/>
-          <w:szCs w:val="24"/>
-        </w:rPr>
-      </w:pPr>
-      <w:r>
-        <w:rPr>
-          <w:sz w:val="24"/>
-          <w:szCs w:val="24"/>
-        </w:rPr>
-        <w:t>CSS</w:t>
-      </w:r>
-    </w:p>
-    <w:p>
-      <w:pPr>
-        <w:pStyle w:val="Nagwek11"/>
-        <w:numPr>
-          <w:ilvl w:val="2"/>
-          <w:numId w:val="7"/>
-        </w:numPr>
-        <w:rPr>
-          <w:sz w:val="24"/>
-          <w:szCs w:val="24"/>
-        </w:rPr>
-      </w:pPr>
-      <w:r>
-        <w:rPr>
-          <w:sz w:val="24"/>
-          <w:szCs w:val="24"/>
-        </w:rPr>
-        <w:t>JavaScript</w:t>
-      </w:r>
-    </w:p>
-    <w:p>
-      <w:pPr>
-        <w:pStyle w:val="Nagwek11"/>
-        <w:numPr>
-          <w:ilvl w:val="2"/>
-          <w:numId w:val="7"/>
-        </w:numPr>
-        <w:rPr>
-          <w:sz w:val="24"/>
-          <w:szCs w:val="24"/>
-        </w:rPr>
-      </w:pPr>
-      <w:r>
-        <w:rPr>
-          <w:sz w:val="24"/>
-          <w:szCs w:val="24"/>
-        </w:rPr>
-        <w:t>PHP – Server-side:</w:t>
-      </w:r>
-    </w:p>
-    <w:p>
-      <w:pPr>
-        <w:pStyle w:val="Nagwek11"/>
-        <w:numPr>
-          <w:ilvl w:val="0"/>
-          <w:numId w:val="7"/>
-        </w:numPr>
-        <w:rPr>
-          <w:b/>
-          <w:bCs/>
-          <w:sz w:val="24"/>
-          <w:szCs w:val="24"/>
-        </w:rPr>
-      </w:pPr>
-      <w:r>
-        <w:rPr>
-          <w:b/>
-          <w:bCs/>
-          <w:sz w:val="24"/>
-          <w:szCs w:val="24"/>
-        </w:rPr>
-        <w:t>Functionality</w:t>
-      </w:r>
-    </w:p>
-    <w:p>
-      <w:pPr>
-        <w:pStyle w:val="Nagwek11"/>
-        <w:numPr>
-          <w:ilvl w:val="1"/>
-          <w:numId w:val="7"/>
-        </w:numPr>
-        <w:rPr>
-          <w:sz w:val="24"/>
-          <w:szCs w:val="24"/>
-        </w:rPr>
-      </w:pPr>
-      <w:r>
-        <w:rPr>
-          <w:sz w:val="24"/>
-          <w:szCs w:val="24"/>
-        </w:rPr>
-        <w:t>Descriptions of the core features of to-do list application.</w:t>
-      </w:r>
-    </w:p>
-    <w:p>
-      <w:pPr>
-        <w:pStyle w:val="Nagwek11"/>
-        <w:numPr>
-          <w:ilvl w:val="2"/>
-          <w:numId w:val="7"/>
-        </w:numPr>
-        <w:rPr>
-          <w:sz w:val="24"/>
-          <w:szCs w:val="24"/>
-        </w:rPr>
-      </w:pPr>
-      <w:r>
-        <w:rPr>
-          <w:sz w:val="24"/>
-          <w:szCs w:val="24"/>
-        </w:rPr>
-        <w:t>Adding</w:t>
-      </w:r>
-    </w:p>
-    <w:p>
-      <w:pPr>
-        <w:pStyle w:val="Nagwek11"/>
-        <w:numPr>
-          <w:ilvl w:val="2"/>
-          <w:numId w:val="7"/>
-        </w:numPr>
-        <w:rPr>
-          <w:sz w:val="24"/>
-          <w:szCs w:val="24"/>
-        </w:rPr>
-      </w:pPr>
-      <w:r>
-        <w:rPr>
-          <w:sz w:val="24"/>
-          <w:szCs w:val="24"/>
-        </w:rPr>
-        <w:t>Editing</w:t>
-      </w:r>
-    </w:p>
-    <w:p>
-      <w:pPr>
-        <w:pStyle w:val="Nagwek11"/>
-        <w:numPr>
-          <w:ilvl w:val="2"/>
-          <w:numId w:val="7"/>
-        </w:numPr>
-        <w:rPr>
-          <w:sz w:val="24"/>
-          <w:szCs w:val="24"/>
-        </w:rPr>
-      </w:pPr>
-      <w:r>
-        <w:rPr>
-          <w:sz w:val="24"/>
-          <w:szCs w:val="24"/>
-        </w:rPr>
-        <w:lastRenderedPageBreak/>
-        <w:t>Deleting</w:t>
-      </w:r>
-    </w:p>
-    <w:p>
-      <w:pPr>
-        <w:pStyle w:val="Nagwek11"/>
-        <w:numPr>
-          <w:ilvl w:val="1"/>
-          <w:numId w:val="7"/>
-        </w:numPr>
-        <w:rPr>
-          <w:sz w:val="24"/>
-          <w:szCs w:val="24"/>
-        </w:rPr>
-      </w:pPr>
-      <w:r>
-        <w:rPr>
-          <w:sz w:val="24"/>
-          <w:szCs w:val="24"/>
-        </w:rPr>
-        <w:t>Data Storage and Management</w:t>
-      </w:r>
-    </w:p>
-    <w:p>
-      <w:pPr>
-        <w:pStyle w:val="Nagwek11"/>
-        <w:numPr>
-          <w:ilvl w:val="0"/>
-          <w:numId w:val="7"/>
-        </w:numPr>
-        <w:rPr>
-          <w:b/>
-          <w:bCs/>
-          <w:sz w:val="24"/>
-          <w:szCs w:val="24"/>
-        </w:rPr>
-      </w:pPr>
-      <w:r>
-        <w:rPr>
-          <w:b/>
-          <w:bCs/>
-          <w:sz w:val="24"/>
-          <w:szCs w:val="24"/>
-        </w:rPr>
-        <w:t xml:space="preserve">Code </w:t>
-      </w:r>
-      <w:r>
-        <w:rPr>
-          <w:b/>
-          <w:bCs/>
-          <w:sz w:val="24"/>
-          <w:szCs w:val="24"/>
-        </w:rPr>
-        <w:t>Snippets</w:t>
-      </w:r>
-      <w:r>
-        <w:rPr>
-          <w:b/>
-          <w:bCs/>
-          <w:sz w:val="24"/>
-          <w:szCs w:val="24"/>
-        </w:rPr>
-        <w:t>:</w:t>
+        <w:t>Task C</w:t>
       </w:r>
     </w:p>
     <w:p>
@@ -2161,84 +2899,10 @@
         <w:rPr>
           <w:b/>
           <w:bCs/>
-          <w:sz w:val="24"/>
-          <w:szCs w:val="24"/>
-        </w:rPr>
-      </w:pPr>
-    </w:p>
-    <w:p>
-      <w:pPr>
-        <w:pStyle w:val="Nagwek11"/>
-        <w:numPr>
-          <w:ilvl w:val="0"/>
-          <w:numId w:val="0"/>
-        </w:numPr>
-        <w:ind w:left="432" w:hanging="432"/>
-        <w:rPr>
-          <w:b/>
-          <w:bCs/>
-          <w:sz w:val="24"/>
-          <w:szCs w:val="24"/>
-        </w:rPr>
-      </w:pPr>
-    </w:p>
-    <w:p>
-      <w:pPr>
-        <w:pStyle w:val="Nagwek11"/>
-        <w:numPr>
-          <w:ilvl w:val="0"/>
-          <w:numId w:val="0"/>
-        </w:numPr>
-        <w:ind w:left="432" w:hanging="432"/>
-        <w:rPr>
-          <w:b/>
-          <w:bCs/>
-          <w:sz w:val="24"/>
-          <w:szCs w:val="24"/>
-        </w:rPr>
-      </w:pPr>
-    </w:p>
-    <w:p>
-      <w:pPr>
-        <w:pStyle w:val="Nagwek11"/>
-        <w:numPr>
-          <w:ilvl w:val="0"/>
-          <w:numId w:val="0"/>
-        </w:numPr>
-        <w:ind w:left="432" w:hanging="432"/>
-        <w:jc w:val="center"/>
-        <w:rPr>
-          <w:b/>
-          <w:bCs/>
           <w:sz w:val="36"/>
           <w:szCs w:val="36"/>
         </w:rPr>
       </w:pPr>
-      <w:r>
-        <w:rPr>
-          <w:b/>
-          <w:bCs/>
-          <w:sz w:val="36"/>
-          <w:szCs w:val="36"/>
-        </w:rPr>
-        <w:t>Task C</w:t>
-      </w:r>
-    </w:p>
-    <w:p>
-      <w:pPr>
-        <w:pStyle w:val="Nagwek11"/>
-        <w:numPr>
-          <w:ilvl w:val="0"/>
-          <w:numId w:val="0"/>
-        </w:numPr>
-        <w:ind w:left="432" w:hanging="432"/>
-        <w:rPr>
-          <w:b/>
-          <w:bCs/>
-          <w:sz w:val="36"/>
-          <w:szCs w:val="36"/>
-        </w:rPr>
-      </w:pPr>
     </w:p>
     <w:p>
       <w:pPr>
@@ -2599,7 +3263,7 @@
       </w:r>
     </w:p>
     <w:sectPr>
-      <w:footerReference w:type="default" r:id="rId9"/>
+      <w:footerReference w:type="default" r:id="rId11"/>
       <w:pgSz w:w="11906" w:h="16838"/>
       <w:pgMar w:top="1440" w:right="1440" w:bottom="1440" w:left="1440" w:header="708" w:footer="708" w:gutter="0"/>
       <w:cols w:space="708"/>
@@ -2644,7 +3308,6 @@
         <w:docPartUnique/>
       </w:docPartObj>
     </w:sdtPr>
-    <w:sdtEndPr/>
     <w:sdtContent>
       <w:p>
         <w:pPr>
@@ -2707,6 +3370,95 @@
 <file path=word/numbering.xml><?xml version="1.0" encoding="utf-8"?>
 <w:numbering xmlns:wpc="http://schemas.microsoft.com/office/word/2010/wordprocessingCanvas" xmlns:cx="http://schemas.microsoft.com/office/drawing/2014/chartex" xmlns:cx1="http://schemas.microsoft.com/office/drawing/2015/9/8/chartex" xmlns:cx2="http://schemas.microsoft.com/office/drawing/2015/10/21/chartex" xmlns:cx3="http://schemas.microsoft.com/office/drawing/2016/5/9/chartex" xmlns:cx4="http://schemas.microsoft.com/office/drawing/2016/5/10/chartex" xmlns:cx5="http://schemas.microsoft.com/office/drawing/2016/5/11/chartex" xmlns:cx6="http://schemas.microsoft.com/office/drawing/2016/5/12/chartex" xmlns:cx7="http://schemas.microsoft.com/office/drawing/2016/5/13/chartex" xmlns:cx8="http://schemas.microsoft.com/office/drawing/2016/5/14/chartex" xmlns:mc="http://schemas.openxmlformats.org/markup-compatibility/2006" xmlns:aink="http://schemas.microsoft.com/office/drawing/2016/ink" xmlns:am3d="http://schemas.microsoft.com/office/drawing/2017/model3d" xmlns:o="urn:schemas-microsoft-com:office:office" xmlns:oel="http://schemas.microsoft.com/office/2019/extlst" xmlns:r="http://schemas.openxmlformats.org/officeDocument/2006/relationships" xmlns:m="http://schemas.openxmlformats.org/officeDocument/2006/math" xmlns:v="urn:schemas-microsoft-com:vml" xmlns:wp14="http://schemas.microsoft.com/office/word/2010/wordprocessingDrawing" xmlns:wp="http://schemas.openxmlformats.org/drawingml/2006/wordprocessingDrawing" xmlns:w10="urn:schemas-microsoft-com:office:word" xmlns:w="http://schemas.openxmlformats.org/wordprocessingml/2006/main" xmlns:w14="http://schemas.microsoft.com/office/word/2010/wordml" xmlns:w15="http://schemas.microsoft.com/office/word/2012/wordml" xmlns:w16cex="http://schemas.microsoft.com/office/word/2018/wordml/cex" xmlns:w16cid="http://schemas.microsoft.com/office/word/2016/wordml/cid" xmlns:w16="http://schemas.microsoft.com/office/word/2018/wordml" xmlns:w16du="http://schemas.microsoft.com/office/word/2023/wordml/word16du" xmlns:w16sdtdh="http://schemas.microsoft.com/office/word/2020/wordml/sdtdatahash" xmlns:w16sdtfl="http://schemas.microsoft.com/office/word/2024/wordml/sdtformatlock" xmlns:w16se="http://schemas.microsoft.com/office/word/2015/wordml/symex" xmlns:wpg="http://schemas.microsoft.com/office/word/2010/wordprocessingGroup" xmlns:wpi="http://schemas.microsoft.com/office/word/2010/wordprocessingInk" xmlns:wne="http://schemas.microsoft.com/office/word/2006/wordml" xmlns:wps="http://schemas.microsoft.com/office/word/2010/wordprocessingShape" mc:Ignorable="w14 w15 w16se w16cid w16 w16cex w16sdtdh w16sdtfl w16du wp14">
   <w:abstractNum w:abstractNumId="0" w15:restartNumberingAfterBreak="0">
+    <w:nsid w:val="01B34E78"/>
+    <w:multiLevelType w:val="hybridMultilevel"/>
+    <w:tmpl w:val="0FDE1768"/>
+    <w:lvl w:ilvl="0" w:tplc="0809000F">
+      <w:start w:val="1"/>
+      <w:numFmt w:val="decimal"/>
+      <w:lvlText w:val="%1."/>
+      <w:lvlJc w:val="left"/>
+      <w:pPr>
+        <w:ind w:left="720" w:hanging="360"/>
+      </w:pPr>
+      <w:rPr>
+        <w:rFonts w:hint="default"/>
+      </w:rPr>
+    </w:lvl>
+    <w:lvl w:ilvl="1" w:tplc="08090019">
+      <w:start w:val="1"/>
+      <w:numFmt w:val="lowerLetter"/>
+      <w:lvlText w:val="%2."/>
+      <w:lvlJc w:val="left"/>
+      <w:pPr>
+        <w:ind w:left="1440" w:hanging="360"/>
+      </w:pPr>
+    </w:lvl>
+    <w:lvl w:ilvl="2" w:tplc="0809001B" w:tentative="1">
+      <w:start w:val="1"/>
+      <w:numFmt w:val="lowerRoman"/>
+      <w:lvlText w:val="%3."/>
+      <w:lvlJc w:val="right"/>
+      <w:pPr>
+        <w:ind w:left="2160" w:hanging="180"/>
+      </w:pPr>
+    </w:lvl>
+    <w:lvl w:ilvl="3" w:tplc="0809000F" w:tentative="1">
+      <w:start w:val="1"/>
+      <w:numFmt w:val="decimal"/>
+      <w:lvlText w:val="%4."/>
+      <w:lvlJc w:val="left"/>
+      <w:pPr>
+        <w:ind w:left="2880" w:hanging="360"/>
+      </w:pPr>
+    </w:lvl>
+    <w:lvl w:ilvl="4" w:tplc="08090019" w:tentative="1">
+      <w:start w:val="1"/>
+      <w:numFmt w:val="lowerLetter"/>
+      <w:lvlText w:val="%5."/>
+      <w:lvlJc w:val="left"/>
+      <w:pPr>
+        <w:ind w:left="3600" w:hanging="360"/>
+      </w:pPr>
+    </w:lvl>
+    <w:lvl w:ilvl="5" w:tplc="0809001B" w:tentative="1">
+      <w:start w:val="1"/>
+      <w:numFmt w:val="lowerRoman"/>
+      <w:lvlText w:val="%6."/>
+      <w:lvlJc w:val="right"/>
+      <w:pPr>
+        <w:ind w:left="4320" w:hanging="180"/>
+      </w:pPr>
+    </w:lvl>
+    <w:lvl w:ilvl="6" w:tplc="0809000F" w:tentative="1">
+      <w:start w:val="1"/>
+      <w:numFmt w:val="decimal"/>
+      <w:lvlText w:val="%7."/>
+      <w:lvlJc w:val="left"/>
+      <w:pPr>
+        <w:ind w:left="5040" w:hanging="360"/>
+      </w:pPr>
+    </w:lvl>
+    <w:lvl w:ilvl="7" w:tplc="08090019" w:tentative="1">
+      <w:start w:val="1"/>
+      <w:numFmt w:val="lowerLetter"/>
+      <w:lvlText w:val="%8."/>
+      <w:lvlJc w:val="left"/>
+      <w:pPr>
+        <w:ind w:left="5760" w:hanging="360"/>
+      </w:pPr>
+    </w:lvl>
+    <w:lvl w:ilvl="8" w:tplc="0809001B" w:tentative="1">
+      <w:start w:val="1"/>
+      <w:numFmt w:val="lowerRoman"/>
+      <w:lvlText w:val="%9."/>
+      <w:lvlJc w:val="right"/>
+      <w:pPr>
+        <w:ind w:left="6480" w:hanging="180"/>
+      </w:pPr>
+    </w:lvl>
+  </w:abstractNum>
+  <w:abstractNum w:abstractNumId="1" w15:restartNumberingAfterBreak="0">
     <w:nsid w:val="096F0D48"/>
     <w:multiLevelType w:val="multilevel"/>
     <w:tmpl w:val="0809001F"/>
@@ -2792,7 +3544,7 @@
       </w:pPr>
     </w:lvl>
   </w:abstractNum>
-  <w:abstractNum w:abstractNumId="1" w15:restartNumberingAfterBreak="0">
+  <w:abstractNum w:abstractNumId="2" w15:restartNumberingAfterBreak="0">
     <w:nsid w:val="09D44A30"/>
     <w:multiLevelType w:val="hybridMultilevel"/>
     <w:tmpl w:val="FFAAAE04"/>
@@ -2881,7 +3633,7 @@
       </w:pPr>
     </w:lvl>
   </w:abstractNum>
-  <w:abstractNum w:abstractNumId="2" w15:restartNumberingAfterBreak="0">
+  <w:abstractNum w:abstractNumId="3" w15:restartNumberingAfterBreak="0">
     <w:nsid w:val="0F974B52"/>
     <w:multiLevelType w:val="multilevel"/>
     <w:tmpl w:val="0809001F"/>
@@ -2967,7 +3719,7 @@
       </w:pPr>
     </w:lvl>
   </w:abstractNum>
-  <w:abstractNum w:abstractNumId="3" w15:restartNumberingAfterBreak="0">
+  <w:abstractNum w:abstractNumId="4" w15:restartNumberingAfterBreak="0">
     <w:nsid w:val="0FDC2119"/>
     <w:multiLevelType w:val="hybridMultilevel"/>
     <w:tmpl w:val="037CF60A"/>
@@ -3080,7 +3832,7 @@
       </w:rPr>
     </w:lvl>
   </w:abstractNum>
-  <w:abstractNum w:abstractNumId="4" w15:restartNumberingAfterBreak="0">
+  <w:abstractNum w:abstractNumId="5" w15:restartNumberingAfterBreak="0">
     <w:nsid w:val="118A1B0C"/>
     <w:multiLevelType w:val="multilevel"/>
     <w:tmpl w:val="0809001F"/>
@@ -3166,7 +3918,7 @@
       </w:pPr>
     </w:lvl>
   </w:abstractNum>
-  <w:abstractNum w:abstractNumId="5" w15:restartNumberingAfterBreak="0">
+  <w:abstractNum w:abstractNumId="6" w15:restartNumberingAfterBreak="0">
     <w:nsid w:val="26B24010"/>
     <w:multiLevelType w:val="hybridMultilevel"/>
     <w:tmpl w:val="EB465D32"/>
@@ -3279,7 +4031,7 @@
       </w:rPr>
     </w:lvl>
   </w:abstractNum>
-  <w:abstractNum w:abstractNumId="6" w15:restartNumberingAfterBreak="0">
+  <w:abstractNum w:abstractNumId="7" w15:restartNumberingAfterBreak="0">
     <w:nsid w:val="2A251878"/>
     <w:multiLevelType w:val="hybridMultilevel"/>
     <w:tmpl w:val="CB0C4A52"/>
@@ -3392,7 +4144,7 @@
       </w:rPr>
     </w:lvl>
   </w:abstractNum>
-  <w:abstractNum w:abstractNumId="7" w15:restartNumberingAfterBreak="0">
+  <w:abstractNum w:abstractNumId="8" w15:restartNumberingAfterBreak="0">
     <w:nsid w:val="3B6E3719"/>
     <w:multiLevelType w:val="hybridMultilevel"/>
     <w:tmpl w:val="0226CC64"/>
@@ -3481,7 +4233,7 @@
       </w:pPr>
     </w:lvl>
   </w:abstractNum>
-  <w:abstractNum w:abstractNumId="8" w15:restartNumberingAfterBreak="0">
+  <w:abstractNum w:abstractNumId="9" w15:restartNumberingAfterBreak="0">
     <w:nsid w:val="40292AB6"/>
     <w:multiLevelType w:val="multilevel"/>
     <w:tmpl w:val="08090025"/>
@@ -3576,7 +4328,7 @@
       </w:pPr>
     </w:lvl>
   </w:abstractNum>
-  <w:abstractNum w:abstractNumId="9" w15:restartNumberingAfterBreak="0">
+  <w:abstractNum w:abstractNumId="10" w15:restartNumberingAfterBreak="0">
     <w:nsid w:val="57FE639B"/>
     <w:multiLevelType w:val="multilevel"/>
     <w:tmpl w:val="0809001F"/>
@@ -3662,7 +4414,7 @@
       </w:pPr>
     </w:lvl>
   </w:abstractNum>
-  <w:abstractNum w:abstractNumId="10" w15:restartNumberingAfterBreak="0">
+  <w:abstractNum w:abstractNumId="11" w15:restartNumberingAfterBreak="0">
     <w:nsid w:val="5AF40BAC"/>
     <w:multiLevelType w:val="hybridMultilevel"/>
     <w:tmpl w:val="E7C6440A"/>
@@ -3751,7 +4503,7 @@
       </w:pPr>
     </w:lvl>
   </w:abstractNum>
-  <w:abstractNum w:abstractNumId="11" w15:restartNumberingAfterBreak="0">
+  <w:abstractNum w:abstractNumId="12" w15:restartNumberingAfterBreak="0">
     <w:nsid w:val="72C24117"/>
     <w:multiLevelType w:val="multilevel"/>
     <w:tmpl w:val="0809001F"/>
@@ -3838,40 +4590,43 @@
     </w:lvl>
   </w:abstractNum>
   <w:num w:numId="1" w16cid:durableId="292903334">
+    <w:abstractNumId w:val="8"/>
+  </w:num>
+  <w:num w:numId="2" w16cid:durableId="690765110">
+    <w:abstractNumId w:val="2"/>
+  </w:num>
+  <w:num w:numId="3" w16cid:durableId="16464190">
+    <w:abstractNumId w:val="9"/>
+  </w:num>
+  <w:num w:numId="4" w16cid:durableId="2037002178">
+    <w:abstractNumId w:val="10"/>
+  </w:num>
+  <w:num w:numId="5" w16cid:durableId="1788159604">
+    <w:abstractNumId w:val="12"/>
+  </w:num>
+  <w:num w:numId="6" w16cid:durableId="906767019">
+    <w:abstractNumId w:val="3"/>
+  </w:num>
+  <w:num w:numId="7" w16cid:durableId="1328822892">
+    <w:abstractNumId w:val="5"/>
+  </w:num>
+  <w:num w:numId="8" w16cid:durableId="691806039">
+    <w:abstractNumId w:val="1"/>
+  </w:num>
+  <w:num w:numId="9" w16cid:durableId="1394889710">
+    <w:abstractNumId w:val="4"/>
+  </w:num>
+  <w:num w:numId="10" w16cid:durableId="1335842131">
     <w:abstractNumId w:val="7"/>
   </w:num>
-  <w:num w:numId="2" w16cid:durableId="690765110">
-    <w:abstractNumId w:val="1"/>
+  <w:num w:numId="11" w16cid:durableId="633295844">
+    <w:abstractNumId w:val="6"/>
   </w:num>
-  <w:num w:numId="3" w16cid:durableId="16464190">
-    <w:abstractNumId w:val="8"/>
-  </w:num>
-  <w:num w:numId="4" w16cid:durableId="2037002178">
-    <w:abstractNumId w:val="9"/>
-  </w:num>
-  <w:num w:numId="5" w16cid:durableId="1788159604">
+  <w:num w:numId="12" w16cid:durableId="756898670">
     <w:abstractNumId w:val="11"/>
   </w:num>
-  <w:num w:numId="6" w16cid:durableId="906767019">
-    <w:abstractNumId w:val="2"/>
-  </w:num>
-  <w:num w:numId="7" w16cid:durableId="1328822892">
-    <w:abstractNumId w:val="4"/>
-  </w:num>
-  <w:num w:numId="8" w16cid:durableId="691806039">
+  <w:num w:numId="13" w16cid:durableId="1668433507">
     <w:abstractNumId w:val="0"/>
-  </w:num>
-  <w:num w:numId="9" w16cid:durableId="1394889710">
-    <w:abstractNumId w:val="3"/>
-  </w:num>
-  <w:num w:numId="10" w16cid:durableId="1335842131">
-    <w:abstractNumId w:val="6"/>
-  </w:num>
-  <w:num w:numId="11" w16cid:durableId="633295844">
-    <w:abstractNumId w:val="5"/>
-  </w:num>
-  <w:num w:numId="12" w16cid:durableId="756898670">
-    <w:abstractNumId w:val="10"/>
   </w:num>
 </w:numbering>
 </file>

</xml_diff>